<commit_message>
update rad za zbornik
</commit_message>
<xml_diff>
--- a/rad/zbornik/Алгоритми_за_визуелну_одометрију_са_применом_у_мобилној_роботици_Зборник_ФТН.docx
+++ b/rad/zbornik/Алгоритми_за_визуелну_одометрију_са_применом_у_мобилној_роботици_Зборник_ФТН.docx
@@ -1,6 +1,6 @@
 
 <file path=word/document.xml><?xml version="1.0" encoding="utf-8"?>
-<w:document xmlns:wpc="http://schemas.microsoft.com/office/word/2010/wordprocessingCanvas" xmlns:cx="http://schemas.microsoft.com/office/drawing/2014/chartex" xmlns:cx1="http://schemas.microsoft.com/office/drawing/2015/9/8/chartex" xmlns:cx2="http://schemas.microsoft.com/office/drawing/2015/10/21/chartex" xmlns:cx3="http://schemas.microsoft.com/office/drawing/2016/5/9/chartex" xmlns:cx4="http://schemas.microsoft.com/office/drawing/2016/5/10/chartex" xmlns:cx5="http://schemas.microsoft.com/office/drawing/2016/5/11/chartex" xmlns:cx6="http://schemas.microsoft.com/office/drawing/2016/5/12/chartex" xmlns:cx7="http://schemas.microsoft.com/office/drawing/2016/5/13/chartex" xmlns:cx8="http://schemas.microsoft.com/office/drawing/2016/5/14/chartex" xmlns:mc="http://schemas.openxmlformats.org/markup-compatibility/2006" xmlns:aink="http://schemas.microsoft.com/office/drawing/2016/ink" xmlns:am3d="http://schemas.microsoft.com/office/drawing/2017/model3d" xmlns:o="urn:schemas-microsoft-com:office:office" xmlns:oel="http://schemas.microsoft.com/office/2019/extlst" xmlns:r="http://schemas.openxmlformats.org/officeDocument/2006/relationships" xmlns:m="http://schemas.openxmlformats.org/officeDocument/2006/math" xmlns:v="urn:schemas-microsoft-com:vml" xmlns:wp14="http://schemas.microsoft.com/office/word/2010/wordprocessingDrawing" xmlns:wp="http://schemas.openxmlformats.org/drawingml/2006/wordprocessingDrawing" xmlns:w10="urn:schemas-microsoft-com:office:word" xmlns:w="http://schemas.openxmlformats.org/wordprocessingml/2006/main" xmlns:w14="http://schemas.microsoft.com/office/word/2010/wordml" xmlns:w15="http://schemas.microsoft.com/office/word/2012/wordml" xmlns:w16cex="http://schemas.microsoft.com/office/word/2018/wordml/cex" xmlns:w16cid="http://schemas.microsoft.com/office/word/2016/wordml/cid" xmlns:w16="http://schemas.microsoft.com/office/word/2018/wordml" xmlns:w16du="http://schemas.microsoft.com/office/word/2023/wordml/word16du" xmlns:w16sdtdh="http://schemas.microsoft.com/office/word/2020/wordml/sdtdatahash" xmlns:w16se="http://schemas.microsoft.com/office/word/2015/wordml/symex" xmlns:wpg="http://schemas.microsoft.com/office/word/2010/wordprocessingGroup" xmlns:wpi="http://schemas.microsoft.com/office/word/2010/wordprocessingInk" xmlns:wne="http://schemas.microsoft.com/office/word/2006/wordml" xmlns:wps="http://schemas.microsoft.com/office/word/2010/wordprocessingShape" mc:Ignorable="w14 w15 w16se w16cid w16 w16cex w16sdtdh w16du wp14">
+<w:document xmlns:wpc="http://schemas.microsoft.com/office/word/2010/wordprocessingCanvas" xmlns:cx="http://schemas.microsoft.com/office/drawing/2014/chartex" xmlns:cx1="http://schemas.microsoft.com/office/drawing/2015/9/8/chartex" xmlns:cx2="http://schemas.microsoft.com/office/drawing/2015/10/21/chartex" xmlns:cx3="http://schemas.microsoft.com/office/drawing/2016/5/9/chartex" xmlns:cx4="http://schemas.microsoft.com/office/drawing/2016/5/10/chartex" xmlns:cx5="http://schemas.microsoft.com/office/drawing/2016/5/11/chartex" xmlns:cx6="http://schemas.microsoft.com/office/drawing/2016/5/12/chartex" xmlns:cx7="http://schemas.microsoft.com/office/drawing/2016/5/13/chartex" xmlns:cx8="http://schemas.microsoft.com/office/drawing/2016/5/14/chartex" xmlns:mc="http://schemas.openxmlformats.org/markup-compatibility/2006" xmlns:aink="http://schemas.microsoft.com/office/drawing/2016/ink" xmlns:am3d="http://schemas.microsoft.com/office/drawing/2017/model3d" xmlns:o="urn:schemas-microsoft-com:office:office" xmlns:oel="http://schemas.microsoft.com/office/2019/extlst" xmlns:r="http://schemas.openxmlformats.org/officeDocument/2006/relationships" xmlns:m="http://schemas.openxmlformats.org/officeDocument/2006/math" xmlns:v="urn:schemas-microsoft-com:vml" xmlns:wp14="http://schemas.microsoft.com/office/word/2010/wordprocessingDrawing" xmlns:wp="http://schemas.openxmlformats.org/drawingml/2006/wordprocessingDrawing" xmlns:w10="urn:schemas-microsoft-com:office:word" xmlns:w="http://schemas.openxmlformats.org/wordprocessingml/2006/main" xmlns:w14="http://schemas.microsoft.com/office/word/2010/wordml" xmlns:w15="http://schemas.microsoft.com/office/word/2012/wordml" xmlns:w16cex="http://schemas.microsoft.com/office/word/2018/wordml/cex" xmlns:w16cid="http://schemas.microsoft.com/office/word/2016/wordml/cid" xmlns:w16="http://schemas.microsoft.com/office/word/2018/wordml" xmlns:w16du="http://schemas.microsoft.com/office/word/2023/wordml/word16du" xmlns:w16sdtdh="http://schemas.microsoft.com/office/word/2020/wordml/sdtdatahash" xmlns:w16sdtfl="http://schemas.microsoft.com/office/word/2024/wordml/sdtformatlock" xmlns:w16se="http://schemas.microsoft.com/office/word/2015/wordml/symex" xmlns:wpg="http://schemas.microsoft.com/office/word/2010/wordprocessingGroup" xmlns:wpi="http://schemas.microsoft.com/office/word/2010/wordprocessingInk" xmlns:wne="http://schemas.microsoft.com/office/word/2006/wordml" xmlns:wps="http://schemas.microsoft.com/office/word/2010/wordprocessingShape" mc:Ignorable="w14 w15 w16se w16cid w16 w16cex w16sdtdh w16sdtfl w16du wp14">
   <w:body>
     <w:tbl>
       <w:tblPr>
@@ -915,10 +915,10 @@
         <w:t xml:space="preserve"> </w:t>
       </w:r>
       <w:r>
-        <w:t>ФОРМАТИРАЊЕ</w:t>
-      </w:r>
-      <w:r>
-        <w:t xml:space="preserve"> И ПИСАЊЕ ТЕКСТА</w:t>
+        <w:rPr>
+          <w:lang w:val="sr-Cyrl-RS"/>
+        </w:rPr>
+        <w:t>Визуелна одометрија</w:t>
       </w:r>
     </w:p>
     <w:p>
@@ -927,7 +927,7 @@
         <w:rPr>
           <w:rStyle w:val="0-Char"/>
           <w:rFonts w:eastAsiaTheme="minorEastAsia"/>
-          <w:lang w:val="sr-Cyrl-RS"/>
+          <w:lang w:val="en-US"/>
         </w:rPr>
       </w:pPr>
       <w:r>
@@ -936,37 +936,29 @@
           <w:rFonts w:eastAsiaTheme="minorEastAsia"/>
           <w:lang w:val="sr-Cyrl-RS"/>
         </w:rPr>
-        <w:t>За форматирање овог рада можете користити предефинисане стилова предложка. Коришћење стилова не гарантује потпуно усклађен рад са предложком Зборника, те је потребно детаљно прочитати ово упутство и упоредити рад са овим предложком.</w:t>
-      </w:r>
-    </w:p>
-    <w:p>
-      <w:pPr>
-        <w:pStyle w:val="0-"/>
-        <w:rPr>
-          <w:rFonts w:ascii="Times New Roman" w:hAnsi="Times New Roman" w:cs="Times New Roman"/>
-          <w:iCs/>
-          <w:szCs w:val="20"/>
-          <w:lang w:val="sr-Cyrl-RS"/>
-        </w:rPr>
-      </w:pPr>
+        <w:t>Визуелна одометрија инкрементално естимира позу камере која се креће тако што прати промене у сликама које тај покрет индукује. Окружење у којем се налази камера значајно утиче на успешност ВО. Да би ВО могла да одреди кретање, потребно је да окружење буде довољно осветљено и да сцена буде статична и са довољно текстуре. Битно је да постоји довољно преклапање сцене изме</w:t>
+      </w:r>
       <w:r>
         <w:rPr>
           <w:rStyle w:val="0-Char"/>
           <w:rFonts w:eastAsiaTheme="minorEastAsia"/>
-        </w:rPr>
-        <w:t xml:space="preserve">На страницама рада, све четири  маргине треба да буду по 2 цм. </w:t>
+          <w:lang w:val="sr-Cyrl-RS"/>
+        </w:rPr>
+        <w:t>ђ</w:t>
       </w:r>
       <w:r>
         <w:rPr>
           <w:rStyle w:val="0-Char"/>
           <w:rFonts w:eastAsiaTheme="minorEastAsia"/>
-        </w:rPr>
-        <w:t>Не врши се означавање</w:t>
+          <w:lang w:val="sr-Cyrl-RS"/>
+        </w:rPr>
+        <w:t>у узастопних слика</w:t>
       </w:r>
       <w:r>
         <w:rPr>
           <w:rStyle w:val="0-Char"/>
           <w:rFonts w:eastAsiaTheme="minorEastAsia"/>
+          <w:lang w:val="sr-Cyrl-RS"/>
         </w:rPr>
         <w:t xml:space="preserve"> </w:t>
       </w:r>
@@ -974,576 +966,57 @@
         <w:rPr>
           <w:rStyle w:val="0-Char"/>
           <w:rFonts w:eastAsiaTheme="minorEastAsia"/>
-        </w:rPr>
-        <w:t>(</w:t>
+          <w:lang w:val="en-US"/>
+        </w:rPr>
+        <w:t>[1]</w:t>
       </w:r>
       <w:r>
         <w:rPr>
           <w:rStyle w:val="0-Char"/>
           <w:rFonts w:eastAsiaTheme="minorEastAsia"/>
-        </w:rPr>
-        <w:t>нумерација</w:t>
+          <w:lang w:val="sr-Cyrl-RS"/>
+        </w:rPr>
+        <w:t xml:space="preserve">. Процена дубине представља основу алгоритама ВО. У случају стерео ВО, дубина сцене се рачуна на основу пиксела који се подударају у сликама леве и десне камере. На основу разлике њиховог положаја у обе слике, познатог растојања између камера (базна дистанца) и унутрашњих параметара камера, </w:t>
       </w:r>
       <w:r>
         <w:rPr>
           <w:rStyle w:val="0-Char"/>
           <w:rFonts w:eastAsiaTheme="minorEastAsia"/>
-        </w:rPr>
-        <w:t>)</w:t>
+          <w:lang w:val="sr-Cyrl-RS"/>
+        </w:rPr>
+        <w:t>положај</w:t>
       </w:r>
       <w:r>
         <w:rPr>
           <w:rStyle w:val="0-Char"/>
           <w:rFonts w:eastAsiaTheme="minorEastAsia"/>
-        </w:rPr>
-        <w:t xml:space="preserve"> страна</w:t>
-      </w:r>
-      <w:r>
-        <w:rPr>
-          <w:rFonts w:ascii="Times New Roman" w:hAnsi="Times New Roman" w:cs="Times New Roman"/>
-          <w:iCs/>
-          <w:szCs w:val="20"/>
-        </w:rPr>
-        <w:t>.</w:t>
-      </w:r>
-      <w:r>
-        <w:rPr>
-          <w:rFonts w:ascii="Times New Roman" w:hAnsi="Times New Roman" w:cs="Times New Roman"/>
-          <w:iCs/>
-          <w:szCs w:val="20"/>
           <w:lang w:val="sr-Cyrl-RS"/>
         </w:rPr>
         <w:t xml:space="preserve"> </w:t>
       </w:r>
-    </w:p>
-    <w:p>
-      <w:pPr>
-        <w:pStyle w:val="2-"/>
-      </w:pPr>
-      <w:r>
-        <w:t>Форматирање</w:t>
-      </w:r>
-      <w:r>
-        <w:t xml:space="preserve"> текста</w:t>
-      </w:r>
-    </w:p>
-    <w:p>
-      <w:pPr>
-        <w:pStyle w:val="0-"/>
-        <w:spacing w:before="120"/>
-        <w:rPr>
-          <w:iCs/>
-          <w:lang w:val="sr-Cyrl-RS"/>
-        </w:rPr>
-      </w:pPr>
-      <w:r>
-        <w:t xml:space="preserve">Рад треба да буде написан у </w:t>
-      </w:r>
-      <w:r>
-        <w:t>дв</w:t>
-      </w:r>
-      <w:r>
-        <w:rPr>
-          <w:lang w:val="sr-Cyrl-RS"/>
-        </w:rPr>
-        <w:t>а ступца</w:t>
-      </w:r>
-      <w:r>
-        <w:t xml:space="preserve"> </w:t>
-      </w:r>
-      <w:r>
-        <w:rPr>
-          <w:lang w:val="sr-Cyrl-RS"/>
-        </w:rPr>
-        <w:t>(</w:t>
-      </w:r>
-      <w:r>
-        <w:t>колоне</w:t>
-      </w:r>
-      <w:r>
-        <w:rPr>
-          <w:lang w:val="sr-Cyrl-RS"/>
-        </w:rPr>
-        <w:t>)</w:t>
-      </w:r>
-      <w:r>
-        <w:t xml:space="preserve"> једнаке ширине,</w:t>
-      </w:r>
-      <w:r>
-        <w:rPr>
-          <w:lang w:val="sr-Cyrl-RS"/>
-        </w:rPr>
-        <w:t xml:space="preserve"> поравнате с горње стране,</w:t>
-      </w:r>
-      <w:r>
-        <w:t xml:space="preserve"> са размаком од 0,5</w:t>
-      </w:r>
-      <w:r>
-        <w:t> </w:t>
-      </w:r>
-      <w:r>
-        <w:t xml:space="preserve">цм и </w:t>
-      </w:r>
-      <w:r>
-        <w:t xml:space="preserve">бар приближно </w:t>
-      </w:r>
-      <w:r>
-        <w:t xml:space="preserve">једнаке дужине </w:t>
-      </w:r>
-      <w:r>
-        <w:rPr>
-          <w:lang w:val="sr-Cyrl-RS"/>
-        </w:rPr>
-        <w:t>са</w:t>
-      </w:r>
-      <w:r>
-        <w:t xml:space="preserve"> </w:t>
-      </w:r>
-      <w:r>
-        <w:rPr>
-          <w:lang w:val="sr-Cyrl-RS"/>
-        </w:rPr>
-        <w:t>доње стране</w:t>
-      </w:r>
-      <w:r>
-        <w:t xml:space="preserve">. </w:t>
-      </w:r>
-      <w:r>
-        <w:rPr>
-          <w:lang w:val="sr-Cyrl-RS"/>
-        </w:rPr>
-        <w:t>Р</w:t>
-      </w:r>
-      <w:r>
-        <w:t>азмак</w:t>
-      </w:r>
-      <w:r>
-        <w:rPr>
-          <w:lang w:val="sr-Cyrl-RS"/>
-        </w:rPr>
-        <w:t xml:space="preserve"> </w:t>
-      </w:r>
-      <w:r>
-        <w:t>за наслове</w:t>
-      </w:r>
-      <w:r>
-        <w:rPr>
-          <w:lang w:val="sr-Cyrl-RS"/>
-        </w:rPr>
-        <w:t xml:space="preserve"> треба да буде</w:t>
-      </w:r>
-      <w:r>
-        <w:t xml:space="preserve"> 12 </w:t>
-      </w:r>
-      <w:r>
-        <w:rPr>
-          <w:i/>
-        </w:rPr>
-        <w:t>pt</w:t>
-      </w:r>
-      <w:r>
-        <w:rPr>
-          <w:i/>
-        </w:rPr>
-        <w:t xml:space="preserve"> before</w:t>
-      </w:r>
-      <w:r>
-        <w:rPr>
-          <w:iCs/>
-          <w:lang w:val="sr-Cyrl-RS"/>
-        </w:rPr>
-        <w:t xml:space="preserve"> и</w:t>
-      </w:r>
-      <w:r>
-        <w:rPr>
-          <w:i/>
-        </w:rPr>
-        <w:t xml:space="preserve"> after</w:t>
-      </w:r>
-      <w:r>
-        <w:rPr>
-          <w:lang w:val="sr-Cyrl-RS"/>
-        </w:rPr>
-        <w:t>, а за поднаслове</w:t>
-      </w:r>
-      <w:r>
-        <w:rPr>
-          <w:lang w:val="sr-Cyrl-RS"/>
-        </w:rPr>
-        <w:t xml:space="preserve"> </w:t>
-      </w:r>
-      <w:r>
-        <w:t>6 </w:t>
-      </w:r>
-      <w:r>
-        <w:rPr>
-          <w:i/>
-        </w:rPr>
-        <w:t>pt</w:t>
-      </w:r>
-      <w:r>
-        <w:rPr>
-          <w:i/>
-        </w:rPr>
-        <w:t xml:space="preserve"> before </w:t>
-      </w:r>
-      <w:r>
-        <w:rPr>
-          <w:iCs/>
-          <w:lang w:val="sr-Cyrl-RS"/>
-        </w:rPr>
-        <w:t>и</w:t>
-      </w:r>
-      <w:r>
-        <w:rPr>
-          <w:i/>
-        </w:rPr>
-        <w:t xml:space="preserve"> after</w:t>
-      </w:r>
-      <w:r>
-        <w:rPr>
-          <w:iCs/>
-        </w:rPr>
-        <w:t xml:space="preserve">. </w:t>
-      </w:r>
-    </w:p>
-    <w:p>
-      <w:pPr>
-        <w:pStyle w:val="2-"/>
-      </w:pPr>
-      <w:r>
-        <w:t>Писање</w:t>
-      </w:r>
-      <w:r>
-        <w:t xml:space="preserve"> текста</w:t>
-      </w:r>
-    </w:p>
-    <w:p>
-      <w:pPr>
-        <w:pStyle w:val="0-"/>
-      </w:pPr>
-      <w:r>
-        <w:lastRenderedPageBreak/>
-        <w:t xml:space="preserve">На почетку (само) прве стране налази се Заглавље Зборника. После заглавља треба оставити два празна реда за накнадно уписивање УДК броја и ДОИ идентификатора. Ове податке уноси </w:t>
-      </w:r>
-      <w:r>
-        <w:rPr>
-          <w:lang w:val="sr-Cyrl-RS"/>
-        </w:rPr>
-        <w:t>Уређивачки одбор</w:t>
-      </w:r>
-      <w:r>
-        <w:t xml:space="preserve"> </w:t>
-      </w:r>
-      <w:r>
-        <w:t>Зборника у коначну верзију рада.</w:t>
-      </w:r>
-    </w:p>
-    <w:p>
-      <w:pPr>
-        <w:pStyle w:val="0-"/>
-      </w:pPr>
-      <w:r>
-        <w:t>На средини прве странице рукописа написати</w:t>
-      </w:r>
-      <w:r>
-        <w:rPr>
-          <w:lang w:val="sr-Cyrl-RS"/>
-        </w:rPr>
-        <w:t xml:space="preserve"> пуномасним словима</w:t>
-      </w:r>
-      <w:r>
-        <w:t xml:space="preserve"> (</w:t>
-      </w:r>
-      <w:r>
-        <w:rPr>
-          <w:i/>
-        </w:rPr>
-        <w:t>bold</w:t>
-      </w:r>
-      <w:r>
-        <w:t xml:space="preserve">) </w:t>
-      </w:r>
-      <w:r>
-        <w:t>величине 12</w:t>
-      </w:r>
-      <w:r>
-        <w:rPr>
-          <w:lang w:val="sr-Cyrl-RS"/>
-        </w:rPr>
-        <w:t xml:space="preserve"> </w:t>
-      </w:r>
-      <w:r>
-        <w:t xml:space="preserve">наслов рада на српском језику (до два реда), </w:t>
-      </w:r>
-      <w:r>
-        <w:t>а затим и</w:t>
-      </w:r>
-      <w:r>
-        <w:t xml:space="preserve"> наслов </w:t>
-      </w:r>
-      <w:r>
-        <w:t xml:space="preserve">рада </w:t>
-      </w:r>
-      <w:r>
-        <w:t>на енглеском језику</w:t>
-      </w:r>
-      <w:r>
-        <w:t>. Испод наслова треба унети</w:t>
-      </w:r>
-      <w:r>
-        <w:t xml:space="preserve"> имена аутора и </w:t>
-      </w:r>
-      <w:r>
-        <w:t xml:space="preserve">евентуалних коаутора, као и </w:t>
-      </w:r>
-      <w:r>
-        <w:t>назив</w:t>
-      </w:r>
-      <w:r>
-        <w:t>(е)</w:t>
-      </w:r>
-      <w:r>
-        <w:t xml:space="preserve"> њихових институција. </w:t>
-      </w:r>
-    </w:p>
-    <w:p>
-      <w:pPr>
-        <w:pStyle w:val="0-"/>
-        <w:rPr>
-          <w:lang w:val="sr-Latn-RS"/>
-        </w:rPr>
-      </w:pPr>
-      <w:r>
-        <w:t xml:space="preserve">Ментор сам одлучује да ли ће он бити и коаутор </w:t>
-      </w:r>
-      <w:r>
-        <w:rPr>
-          <w:lang w:val="sr-Cyrl-RS"/>
-        </w:rPr>
-        <w:t>рада</w:t>
-      </w:r>
-      <w:r>
-        <w:t>. Ако ментор није коаутор, његово име се не спомиње на овом месту и његова биографија се не наводи на крају рада.</w:t>
-      </w:r>
-      <w:r>
-        <w:rPr>
-          <w:lang w:val="sr-Cyrl-RS"/>
-        </w:rPr>
-        <w:t xml:space="preserve"> Без обзира је ли ментор и коаутор рада, напомена о менторству је обавезна.</w:t>
-      </w:r>
-    </w:p>
-    <w:p>
-      <w:pPr>
-        <w:pStyle w:val="0-"/>
-        <w:rPr>
-          <w:lang w:val="sr-Latn-RS"/>
-        </w:rPr>
-      </w:pPr>
-    </w:p>
-    <w:p>
-      <w:pPr>
-        <w:pStyle w:val="2-"/>
-      </w:pPr>
-      <w:r>
-        <w:t>Пис</w:t>
-      </w:r>
-      <w:r>
-        <w:t>ање израза, табела и подешавање слика</w:t>
-      </w:r>
-    </w:p>
-    <w:p>
-      <w:pPr>
-        <w:pStyle w:val="0-"/>
-      </w:pPr>
-      <w:r>
-        <w:t>Математичке и друге о</w:t>
-      </w:r>
-      <w:r>
-        <w:t xml:space="preserve">ператоре и величине које не узимају бројне вредности писати обичним словима, а величине које могу узимати бројне вредности – </w:t>
-      </w:r>
-      <w:r>
-        <w:rPr>
-          <w:lang w:val="sr-Cyrl-RS"/>
-        </w:rPr>
-        <w:t>косим словима</w:t>
-      </w:r>
-      <w:r>
-        <w:t xml:space="preserve"> </w:t>
-      </w:r>
-      <w:r>
-        <w:t>(</w:t>
-      </w:r>
-      <w:r>
-        <w:rPr>
-          <w:i/>
-        </w:rPr>
-        <w:t>italic</w:t>
-      </w:r>
-      <w:r>
-        <w:t xml:space="preserve">). </w:t>
-      </w:r>
-    </w:p>
-    <w:p>
-      <w:pPr>
-        <w:pStyle w:val="0-"/>
-      </w:pPr>
-      <w:r>
-        <w:t xml:space="preserve">Дозвољена је употреба различитих едитора једначина, али се препоручују новији едитори, због квалитета коначне, </w:t>
-      </w:r>
-      <w:r>
-        <w:rPr>
-          <w:lang w:val="sr-Latn-RS"/>
-        </w:rPr>
-        <w:t>штампане</w:t>
-      </w:r>
-      <w:r>
-        <w:t xml:space="preserve"> верзије текста. </w:t>
-      </w:r>
-      <w:r>
-        <w:t xml:space="preserve">На пример, </w:t>
-      </w:r>
-      <w:r>
-        <w:t>sin</w:t>
-      </w:r>
-      <w:r>
-        <w:rPr>
-          <w:i/>
-        </w:rPr>
-        <w:t>x</w:t>
-      </w:r>
-      <w:r>
-        <w:t xml:space="preserve">, </w:t>
-      </w:r>
-      <w:r>
-        <w:t>ln</w:t>
-      </w:r>
-      <w:r>
-        <w:rPr>
-          <w:i/>
-        </w:rPr>
-        <w:t>x</w:t>
-      </w:r>
-      <w:r>
-        <w:t>(</w:t>
-      </w:r>
-      <w:r>
-        <w:rPr>
-          <w:i/>
-        </w:rPr>
-        <w:t>т</w:t>
-      </w:r>
-      <w:r>
-        <w:t xml:space="preserve">), </w:t>
-      </w:r>
-      <w:r>
-        <w:t>df</w:t>
-      </w:r>
-      <w:r>
-        <w:t>(</w:t>
-      </w:r>
-      <w:r>
-        <w:rPr>
-          <w:i/>
-        </w:rPr>
-        <w:t>т</w:t>
-      </w:r>
-      <w:r>
-        <w:t>)/</w:t>
-      </w:r>
-      <w:r>
-        <w:t>d</w:t>
-      </w:r>
-      <w:r>
-        <w:rPr>
-          <w:i/>
-        </w:rPr>
-        <w:t>т</w:t>
-      </w:r>
-      <w:r>
-        <w:t xml:space="preserve">, </w:t>
-      </w:r>
-      <w:r>
-        <w:t>RC</w:t>
-      </w:r>
-      <w:r>
-        <w:t xml:space="preserve"> коло отпорности </w:t>
-      </w:r>
-      <w:r>
-        <w:rPr>
-          <w:i/>
-        </w:rPr>
-        <w:t>Р</w:t>
-      </w:r>
-      <w:r>
-        <w:t xml:space="preserve">=250 </w:t>
-      </w:r>
-      <w:r>
-        <w:t>k</w:t>
-      </w:r>
-      <w:r>
-        <w:t xml:space="preserve">Ω. </w:t>
-      </w:r>
-    </w:p>
-    <w:p>
-      <w:pPr>
-        <w:pStyle w:val="0-"/>
-      </w:pPr>
-      <w:r>
-        <w:rPr>
-          <w:lang w:val="sr-Cyrl-RS"/>
-        </w:rPr>
-        <w:t>Математичке формуле</w:t>
-      </w:r>
-      <w:r>
-        <w:t xml:space="preserve"> </w:t>
-      </w:r>
-      <w:r>
-        <w:t xml:space="preserve">треба да </w:t>
-      </w:r>
-      <w:r>
-        <w:t xml:space="preserve">се </w:t>
-      </w:r>
-      <w:r>
-        <w:rPr>
-          <w:lang w:val="sr-Cyrl-RS"/>
-        </w:rPr>
-        <w:t>означе (</w:t>
-      </w:r>
-      <w:r>
-        <w:t>нумеришу</w:t>
-      </w:r>
-      <w:r>
-        <w:rPr>
-          <w:lang w:val="sr-Cyrl-RS"/>
-        </w:rPr>
-        <w:t>)</w:t>
-      </w:r>
-      <w:r>
-        <w:t xml:space="preserve"> </w:t>
-      </w:r>
-      <w:commentRangeStart w:id="0"/>
-      <w:r>
-        <w:t>уз десну ивицу</w:t>
-      </w:r>
-      <w:r>
-        <w:t xml:space="preserve"> текста</w:t>
-      </w:r>
-      <w:commentRangeEnd w:id="0"/>
-      <w:r>
-        <w:rPr>
-          <w:rStyle w:val="CommentReference"/>
-        </w:rPr>
-        <w:commentReference w:id="0"/>
-      </w:r>
-      <w:r>
-        <w:t xml:space="preserve">, </w:t>
-      </w:r>
-      <w:r>
-        <w:t xml:space="preserve"> као </w:t>
-      </w:r>
-      <w:r>
-        <w:t>у примеру израза (1):</w:t>
+      <w:r>
+        <w:rPr>
+          <w:rStyle w:val="0-Char"/>
+          <w:rFonts w:eastAsiaTheme="minorEastAsia"/>
+          <w:lang w:val="sr-Cyrl-RS"/>
+        </w:rPr>
+        <w:t xml:space="preserve">тачке </w:t>
+      </w:r>
+      <w:r>
+        <w:rPr>
+          <w:rStyle w:val="0-Char"/>
+          <w:rFonts w:eastAsiaTheme="minorEastAsia"/>
+          <w:lang w:val="sr-Cyrl-RS"/>
+        </w:rPr>
+        <w:t>може лако да се израчуна као</w:t>
+      </w:r>
+      <w:r>
+        <w:rPr>
+          <w:rStyle w:val="0-Char"/>
+          <w:rFonts w:eastAsiaTheme="minorEastAsia"/>
+          <w:lang w:val="en-US"/>
+        </w:rPr>
+        <w:t>:</w:t>
       </w:r>
     </w:p>
     <w:tbl>
@@ -1567,7 +1040,7 @@
       <w:tr>
         <w:tc>
           <w:tcPr>
-            <w:tcW w:w="4219" w:type="dxa"/>
+            <w:tcW w:w="3867" w:type="dxa"/>
             <w:vAlign w:val="center"/>
           </w:tcPr>
           <w:p>
@@ -1579,88 +1052,293 @@
             </w:pPr>
             <m:oMathPara>
               <m:oMathParaPr>
-                <m:jc m:val="right"/>
+                <m:jc m:val="center"/>
               </m:oMathParaPr>
               <m:oMath>
-                <m:sSub>
-                  <m:sSubPr>
-                    <m:ctrlPr/>
-                  </m:sSubPr>
+                <m:d>
+                  <m:dPr>
+                    <m:begChr m:val="["/>
+                    <m:endChr m:val="]"/>
+                    <m:ctrlPr>
+                      <w:rPr>
+                        <w:rStyle w:val="0-Char"/>
+                        <w:rFonts w:eastAsiaTheme="minorEastAsia"/>
+                        <w:i w:val="0"/>
+                        <w:lang w:val="sr-Cyrl-RS"/>
+                      </w:rPr>
+                    </m:ctrlPr>
+                  </m:dPr>
                   <m:e>
                     <m:r>
-                      <m:t>Q</m:t>
+                      <m:rPr>
+                        <m:sty m:val="p"/>
+                      </m:rPr>
+                      <w:rPr>
+                        <w:rStyle w:val="0-Char"/>
+                        <w:rFonts w:eastAsiaTheme="minorEastAsia"/>
+                        <w:lang w:val="sr-Cyrl-RS"/>
+                      </w:rPr>
+                      <m:t>x</m:t>
                     </m:r>
-                  </m:e>
-                  <m:sub>
                     <m:r>
-                      <m:t>i</m:t>
+                      <m:rPr>
+                        <m:sty m:val="p"/>
+                      </m:rPr>
+                      <w:rPr>
+                        <w:rStyle w:val="0-Char"/>
+                        <w:rFonts w:eastAsiaTheme="minorEastAsia"/>
+                        <w:lang w:val="en-US"/>
+                      </w:rPr>
+                      <m:t>, y,z</m:t>
                     </m:r>
-                  </m:sub>
-                </m:sSub>
-                <m:r>
-                  <m:t>=</m:t>
-                </m:r>
-                <m:sSub>
-                  <m:sSubPr>
-                    <m:ctrlPr/>
-                  </m:sSubPr>
-                  <m:e>
-                    <m:r>
-                      <m:t>log</m:t>
-                    </m:r>
-                  </m:e>
-                  <m:sub>
-                    <m:r>
-                      <m:t>2</m:t>
-                    </m:r>
-                  </m:sub>
-                </m:sSub>
-                <m:d>
-                  <m:dPr>
-                    <m:ctrlPr/>
-                  </m:dPr>
-                  <m:e>
-                    <m:box>
-                      <m:boxPr>
-                        <m:ctrlPr/>
-                      </m:boxPr>
-                      <m:e>
-                        <m:argPr>
-                          <m:argSz m:val="-1"/>
-                        </m:argPr>
-                        <m:f>
-                          <m:fPr>
-                            <m:ctrlPr/>
-                          </m:fPr>
-                          <m:num>
-                            <m:r>
-                              <m:t>1</m:t>
-                            </m:r>
-                          </m:num>
-                          <m:den>
-                            <m:sSub>
-                              <m:sSubPr>
-                                <m:ctrlPr/>
-                              </m:sSubPr>
-                              <m:e>
-                                <m:r>
-                                  <m:t>p</m:t>
-                                </m:r>
-                              </m:e>
-                              <m:sub>
-                                <m:r>
-                                  <m:t>i</m:t>
-                                </m:r>
-                              </m:sub>
-                            </m:sSub>
-                          </m:den>
-                        </m:f>
-                      </m:e>
-                    </m:box>
+                    <m:ctrlPr>
+                      <w:rPr>
+                        <w:rStyle w:val="0-Char"/>
+                        <w:rFonts w:eastAsiaTheme="minorEastAsia"/>
+                        <w:i w:val="0"/>
+                        <w:lang w:val="en-US"/>
+                      </w:rPr>
+                    </m:ctrlPr>
                   </m:e>
                 </m:d>
                 <m:r>
-                  <m:t>,   i=1…M</m:t>
+                  <m:rPr>
+                    <m:sty m:val="p"/>
+                  </m:rPr>
+                  <w:rPr>
+                    <w:rStyle w:val="0-Char"/>
+                    <w:rFonts w:eastAsiaTheme="minorEastAsia"/>
+                    <w:lang w:val="en-US"/>
+                  </w:rPr>
+                  <m:t>=[</m:t>
+                </m:r>
+                <m:f>
+                  <m:fPr>
+                    <m:ctrlPr>
+                      <w:rPr>
+                        <w:rStyle w:val="0-Char"/>
+                        <w:rFonts w:eastAsiaTheme="minorEastAsia" w:cstheme="minorBidi"/>
+                        <w:iCs w:val="0"/>
+                        <w:szCs w:val="22"/>
+                        <w:lang w:val="en-US"/>
+                      </w:rPr>
+                    </m:ctrlPr>
+                  </m:fPr>
+                  <m:num>
+                    <m:sSub>
+                      <m:sSubPr>
+                        <m:ctrlPr>
+                          <w:rPr>
+                            <w:rStyle w:val="0-Char"/>
+                            <w:rFonts w:eastAsiaTheme="minorEastAsia" w:cstheme="minorBidi"/>
+                            <w:iCs w:val="0"/>
+                            <w:szCs w:val="22"/>
+                            <w:lang w:val="en-US"/>
+                          </w:rPr>
+                        </m:ctrlPr>
+                      </m:sSubPr>
+                      <m:e>
+                        <m:r>
+                          <m:rPr>
+                            <m:sty m:val="p"/>
+                          </m:rPr>
+                          <w:rPr>
+                            <w:rStyle w:val="0-Char"/>
+                            <w:rFonts w:eastAsiaTheme="minorEastAsia"/>
+                            <w:lang w:val="en-US"/>
+                          </w:rPr>
+                          <m:t>x</m:t>
+                        </m:r>
+                      </m:e>
+                      <m:sub>
+                        <m:r>
+                          <m:rPr>
+                            <m:sty m:val="p"/>
+                          </m:rPr>
+                          <w:rPr>
+                            <w:rStyle w:val="0-Char"/>
+                            <w:rFonts w:eastAsiaTheme="minorEastAsia"/>
+                            <w:lang w:val="en-US"/>
+                          </w:rPr>
+                          <m:t>c</m:t>
+                        </m:r>
+                      </m:sub>
+                    </m:sSub>
+                    <m:r>
+                      <m:rPr>
+                        <m:sty m:val="p"/>
+                      </m:rPr>
+                      <w:rPr>
+                        <w:rStyle w:val="0-Char"/>
+                        <w:rFonts w:eastAsiaTheme="minorEastAsia"/>
+                        <w:lang w:val="en-US"/>
+                      </w:rPr>
+                      <m:t>∙z</m:t>
+                    </m:r>
+                  </m:num>
+                  <m:den>
+                    <m:r>
+                      <m:rPr>
+                        <m:sty m:val="p"/>
+                      </m:rPr>
+                      <w:rPr>
+                        <w:rStyle w:val="0-Char"/>
+                        <w:rFonts w:eastAsiaTheme="minorEastAsia"/>
+                        <w:lang w:val="en-US"/>
+                      </w:rPr>
+                      <m:t>f</m:t>
+                    </m:r>
+                  </m:den>
+                </m:f>
+                <m:r>
+                  <m:rPr>
+                    <m:sty m:val="p"/>
+                  </m:rPr>
+                  <w:rPr>
+                    <w:rStyle w:val="0-Char"/>
+                    <w:rFonts w:eastAsiaTheme="minorEastAsia"/>
+                    <w:lang w:val="en-US"/>
+                  </w:rPr>
+                  <m:t>,</m:t>
+                </m:r>
+                <m:f>
+                  <m:fPr>
+                    <m:ctrlPr>
+                      <w:rPr>
+                        <w:rStyle w:val="0-Char"/>
+                        <w:rFonts w:eastAsiaTheme="minorEastAsia" w:cstheme="minorBidi"/>
+                        <w:iCs w:val="0"/>
+                        <w:szCs w:val="22"/>
+                        <w:lang w:val="en-US"/>
+                      </w:rPr>
+                    </m:ctrlPr>
+                  </m:fPr>
+                  <m:num>
+                    <m:sSub>
+                      <m:sSubPr>
+                        <m:ctrlPr>
+                          <w:rPr>
+                            <w:rStyle w:val="0-Char"/>
+                            <w:rFonts w:eastAsiaTheme="minorEastAsia" w:cstheme="minorBidi"/>
+                            <w:iCs w:val="0"/>
+                            <w:szCs w:val="22"/>
+                            <w:lang w:val="en-US"/>
+                          </w:rPr>
+                        </m:ctrlPr>
+                      </m:sSubPr>
+                      <m:e>
+                        <m:r>
+                          <m:rPr>
+                            <m:sty m:val="p"/>
+                          </m:rPr>
+                          <w:rPr>
+                            <w:rStyle w:val="0-Char"/>
+                            <w:rFonts w:eastAsiaTheme="minorEastAsia"/>
+                            <w:lang w:val="en-US"/>
+                          </w:rPr>
+                          <m:t>y</m:t>
+                        </m:r>
+                      </m:e>
+                      <m:sub>
+                        <m:r>
+                          <m:rPr>
+                            <m:sty m:val="p"/>
+                          </m:rPr>
+                          <w:rPr>
+                            <w:rStyle w:val="0-Char"/>
+                            <w:rFonts w:eastAsiaTheme="minorEastAsia"/>
+                            <w:lang w:val="en-US"/>
+                          </w:rPr>
+                          <m:t>c</m:t>
+                        </m:r>
+                      </m:sub>
+                    </m:sSub>
+                    <m:r>
+                      <m:rPr>
+                        <m:sty m:val="p"/>
+                      </m:rPr>
+                      <w:rPr>
+                        <w:rStyle w:val="0-Char"/>
+                        <w:rFonts w:eastAsiaTheme="minorEastAsia"/>
+                        <w:lang w:val="en-US"/>
+                      </w:rPr>
+                      <m:t>∙z</m:t>
+                    </m:r>
+                  </m:num>
+                  <m:den>
+                    <m:r>
+                      <m:rPr>
+                        <m:sty m:val="p"/>
+                      </m:rPr>
+                      <w:rPr>
+                        <w:rStyle w:val="0-Char"/>
+                        <w:rFonts w:eastAsiaTheme="minorEastAsia"/>
+                        <w:lang w:val="en-US"/>
+                      </w:rPr>
+                      <m:t>f</m:t>
+                    </m:r>
+                  </m:den>
+                </m:f>
+                <m:r>
+                  <m:rPr>
+                    <m:sty m:val="p"/>
+                  </m:rPr>
+                  <w:rPr>
+                    <w:rStyle w:val="0-Char"/>
+                    <w:rFonts w:eastAsiaTheme="minorEastAsia"/>
+                    <w:lang w:val="en-US"/>
+                  </w:rPr>
+                  <m:t>,</m:t>
+                </m:r>
+                <m:f>
+                  <m:fPr>
+                    <m:ctrlPr>
+                      <w:rPr>
+                        <w:rStyle w:val="0-Char"/>
+                        <w:rFonts w:eastAsiaTheme="minorEastAsia" w:cstheme="minorBidi"/>
+                        <w:iCs w:val="0"/>
+                        <w:szCs w:val="22"/>
+                        <w:lang w:val="en-US"/>
+                      </w:rPr>
+                    </m:ctrlPr>
+                  </m:fPr>
+                  <m:num>
+                    <m:r>
+                      <m:rPr>
+                        <m:sty m:val="p"/>
+                      </m:rPr>
+                      <w:rPr>
+                        <w:rStyle w:val="0-Char"/>
+                        <w:rFonts w:eastAsiaTheme="minorEastAsia"/>
+                        <w:lang w:val="en-US"/>
+                      </w:rPr>
+                      <m:t>b∙f</m:t>
+                    </m:r>
+                  </m:num>
+                  <m:den>
+                    <m:r>
+                      <m:rPr>
+                        <m:sty m:val="p"/>
+                      </m:rPr>
+                      <w:rPr>
+                        <w:rStyle w:val="0-Char"/>
+                        <w:rFonts w:eastAsiaTheme="minorEastAsia"/>
+                        <w:lang w:val="en-US"/>
+                      </w:rPr>
+                      <m:t>d</m:t>
+                    </m:r>
+                  </m:den>
+                </m:f>
+                <m:r>
+                  <m:rPr>
+                    <m:sty m:val="p"/>
+                  </m:rPr>
+                  <w:rPr>
+                    <w:rStyle w:val="0-Char"/>
+                    <w:rFonts w:eastAsiaTheme="minorEastAsia"/>
+                    <w:lang w:val="en-US"/>
+                  </w:rPr>
+                  <m:t>]</m:t>
                 </m:r>
               </m:oMath>
             </m:oMathPara>
@@ -1668,7 +1346,7 @@
         </w:tc>
         <w:tc>
           <w:tcPr>
-            <w:tcW w:w="674" w:type="dxa"/>
+            <w:tcW w:w="810" w:type="dxa"/>
             <w:vAlign w:val="center"/>
           </w:tcPr>
           <w:p>
@@ -1677,6 +1355,7 @@
                 <w:rFonts w:ascii="Times New Roman" w:eastAsia="Times New Roman" w:hAnsi="Times New Roman" w:cs="Times New Roman"/>
                 <w:iCs/>
                 <w:szCs w:val="20"/>
+                <w:lang w:val="sr-Cyrl-RS"/>
               </w:rPr>
             </w:pPr>
             <w:r>
@@ -1694,287 +1373,648 @@
     <w:p>
       <w:pPr>
         <w:pStyle w:val="0-"/>
-      </w:pPr>
-      <w:r>
-        <w:t>Ако је потребно укључивање великих слика, једначина или табела, ради побољшања њихове прегледности или читљивости, може да се формира посебна секција, са једном колоном, потребне висине и ширине, са бочним маргинама ширине 2 цм. У ту секцију уноси се нпр. слика и њен назив.</w:t>
+        <w:rPr>
+          <w:rStyle w:val="0-Char"/>
+          <w:rFonts w:eastAsiaTheme="minorEastAsia"/>
+          <w:lang w:val="sr-Cyrl-RS"/>
+        </w:rPr>
+      </w:pPr>
+      <w:r>
+        <w:rPr>
+          <w:rStyle w:val="0-Char"/>
+          <w:rFonts w:eastAsiaTheme="minorEastAsia"/>
+          <w:lang w:val="sr-Cyrl-RS"/>
+        </w:rPr>
+        <w:t xml:space="preserve">Где </w:t>
+      </w:r>
+      <w:r>
+        <w:rPr>
+          <w:rStyle w:val="0-Char"/>
+          <w:rFonts w:eastAsiaTheme="minorEastAsia"/>
+          <w:lang w:val="sr-Cyrl-RS"/>
+        </w:rPr>
+        <w:t>је</w:t>
+      </w:r>
+      <w:r>
+        <w:rPr>
+          <w:rStyle w:val="0-Char"/>
+          <w:rFonts w:eastAsiaTheme="minorEastAsia"/>
+          <w:lang w:val="sr-Cyrl-RS"/>
+        </w:rPr>
+        <w:t xml:space="preserve"> са </w:t>
+      </w:r>
+      <w:r>
+        <w:rPr>
+          <w:rStyle w:val="0-Char"/>
+          <w:rFonts w:eastAsiaTheme="minorEastAsia"/>
+          <w:lang w:val="en-US"/>
+        </w:rPr>
+        <w:t>x,</w:t>
+      </w:r>
+      <w:r>
+        <w:rPr>
+          <w:rStyle w:val="0-Char"/>
+          <w:rFonts w:eastAsiaTheme="minorEastAsia"/>
+          <w:lang w:val="sr-Cyrl-RS"/>
+        </w:rPr>
+        <w:t xml:space="preserve"> </w:t>
+      </w:r>
+      <w:r>
+        <w:rPr>
+          <w:rStyle w:val="0-Char"/>
+          <w:rFonts w:eastAsiaTheme="minorEastAsia"/>
+          <w:lang w:val="en-US"/>
+        </w:rPr>
+        <w:t>y,</w:t>
+      </w:r>
+      <w:r>
+        <w:rPr>
+          <w:rStyle w:val="0-Char"/>
+          <w:rFonts w:eastAsiaTheme="minorEastAsia"/>
+          <w:lang w:val="sr-Cyrl-RS"/>
+        </w:rPr>
+        <w:t xml:space="preserve"> </w:t>
+      </w:r>
+      <w:r>
+        <w:rPr>
+          <w:rStyle w:val="0-Char"/>
+          <w:rFonts w:eastAsiaTheme="minorEastAsia"/>
+          <w:lang w:val="en-US"/>
+        </w:rPr>
+        <w:t xml:space="preserve">z </w:t>
+      </w:r>
+      <w:r>
+        <w:rPr>
+          <w:rStyle w:val="0-Char"/>
+          <w:rFonts w:eastAsiaTheme="minorEastAsia"/>
+          <w:lang w:val="sr-Cyrl-RS"/>
+        </w:rPr>
+        <w:t xml:space="preserve">означен 3Д положај тачке, </w:t>
+      </w:r>
+      <w:r>
+        <w:rPr>
+          <w:rStyle w:val="0-Char"/>
+          <w:rFonts w:eastAsiaTheme="minorEastAsia"/>
+          <w:lang w:val="en-US"/>
+        </w:rPr>
+        <w:t>x</w:t>
+      </w:r>
+      <w:r>
+        <w:rPr>
+          <w:rStyle w:val="0-Char"/>
+          <w:rFonts w:eastAsiaTheme="minorEastAsia"/>
+          <w:vertAlign w:val="subscript"/>
+          <w:lang w:val="en-US"/>
+        </w:rPr>
+        <w:t>c</w:t>
+      </w:r>
+      <w:r>
+        <w:rPr>
+          <w:rStyle w:val="0-Char"/>
+          <w:rFonts w:eastAsiaTheme="minorEastAsia"/>
+          <w:lang w:val="sr-Cyrl-RS"/>
+        </w:rPr>
+        <w:t xml:space="preserve"> и </w:t>
+      </w:r>
+      <w:r>
+        <w:rPr>
+          <w:rStyle w:val="0-Char"/>
+          <w:rFonts w:eastAsiaTheme="minorEastAsia"/>
+          <w:lang w:val="en-US"/>
+        </w:rPr>
+        <w:t>y</w:t>
+      </w:r>
+      <w:r>
+        <w:rPr>
+          <w:rStyle w:val="0-Char"/>
+          <w:rFonts w:eastAsiaTheme="minorEastAsia"/>
+          <w:vertAlign w:val="subscript"/>
+          <w:lang w:val="en-US"/>
+        </w:rPr>
+        <w:t>c</w:t>
+      </w:r>
+      <w:r>
+        <w:rPr>
+          <w:rStyle w:val="0-Char"/>
+          <w:rFonts w:eastAsiaTheme="minorEastAsia"/>
+          <w:lang w:val="sr-Cyrl-RS"/>
+        </w:rPr>
+        <w:t xml:space="preserve"> су координате пиксела у слици, </w:t>
+      </w:r>
+      <w:r>
+        <w:rPr>
+          <w:rStyle w:val="0-Char"/>
+          <w:rFonts w:eastAsiaTheme="minorEastAsia"/>
+          <w:lang w:val="en-US"/>
+        </w:rPr>
+        <w:t>b</w:t>
+      </w:r>
+      <w:r>
+        <w:rPr>
+          <w:rStyle w:val="0-Char"/>
+          <w:rFonts w:eastAsiaTheme="minorEastAsia"/>
+          <w:lang w:val="sr-Cyrl-RS"/>
+        </w:rPr>
+        <w:t xml:space="preserve"> представља базну дистанцу, </w:t>
+      </w:r>
+      <w:r>
+        <w:rPr>
+          <w:rStyle w:val="0-Char"/>
+          <w:rFonts w:eastAsiaTheme="minorEastAsia"/>
+          <w:lang w:val="en-US"/>
+        </w:rPr>
+        <w:t>d</w:t>
+      </w:r>
+      <w:r>
+        <w:rPr>
+          <w:rStyle w:val="0-Char"/>
+          <w:rFonts w:eastAsiaTheme="minorEastAsia"/>
+          <w:lang w:val="sr-Cyrl-RS"/>
+        </w:rPr>
+        <w:t xml:space="preserve"> је разлика положаја у левој и десној слици и </w:t>
+      </w:r>
+      <w:r>
+        <w:rPr>
+          <w:rStyle w:val="0-Char"/>
+          <w:rFonts w:eastAsiaTheme="minorEastAsia"/>
+          <w:lang w:val="en-US"/>
+        </w:rPr>
+        <w:t>f</w:t>
+      </w:r>
+      <w:r>
+        <w:rPr>
+          <w:rStyle w:val="0-Char"/>
+          <w:rFonts w:eastAsiaTheme="minorEastAsia"/>
+          <w:lang w:val="sr-Cyrl-RS"/>
+        </w:rPr>
+        <w:t xml:space="preserve"> је жижна даљина изражена у пикселима</w:t>
+      </w:r>
+      <w:r>
+        <w:rPr>
+          <w:rStyle w:val="0-Char"/>
+          <w:rFonts w:eastAsiaTheme="minorEastAsia"/>
+          <w:lang w:val="sr-Cyrl-RS"/>
+        </w:rPr>
+        <w:t xml:space="preserve"> </w:t>
+      </w:r>
+      <w:r>
+        <w:rPr>
+          <w:rStyle w:val="0-Char"/>
+          <w:rFonts w:eastAsiaTheme="minorEastAsia"/>
+          <w:lang w:val="en-US"/>
+        </w:rPr>
+        <w:t>[</w:t>
+      </w:r>
+      <w:r>
+        <w:rPr>
+          <w:rStyle w:val="0-Char"/>
+          <w:rFonts w:eastAsiaTheme="minorEastAsia"/>
+          <w:lang w:val="sr-Cyrl-RS"/>
+        </w:rPr>
+        <w:t>2</w:t>
+      </w:r>
+      <w:r>
+        <w:rPr>
+          <w:rStyle w:val="0-Char"/>
+          <w:rFonts w:eastAsiaTheme="minorEastAsia"/>
+          <w:lang w:val="en-US"/>
+        </w:rPr>
+        <w:t>]</w:t>
+      </w:r>
+      <w:r>
+        <w:rPr>
+          <w:rStyle w:val="0-Char"/>
+          <w:rFonts w:eastAsiaTheme="minorEastAsia"/>
+          <w:lang w:val="sr-Cyrl-RS"/>
+        </w:rPr>
+        <w:t>.</w:t>
       </w:r>
     </w:p>
     <w:p>
       <w:pPr>
         <w:pStyle w:val="0-"/>
         <w:rPr>
-          <w:lang w:val="sr-Cyrl-RS"/>
-        </w:rPr>
-        <w:sectPr>
-          <w:type w:val="continuous"/>
-          <w:pgSz w:w="11906" w:h="16838"/>
-          <w:pgMar w:top="1134" w:right="1134" w:bottom="1134" w:left="1134" w:header="708" w:footer="708" w:gutter="0"/>
-          <w:cols w:num="2" w:space="284"/>
-          <w:docGrid w:linePitch="360"/>
-        </w:sectPr>
-      </w:pPr>
-      <w:r>
-        <w:t>Изнад табеле треба да стоји натпис,</w:t>
-      </w:r>
-      <w:r>
-        <w:t xml:space="preserve"> као у </w:t>
-      </w:r>
-      <w:r>
-        <w:t>Табел</w:t>
-      </w:r>
-      <w:r>
-        <w:t>и 1</w:t>
-      </w:r>
-      <w:r>
+          <w:rStyle w:val="0-Char"/>
+          <w:rFonts w:eastAsiaTheme="minorEastAsia"/>
+          <w:lang w:val="sr-Cyrl-RS"/>
+        </w:rPr>
+      </w:pPr>
+      <w:r>
+        <w:rPr>
+          <w:rStyle w:val="0-Char"/>
+          <w:rFonts w:eastAsiaTheme="minorEastAsia"/>
+          <w:lang w:val="sr-Cyrl-RS"/>
+        </w:rPr>
+        <w:t xml:space="preserve">У случају великих удаљености у сцени (много веће од базне дистанце) стерео ВО се своди на случај монокуларне ВО </w:t>
+      </w:r>
+      <w:r>
+        <w:rPr>
+          <w:rStyle w:val="0-Char"/>
+          <w:rFonts w:eastAsiaTheme="minorEastAsia"/>
+          <w:lang w:val="en-US"/>
+        </w:rPr>
+        <w:t>[1]</w:t>
+      </w:r>
+      <w:r>
+        <w:rPr>
+          <w:rStyle w:val="0-Char"/>
+          <w:rFonts w:eastAsiaTheme="minorEastAsia"/>
+          <w:lang w:val="sr-Cyrl-RS"/>
+        </w:rPr>
+        <w:t>. Због недостатка могућности да се дубина сцене израчуна директно, монокуларна ВО користи кореспонденцију тачака у узастопним сликама за реконструкцију дубине и кретања камере. С обзиром</w:t>
+      </w:r>
+      <w:r>
+        <w:rPr>
+          <w:rStyle w:val="0-Char"/>
+          <w:rFonts w:eastAsiaTheme="minorEastAsia"/>
+          <w:lang w:val="sr-Cyrl-RS"/>
+        </w:rPr>
+        <w:t xml:space="preserve"> на то</w:t>
+      </w:r>
+      <w:r>
+        <w:rPr>
+          <w:rStyle w:val="0-Char"/>
+          <w:rFonts w:eastAsiaTheme="minorEastAsia"/>
+          <w:lang w:val="sr-Cyrl-RS"/>
+        </w:rPr>
+        <w:t xml:space="preserve"> да не постоји податак као базна дистанца на основу којег би се одредила апсолутна скала, алгоритми за монокуларну ВО могу да процене кретање само до фактора скале</w:t>
+      </w:r>
+      <w:r>
+        <w:rPr>
+          <w:rStyle w:val="Heading2Char"/>
+          <w:rFonts w:eastAsiaTheme="minorEastAsia"/>
+          <w:lang w:val="sr-Cyrl-RS"/>
+        </w:rPr>
+        <w:t xml:space="preserve"> </w:t>
+      </w:r>
+      <w:r>
+        <w:rPr>
+          <w:rStyle w:val="0-Char"/>
+          <w:rFonts w:eastAsiaTheme="minorEastAsia"/>
+          <w:lang w:val="en-US"/>
+        </w:rPr>
+        <w:t>[1]</w:t>
+      </w:r>
+      <w:r>
+        <w:rPr>
+          <w:rStyle w:val="0-Char"/>
+          <w:rFonts w:eastAsiaTheme="minorEastAsia"/>
+          <w:lang w:val="sr-Cyrl-RS"/>
+        </w:rPr>
         <w:t>.</w:t>
       </w:r>
-      <w:r>
-        <w:t xml:space="preserve"> </w:t>
-      </w:r>
-      <w:r>
-        <w:t xml:space="preserve">Испод сваке слике или дијаграма треба да стоји </w:t>
-      </w:r>
-      <w:r>
-        <w:t xml:space="preserve">број и </w:t>
-      </w:r>
-      <w:r>
-        <w:t xml:space="preserve">кратак назив, а </w:t>
-      </w:r>
-      <w:r>
-        <w:t xml:space="preserve">свака </w:t>
-      </w:r>
-      <w:r>
-        <w:t xml:space="preserve">слика </w:t>
-      </w:r>
-      <w:r>
-        <w:t xml:space="preserve">и табела </w:t>
-      </w:r>
-      <w:r>
-        <w:t xml:space="preserve">мора да се </w:t>
-      </w:r>
-      <w:r>
-        <w:rPr>
-          <w:lang w:val="sr-Cyrl-RS"/>
-        </w:rPr>
-        <w:t>помену</w:t>
-      </w:r>
-      <w:r>
-        <w:t xml:space="preserve"> </w:t>
-      </w:r>
-      <w:r>
-        <w:t>у тексту</w:t>
-      </w:r>
-      <w:r>
-        <w:t xml:space="preserve">. Ако нема простора </w:t>
-      </w:r>
-      <w:r>
-        <w:rPr>
-          <w:lang w:val="sr-Latn-RS"/>
-        </w:rPr>
-        <w:t xml:space="preserve">за слику на истој страни </w:t>
-      </w:r>
-      <w:r>
-        <w:rPr>
-          <w:lang w:val="sr-Cyrl-RS"/>
-        </w:rPr>
-        <w:t xml:space="preserve">или колони </w:t>
-      </w:r>
-      <w:r>
-        <w:rPr>
-          <w:lang w:val="sr-Latn-RS"/>
-        </w:rPr>
-        <w:t>где је по</w:t>
-      </w:r>
-      <w:r>
-        <w:rPr>
-          <w:lang w:val="sr-Latn-RS"/>
-        </w:rPr>
-        <w:softHyphen/>
-        <w:t>менута, треба да се стави на следећу страну</w:t>
-      </w:r>
-      <w:r>
-        <w:rPr>
-          <w:lang w:val="sr-Cyrl-RS"/>
-        </w:rPr>
-        <w:t xml:space="preserve"> или колону</w:t>
-      </w:r>
-      <w:r>
-        <w:rPr>
-          <w:lang w:val="sr-Latn-RS"/>
-        </w:rPr>
-        <w:t>.</w:t>
-      </w:r>
-      <w:r>
-        <w:rPr>
-          <w:lang w:val="sr-Cyrl-RS"/>
-        </w:rPr>
-        <w:t xml:space="preserve"> </w:t>
-      </w:r>
-    </w:p>
-    <w:p>
-      <w:pPr>
-        <w:pStyle w:val="Caption"/>
-      </w:pPr>
-      <w:r>
-        <w:rPr>
-          <w:rFonts w:eastAsia="Times New Roman"/>
-          <w:noProof/>
-          <w:lang w:val="en-US"/>
-        </w:rPr>
-        <w:drawing>
-          <wp:inline distT="0" distB="0" distL="0" distR="0" wp14:anchorId="45CBB4E1" wp14:editId="32E6E565">
-            <wp:extent cx="3345123" cy="2290916"/>
-            <wp:effectExtent l="19050" t="19050" r="27305" b="14605"/>
-            <wp:docPr id="3" name="Picture 3"/>
-            <wp:cNvGraphicFramePr>
-              <a:graphicFrameLocks xmlns:a="http://schemas.openxmlformats.org/drawingml/2006/main" noChangeAspect="1"/>
-            </wp:cNvGraphicFramePr>
-            <a:graphic xmlns:a="http://schemas.openxmlformats.org/drawingml/2006/main">
-              <a:graphicData uri="http://schemas.openxmlformats.org/drawingml/2006/picture">
-                <pic:pic xmlns:pic="http://schemas.openxmlformats.org/drawingml/2006/picture">
-                  <pic:nvPicPr>
-                    <pic:cNvPr id="0" name="Picture 12"/>
-                    <pic:cNvPicPr>
-                      <a:picLocks noChangeAspect="1" noChangeArrowheads="1"/>
-                    </pic:cNvPicPr>
-                  </pic:nvPicPr>
-                  <pic:blipFill>
-                    <a:blip r:embed="rId13" cstate="print">
-                      <a:extLst>
-                        <a:ext uri="{28A0092B-C50C-407E-A947-70E740481C1C}">
-                          <a14:useLocalDpi xmlns:a14="http://schemas.microsoft.com/office/drawing/2010/main" val="0"/>
-                        </a:ext>
-                      </a:extLst>
-                    </a:blip>
-                    <a:srcRect/>
-                    <a:stretch>
-                      <a:fillRect/>
-                    </a:stretch>
-                  </pic:blipFill>
-                  <pic:spPr bwMode="auto">
-                    <a:xfrm>
-                      <a:off x="0" y="0"/>
-                      <a:ext cx="3365035" cy="2304553"/>
-                    </a:xfrm>
-                    <a:prstGeom prst="rect">
-                      <a:avLst/>
-                    </a:prstGeom>
-                    <a:noFill/>
-                    <a:ln w="6350" cmpd="sng">
-                      <a:solidFill>
-                        <a:srgbClr val="000000"/>
-                      </a:solidFill>
-                      <a:miter lim="800000"/>
-                      <a:headEnd/>
-                      <a:tailEnd/>
-                    </a:ln>
-                    <a:effectLst/>
-                  </pic:spPr>
-                </pic:pic>
-              </a:graphicData>
-            </a:graphic>
-          </wp:inline>
-        </w:drawing>
-      </w:r>
-    </w:p>
-    <w:p>
-      <w:pPr>
-        <w:pStyle w:val="Caption"/>
-        <w:rPr>
-          <w:rFonts w:ascii="Times New Roman" w:eastAsia="Times New Roman" w:hAnsi="Times New Roman" w:cs="Times New Roman"/>
+    </w:p>
+    <w:p>
+      <w:pPr>
+        <w:pStyle w:val="0-"/>
+        <w:rPr>
+          <w:rFonts w:ascii="Times New Roman" w:hAnsi="Times New Roman" w:cs="Times New Roman"/>
           <w:iCs/>
           <w:szCs w:val="20"/>
+          <w:lang w:val="sr-Cyrl-RS"/>
+        </w:rPr>
+      </w:pPr>
+      <w:r>
+        <w:rPr>
+          <w:rStyle w:val="0-Char"/>
+          <w:rFonts w:eastAsiaTheme="minorEastAsia"/>
+          <w:lang w:val="sr-Cyrl-RS"/>
+        </w:rPr>
+        <w:t xml:space="preserve">Методе ВО могу да се поделе првенствено на геометријске и методе засноване на дубоком учењу. Геометријске даље могу да се поделе на методе засноване на карактеристичним тачкама и директне </w:t>
+      </w:r>
+      <w:r>
+        <w:rPr>
+          <w:rStyle w:val="0-Char"/>
+          <w:rFonts w:eastAsiaTheme="minorEastAsia"/>
           <w:lang w:val="en-US"/>
         </w:rPr>
-      </w:pPr>
-      <w:r>
-        <w:t xml:space="preserve">Слика </w:t>
-      </w:r>
-      <w:r>
-        <w:fldChar w:fldCharType="begin"/>
-      </w:r>
-      <w:r>
-        <w:instrText xml:space="preserve"> SEQ Слика \* ARABIC </w:instrText>
-      </w:r>
-      <w:r>
-        <w:fldChar w:fldCharType="separate"/>
-      </w:r>
-      <w:r>
-        <w:rPr>
-          <w:noProof/>
-        </w:rPr>
-        <w:t>1</w:t>
-      </w:r>
-      <w:r>
-        <w:rPr>
-          <w:noProof/>
-        </w:rPr>
-        <w:fldChar w:fldCharType="end"/>
-      </w:r>
-      <w:r>
-        <w:rPr>
-          <w:lang w:val="sr-Cyrl-RS"/>
-        </w:rPr>
-        <w:t xml:space="preserve">. Резултати симулације </w:t>
-      </w:r>
-      <w:r>
-        <w:rPr>
+        <w:t>[</w:t>
+      </w:r>
+      <w:r>
+        <w:rPr>
+          <w:rStyle w:val="0-Char"/>
+          <w:rFonts w:eastAsiaTheme="minorEastAsia"/>
+          <w:lang w:val="sr-Cyrl-RS"/>
+        </w:rPr>
+        <w:t>3</w:t>
+      </w:r>
+      <w:r>
+        <w:rPr>
+          <w:rStyle w:val="0-Char"/>
+          <w:rFonts w:eastAsiaTheme="minorEastAsia"/>
           <w:lang w:val="en-US"/>
         </w:rPr>
-        <w:t>[2]</w:t>
-      </w:r>
-    </w:p>
-    <w:p>
-      <w:pPr>
-        <w:ind w:firstLine="0"/>
-        <w:rPr>
-          <w:rFonts w:ascii="Times New Roman" w:eastAsia="Times New Roman" w:hAnsi="Times New Roman" w:cs="Times New Roman"/>
+        <w:t>]</w:t>
+      </w:r>
+      <w:r>
+        <w:rPr>
+          <w:rStyle w:val="0-Char"/>
+          <w:rFonts w:eastAsiaTheme="minorEastAsia"/>
+          <w:lang w:val="sr-Cyrl-RS"/>
+        </w:rPr>
+        <w:t>. У овом раду су анализирани представници свак</w:t>
+      </w:r>
+      <w:r>
+        <w:rPr>
+          <w:rStyle w:val="0-Char"/>
+          <w:rFonts w:eastAsiaTheme="minorEastAsia"/>
+          <w:lang w:val="sr-Cyrl-RS"/>
+        </w:rPr>
+        <w:t>ог</w:t>
+      </w:r>
+      <w:r>
+        <w:rPr>
+          <w:rStyle w:val="0-Char"/>
+          <w:rFonts w:eastAsiaTheme="minorEastAsia"/>
+          <w:lang w:val="sr-Cyrl-RS"/>
+        </w:rPr>
+        <w:t xml:space="preserve"> од та три типа метода.</w:t>
+      </w:r>
+    </w:p>
+    <w:p>
+      <w:pPr>
+        <w:pStyle w:val="2-"/>
+      </w:pPr>
+      <w:r>
+        <w:t>SVO</w:t>
+      </w:r>
+    </w:p>
+    <w:p>
+      <w:pPr>
+        <w:pStyle w:val="0-"/>
+        <w:spacing w:before="120"/>
+        <w:rPr>
+          <w:rStyle w:val="0-Char"/>
+          <w:rFonts w:eastAsiaTheme="minorEastAsia"/>
+          <w:lang w:val="sr-Cyrl-RS"/>
+        </w:rPr>
+      </w:pPr>
+      <w:r>
+        <w:t>Semi-Direct Visual Odometry (SVO)</w:t>
+      </w:r>
+      <w:r>
+        <w:rPr>
+          <w:lang w:val="sr-Cyrl-RS"/>
+        </w:rPr>
+        <w:t xml:space="preserve"> алгоритам користи кореспонденцију карактеристика, али с обзиром</w:t>
+      </w:r>
+      <w:r>
+        <w:rPr>
+          <w:lang w:val="sr-Cyrl-RS"/>
+        </w:rPr>
+        <w:t xml:space="preserve"> </w:t>
+      </w:r>
+      <w:r>
+        <w:rPr>
+          <w:lang w:val="sr-Cyrl-RS"/>
+        </w:rPr>
+        <w:t>да то представља имплицитни резултат директне процене кретања</w:t>
+      </w:r>
+      <w:r>
+        <w:rPr>
+          <w:lang w:val="sr-Cyrl-RS"/>
+        </w:rPr>
+        <w:t xml:space="preserve">, а не резултат експлицитног издвајања и упаривања карактеристика, </w:t>
+      </w:r>
+      <w:r>
+        <w:rPr>
           <w:iCs/>
-          <w:szCs w:val="20"/>
-          <w:lang w:val="sr-Cyrl-RS"/>
-        </w:rPr>
-        <w:sectPr>
-          <w:type w:val="continuous"/>
-          <w:pgSz w:w="11906" w:h="16838"/>
-          <w:pgMar w:top="1134" w:right="1134" w:bottom="1134" w:left="1134" w:header="708" w:footer="708" w:gutter="0"/>
-          <w:cols w:space="284"/>
-          <w:docGrid w:linePitch="360"/>
-        </w:sectPr>
-      </w:pPr>
-    </w:p>
-    <w:p>
-      <w:pPr>
-        <w:pStyle w:val="Caption"/>
-        <w:keepNext/>
-        <w:ind w:firstLine="0"/>
-        <w:jc w:val="both"/>
-        <w:rPr>
-          <w:lang w:val="sr-Cyrl-RS"/>
-        </w:rPr>
-      </w:pPr>
-      <w:r>
-        <w:t xml:space="preserve">Табела </w:t>
-      </w:r>
-      <w:r>
-        <w:fldChar w:fldCharType="begin"/>
-      </w:r>
-      <w:r>
-        <w:instrText xml:space="preserve"> SEQ Табела \* ARABIC </w:instrText>
-      </w:r>
-      <w:r>
-        <w:fldChar w:fldCharType="separate"/>
-      </w:r>
-      <w:r>
-        <w:rPr>
-          <w:noProof/>
-        </w:rPr>
-        <w:t>1</w:t>
-      </w:r>
-      <w:r>
-        <w:rPr>
-          <w:noProof/>
-        </w:rPr>
-        <w:fldChar w:fldCharType="end"/>
+        </w:rPr>
+        <w:t xml:space="preserve"> </w:t>
+      </w:r>
+      <w:r>
+        <w:t>SVO</w:t>
+      </w:r>
+      <w:r>
+        <w:rPr>
+          <w:lang w:val="sr-Cyrl-RS"/>
+        </w:rPr>
+        <w:t xml:space="preserve"> је издвојен као представник директних метода ВО. Екстракција карактеристика је потребна само када се одабере нова кључна слика ради иницијализације 3Д тачака. Предност таквог приступа је прескакање рачунски </w:t>
+      </w:r>
+      <w:r>
+        <w:rPr>
+          <w:lang w:val="sr-Cyrl-RS"/>
+        </w:rPr>
+        <w:t>захтевног</w:t>
+      </w:r>
+      <w:r>
+        <w:rPr>
+          <w:lang w:val="sr-Cyrl-RS"/>
+        </w:rPr>
+        <w:t xml:space="preserve"> процеса екстракције карактеристика у сваком фрејму. Чим се заврши кореспонденција карактеристика и процена иницијалне позе камере, алгоритам наставља са коришћењем само претходно иницијализованих 3Д тачака. За процену дубине на локацијама карактеристика користи се Бајесов филт</w:t>
+      </w:r>
+      <w:r>
+        <w:rPr>
+          <w:lang w:val="sr-Cyrl-RS"/>
+        </w:rPr>
+        <w:t>а</w:t>
+      </w:r>
+      <w:r>
+        <w:rPr>
+          <w:lang w:val="sr-Cyrl-RS"/>
+        </w:rPr>
+        <w:t>р који експлицитно моделује непоуздана мерења. Тек када филт</w:t>
+      </w:r>
+      <w:r>
+        <w:rPr>
+          <w:lang w:val="sr-Cyrl-RS"/>
+        </w:rPr>
+        <w:t>а</w:t>
+      </w:r>
+      <w:r>
+        <w:rPr>
+          <w:lang w:val="sr-Cyrl-RS"/>
+        </w:rPr>
+        <w:t xml:space="preserve">р дубине конвергира, нова 3Д тачка се иницијализује </w:t>
+      </w:r>
+      <w:r>
+        <w:rPr>
+          <w:rStyle w:val="0-Char"/>
+          <w:rFonts w:eastAsiaTheme="minorEastAsia"/>
+          <w:lang w:val="en-US"/>
+        </w:rPr>
+        <w:t>[</w:t>
+      </w:r>
+      <w:r>
+        <w:rPr>
+          <w:rStyle w:val="0-Char"/>
+          <w:rFonts w:eastAsiaTheme="minorEastAsia"/>
+          <w:lang w:val="sr-Cyrl-RS"/>
+        </w:rPr>
+        <w:t>4</w:t>
+      </w:r>
+      <w:r>
+        <w:rPr>
+          <w:rStyle w:val="0-Char"/>
+          <w:rFonts w:eastAsiaTheme="minorEastAsia"/>
+          <w:lang w:val="en-US"/>
+        </w:rPr>
+        <w:t>]</w:t>
+      </w:r>
+      <w:r>
+        <w:rPr>
+          <w:rStyle w:val="0-Char"/>
+          <w:rFonts w:eastAsiaTheme="minorEastAsia"/>
+          <w:lang w:val="sr-Cyrl-RS"/>
+        </w:rPr>
+        <w:t>.</w:t>
+      </w:r>
+    </w:p>
+    <w:p>
+      <w:pPr>
+        <w:pStyle w:val="0-"/>
+        <w:spacing w:before="120"/>
+        <w:rPr>
+          <w:rStyle w:val="0-Char"/>
+          <w:rFonts w:eastAsiaTheme="minorEastAsia"/>
+          <w:lang w:val="sr-Cyrl-RS"/>
+        </w:rPr>
+      </w:pPr>
+      <w:r>
+        <w:rPr>
+          <w:rStyle w:val="0-Char"/>
+          <w:rFonts w:eastAsiaTheme="minorEastAsia"/>
+          <w:lang w:val="sr-Cyrl-RS"/>
+        </w:rPr>
+        <w:t xml:space="preserve">Процена кретања се састоји из три корака. Промена релативне позе камере између две узастопне слике имплицитно доводи до померања репројектованих тачака. Поравнавање слике настоји да пронађе трансформацију између поза камере тако да минимизује фотометријску грешку између делова слике који одговарају истој 3Д тачки. Та трансформација дефинише иницијалну процену положаја </w:t>
+      </w:r>
+      <w:r>
+        <w:rPr>
+          <w:rStyle w:val="0-Char"/>
+          <w:rFonts w:eastAsiaTheme="minorEastAsia"/>
+          <w:lang w:val="sr-Cyrl-RS"/>
+        </w:rPr>
+        <w:t>видљивих 3Д тачака у односу на нову слику.</w:t>
+      </w:r>
+      <w:r>
+        <w:rPr>
+          <w:rStyle w:val="0-Char"/>
+          <w:rFonts w:eastAsiaTheme="minorEastAsia"/>
+          <w:lang w:val="sr-Cyrl-RS"/>
+        </w:rPr>
+        <w:t xml:space="preserve"> </w:t>
+      </w:r>
+      <w:r>
+        <w:rPr>
+          <w:rStyle w:val="0-Char"/>
+          <w:rFonts w:eastAsiaTheme="minorEastAsia"/>
+          <w:lang w:val="sr-Cyrl-RS"/>
+        </w:rPr>
+        <w:t xml:space="preserve">Због нетачности у тој процени, фотометријска грешка може додатно да се минимизује оптимизацијом положаја </w:t>
+      </w:r>
+      <w:r>
+        <w:rPr>
+          <w:rStyle w:val="0-Char"/>
+          <w:rFonts w:eastAsiaTheme="minorEastAsia"/>
+          <w:lang w:val="sr-Cyrl-RS"/>
+        </w:rPr>
+        <w:t>сваког издвојеног дела слике појединачно. Овим кораком се врши нарушавање епиполарних ограничења, како би се добила већа корелација између делова слика. Последњим кораком се оптимизују поза камере и положај</w:t>
+      </w:r>
+      <w:r>
+        <w:rPr>
+          <w:rStyle w:val="0-Char"/>
+          <w:rFonts w:eastAsiaTheme="minorEastAsia"/>
+          <w:lang w:val="sr-Cyrl-RS"/>
+        </w:rPr>
+        <w:t>и</w:t>
+      </w:r>
+      <w:r>
+        <w:rPr>
+          <w:rStyle w:val="0-Char"/>
+          <w:rFonts w:eastAsiaTheme="minorEastAsia"/>
+          <w:lang w:val="sr-Cyrl-RS"/>
+        </w:rPr>
+        <w:t xml:space="preserve"> 3Д тачака минимизацијом репројекционе грешке.</w:t>
+      </w:r>
+    </w:p>
+    <w:p>
+      <w:pPr>
+        <w:pStyle w:val="0-"/>
+        <w:spacing w:before="120"/>
+        <w:rPr>
+          <w:rStyle w:val="0-Char"/>
+          <w:rFonts w:eastAsiaTheme="minorEastAsia"/>
+          <w:lang w:val="sr-Cyrl-RS"/>
+        </w:rPr>
+      </w:pPr>
+    </w:p>
+    <w:p>
+      <w:pPr>
+        <w:pStyle w:val="0-"/>
+        <w:spacing w:before="120"/>
+        <w:rPr>
+          <w:lang w:val="sr-Latn-RS"/>
+        </w:rPr>
+      </w:pPr>
+    </w:p>
+    <w:p>
+      <w:pPr>
+        <w:pStyle w:val="2-"/>
+      </w:pPr>
+      <w:r>
+        <w:t>ORB-SLAM3</w:t>
+      </w:r>
+    </w:p>
+    <w:p>
+      <w:pPr>
+        <w:pStyle w:val="0-"/>
+        <w:rPr>
+          <w:lang w:val="sr-Cyrl-RS"/>
+        </w:rPr>
+      </w:pPr>
+      <w:r>
+        <w:rPr>
+          <w:lang w:val="sr-Cyrl-RS"/>
+        </w:rPr>
+        <w:t>ORB-SLAM3</w:t>
+      </w:r>
+      <w:r>
+        <w:rPr>
+          <w:lang w:val="sr-Cyrl-RS"/>
+        </w:rPr>
+        <w:t xml:space="preserve"> је систем за визуелни </w:t>
+      </w:r>
+      <w:r>
+        <w:rPr>
+          <w:lang w:val="sr-Cyrl-RS"/>
+        </w:rPr>
+        <w:t>SLAM (Simultaneous</w:t>
+      </w:r>
+      <w:r>
+        <w:rPr>
+          <w:lang w:val="sr-Cyrl-RS"/>
+        </w:rPr>
+        <w:t xml:space="preserve"> </w:t>
+      </w:r>
+      <w:r>
+        <w:rPr>
+          <w:lang w:val="sr-Cyrl-RS"/>
+        </w:rPr>
+        <w:t>localization and mapping)</w:t>
+      </w:r>
+      <w:r>
+        <w:rPr>
+          <w:lang w:val="sr-Cyrl-RS"/>
+        </w:rPr>
+        <w:t xml:space="preserve"> заснован на карактеристичним тачкама. За разлику од многих алгоритама за ВО који се ослањају само на краткорочне информације, односно прате окружење само док се налази у погледу, </w:t>
+      </w:r>
+      <w:r>
+        <w:rPr>
+          <w:lang w:val="sr-Cyrl-RS"/>
+        </w:rPr>
+        <w:t>ORB-SLAM3</w:t>
+      </w:r>
+      <w:r>
+        <w:rPr>
+          <w:lang w:val="sr-Cyrl-RS"/>
+        </w:rPr>
+        <w:t xml:space="preserve"> користи и средњерочне информације, које се користе када се у погледу нађе претходно истражено окружење, као и дугорочне информације које омогућавају ресетовање дрифта и корекцију мапе </w:t>
+      </w:r>
+      <w:r>
+        <w:rPr>
+          <w:lang w:val="sr-Cyrl-RS"/>
+        </w:rPr>
+        <w:t>[5]</w:t>
       </w:r>
       <w:r>
         <w:rPr>
@@ -1986,242 +2026,902 @@
         <w:rPr>
           <w:lang w:val="sr-Cyrl-RS"/>
         </w:rPr>
-        <w:t>Врсте система за обраду сигнала</w:t>
-      </w:r>
+        <w:t>ORB-SLAM3</w:t>
+      </w:r>
+      <w:r>
+        <w:rPr>
+          <w:lang w:val="sr-Cyrl-RS"/>
+        </w:rPr>
+        <w:t xml:space="preserve"> је изабран не само зато што је представник метода заснованих на карактеристичним тачкама, већ и како би се обрадио утицај локализације на успешност ВО.</w:t>
+      </w:r>
+    </w:p>
+    <w:p>
+      <w:pPr>
+        <w:pStyle w:val="0-"/>
+        <w:rPr>
+          <w:lang w:val="sr-Cyrl-RS"/>
+        </w:rPr>
+      </w:pPr>
+      <w:r>
+        <w:rPr>
+          <w:lang w:val="sr-Cyrl-RS"/>
+        </w:rPr>
+        <w:t>Алгоритам је организован у три компоненте: праћење, локално мапирање и спајање мапа. Праћење рачуна тренутну позу у односу на активну мапу минимизацијом репројекционе грешке упарених карактеристика. Локално мапирање додаје нове кључне слике и 3Д тачке у активну мапу</w:t>
+      </w:r>
+      <w:r>
+        <w:rPr>
+          <w:lang w:val="sr-Cyrl-RS"/>
+        </w:rPr>
+        <w:t>, уклања редундантне и побољшава локалну мапу</w:t>
+      </w:r>
+      <w:r>
+        <w:rPr>
+          <w:lang w:val="sr-Cyrl-RS"/>
+        </w:rPr>
+        <w:t>. Спајање мапа детектује заједничке делове између активне мапе и претходно познатих мапа. Уколико заједнички регион припада активној мапи, врши се корекција петље</w:t>
+      </w:r>
+      <w:r>
+        <w:rPr>
+          <w:lang w:val="sr-Cyrl-RS"/>
+        </w:rPr>
+        <w:t xml:space="preserve">. Уколико припада некој другој мапи, врши се спајање мапа </w:t>
+      </w:r>
+      <w:r>
+        <w:rPr>
+          <w:lang w:val="sr-Cyrl-RS"/>
+        </w:rPr>
+        <w:t>[5]</w:t>
+      </w:r>
+      <w:r>
+        <w:rPr>
+          <w:lang w:val="sr-Cyrl-RS"/>
+        </w:rPr>
+        <w:t>.</w:t>
+      </w:r>
+    </w:p>
+    <w:p>
+      <w:pPr>
+        <w:pStyle w:val="2-"/>
+      </w:pPr>
+      <w:r>
+        <w:t>TSformer-VO</w:t>
+      </w:r>
+    </w:p>
+    <w:p>
+      <w:pPr>
+        <w:pStyle w:val="0-"/>
+        <w:rPr>
+          <w:lang w:val="sr-Cyrl-RS"/>
+        </w:rPr>
+      </w:pPr>
+      <w:r>
+        <w:rPr>
+          <w:lang w:val="sr-Cyrl-RS"/>
+        </w:rPr>
+        <w:t>TSformer-VO</w:t>
+      </w:r>
+      <w:r>
+        <w:rPr>
+          <w:lang w:val="sr-Cyrl-RS"/>
+        </w:rPr>
+        <w:t xml:space="preserve"> је метода заснована на </w:t>
+      </w:r>
+      <w:r>
+        <w:rPr>
+          <w:lang w:val="sr-Cyrl-RS"/>
+        </w:rPr>
+        <w:t>TimeSFormer</w:t>
+      </w:r>
+      <w:r>
+        <w:rPr>
+          <w:lang w:val="sr-Cyrl-RS"/>
+        </w:rPr>
+        <w:t xml:space="preserve"> архитектури за препознавање акција. Архитектура користи механизам самопажње за издвајање просторно-временских карактеристика за процену позе камере </w:t>
+      </w:r>
+      <w:r>
+        <w:rPr>
+          <w:lang w:val="sr-Cyrl-RS"/>
+        </w:rPr>
+        <w:t>[6]</w:t>
+      </w:r>
+      <w:r>
+        <w:rPr>
+          <w:lang w:val="sr-Cyrl-RS"/>
+        </w:rPr>
+        <w:t>.</w:t>
+      </w:r>
+    </w:p>
+    <w:p>
+      <w:pPr>
+        <w:pStyle w:val="0-"/>
+        <w:rPr>
+          <w:lang w:val="sr-Cyrl-RS"/>
+        </w:rPr>
+      </w:pPr>
+      <w:r>
+        <w:rPr>
+          <w:lang w:val="sr-Cyrl-RS"/>
+        </w:rPr>
+        <w:t>Улазни скуп се састоји</w:t>
+      </w:r>
+      <w:r>
+        <w:rPr>
+          <w:lang w:val="sr-Cyrl-RS"/>
+        </w:rPr>
+        <w:t xml:space="preserve"> од</w:t>
+      </w:r>
+      <w:r>
+        <w:rPr>
+          <w:lang w:val="sr-Cyrl-RS"/>
+        </w:rPr>
+        <w:t xml:space="preserve"> узастопних слика. Дели се на непреклапајуће регионе слике, који се претварају у токене и прослеђују као улази у Трансформер енкодер, који учи односе између карактеристика кроз време и простор. На крају, </w:t>
+      </w:r>
+      <w:r>
+        <w:rPr>
+          <w:lang w:val="sr-Cyrl-RS"/>
+        </w:rPr>
+        <w:t>MLP</w:t>
+      </w:r>
+      <w:r>
+        <w:rPr>
+          <w:lang w:val="sr-Cyrl-RS"/>
+        </w:rPr>
+        <w:t xml:space="preserve"> </w:t>
+      </w:r>
+      <w:r>
+        <w:rPr>
+          <w:lang w:val="sr-Cyrl-RS"/>
+        </w:rPr>
+        <w:t>(multilayer perceptron)</w:t>
+      </w:r>
+      <w:r>
+        <w:rPr>
+          <w:lang w:val="sr-Cyrl-RS"/>
+        </w:rPr>
+        <w:t xml:space="preserve"> излазни слој процењује релативну позу камере. С обзиром да су две узастопне слике потребне за процену једне позе, као излаз за скуп од</w:t>
+      </w:r>
+      <w:r>
+        <w:rPr>
+          <w:lang w:val="sr-Cyrl-RS"/>
+        </w:rPr>
+        <w:t xml:space="preserve"> </w:t>
+      </w:r>
+      <w:r>
+        <w:rPr>
+          <w:lang w:val="sr-Cyrl-RS"/>
+        </w:rPr>
+        <w:t>N</w:t>
+      </w:r>
+      <w:r>
+        <w:rPr>
+          <w:vertAlign w:val="subscript"/>
+          <w:lang w:val="en-US"/>
+        </w:rPr>
+        <w:t>f</w:t>
+      </w:r>
+      <w:r>
+        <w:rPr>
+          <w:lang w:val="sr-Cyrl-RS"/>
+        </w:rPr>
+        <w:t xml:space="preserve"> слика, добијамо </w:t>
+      </w:r>
+      <w:r>
+        <w:rPr>
+          <w:lang w:val="sr-Cyrl-RS"/>
+        </w:rPr>
+        <w:t>N</w:t>
+      </w:r>
+      <w:r>
+        <w:rPr>
+          <w:vertAlign w:val="subscript"/>
+          <w:lang w:val="en-US"/>
+        </w:rPr>
+        <w:t>f</w:t>
+      </w:r>
+      <w:r>
+        <w:rPr>
+          <w:lang w:val="en-US"/>
+        </w:rPr>
+        <w:t xml:space="preserve"> </w:t>
+      </w:r>
+      <w:r>
+        <w:rPr>
+          <w:lang w:val="sr-Cyrl-RS"/>
+        </w:rPr>
+        <w:t>-</w:t>
+      </w:r>
+      <w:r>
+        <w:rPr>
+          <w:lang w:val="en-US"/>
+        </w:rPr>
+        <w:t xml:space="preserve"> </w:t>
+      </w:r>
+      <w:r>
+        <w:rPr>
+          <w:lang w:val="sr-Cyrl-RS"/>
+        </w:rPr>
+        <w:t>1 поза камере</w:t>
+      </w:r>
+      <w:r>
+        <w:rPr>
+          <w:lang w:val="sr-Latn-RS"/>
+        </w:rPr>
+        <w:t xml:space="preserve"> </w:t>
+      </w:r>
+      <w:r>
+        <w:rPr>
+          <w:lang w:val="sr-Cyrl-RS"/>
+        </w:rPr>
+        <w:t>[6]</w:t>
+      </w:r>
+      <w:r>
+        <w:rPr>
+          <w:lang w:val="sr-Cyrl-RS"/>
+        </w:rPr>
+        <w:t xml:space="preserve">. </w:t>
+      </w:r>
+    </w:p>
+    <w:p>
+      <w:pPr>
+        <w:pStyle w:val="1-"/>
+        <w:rPr>
+          <w:lang w:val="sr-Cyrl-RS"/>
+        </w:rPr>
+      </w:pPr>
+      <w:r>
+        <w:rPr>
+          <w:lang w:val="sr-Cyrl-RS"/>
+        </w:rPr>
+        <w:t>Процес прикупљања података</w:t>
+      </w:r>
+    </w:p>
+    <w:p>
+      <w:pPr>
+        <w:pStyle w:val="0-"/>
+        <w:rPr>
+          <w:lang w:val="sr-Cyrl-RS"/>
+        </w:rPr>
+      </w:pPr>
+      <w:r>
+        <w:rPr>
+          <w:lang w:val="sr-Cyrl-RS"/>
+        </w:rPr>
+        <w:t xml:space="preserve">Како би се испитала примена ВО у мобилној роботици прикупљен је експериментални скуп података. Експерименталну поставку чине робот са диференцијалним погоном и круто постављеном камером, док се креће кроз различите </w:t>
+      </w:r>
+      <w:r>
+        <w:rPr>
+          <w:lang w:val="sr-Cyrl-RS"/>
+        </w:rPr>
+        <w:t>секвенце кретања у дефинисаном простору.</w:t>
+      </w:r>
+    </w:p>
+    <w:p>
+      <w:pPr>
+        <w:pStyle w:val="2-"/>
+      </w:pPr>
+      <w:r>
+        <w:rPr>
+          <w:lang w:val="sr-Cyrl-RS"/>
+        </w:rPr>
+        <w:t>Робот</w:t>
+      </w:r>
+    </w:p>
+    <w:p>
+      <w:pPr>
+        <w:pStyle w:val="0-"/>
+        <w:rPr>
+          <w:lang w:val="sr-Cyrl-RS"/>
+        </w:rPr>
+      </w:pPr>
+      <w:r>
+        <w:rPr>
+          <w:lang w:val="sr-Cyrl-RS"/>
+        </w:rPr>
+        <w:t xml:space="preserve">За прикупљање података коришћен је мобилни робот развијен у оквиру тима </w:t>
+      </w:r>
+      <w:r>
+        <w:rPr>
+          <w:lang w:val="en-US"/>
+        </w:rPr>
+        <w:t>+</w:t>
+      </w:r>
+      <w:r>
+        <w:rPr>
+          <w:lang w:val="sr-Latn-RS"/>
+        </w:rPr>
+        <w:t>381 Robotics</w:t>
+      </w:r>
+      <w:r>
+        <w:rPr>
+          <w:lang w:val="sr-Cyrl-RS"/>
+        </w:rPr>
+        <w:t xml:space="preserve"> за такмичење </w:t>
+      </w:r>
+      <w:r>
+        <w:rPr>
+          <w:lang w:val="sr-Cyrl-RS"/>
+        </w:rPr>
+        <w:t>Eurobot Srbija 2026</w:t>
+      </w:r>
+      <w:r>
+        <w:rPr>
+          <w:lang w:val="sr-Cyrl-RS"/>
+        </w:rPr>
+        <w:t>. У наставку су описане карактеристике робота које су релевантне за процес прикупљања података.</w:t>
+      </w:r>
+    </w:p>
+    <w:p>
+      <w:pPr>
+        <w:pStyle w:val="0-"/>
+        <w:rPr>
+          <w:lang w:val="sr-Cyrl-RS"/>
+        </w:rPr>
+      </w:pPr>
+      <w:r>
+        <w:rPr>
+          <w:lang w:val="sr-Cyrl-RS"/>
+        </w:rPr>
+        <w:t xml:space="preserve">Диференцијални погон се састоји од два независно актуисана саосна точка. Овакав тип погона има два степена слободе и уводи нехолономно ограничење: брзина базе у бочном правцу је увек 0. Три основна </w:t>
+      </w:r>
+      <w:r>
+        <w:rPr>
+          <w:lang w:val="sr-Cyrl-RS"/>
+        </w:rPr>
+        <w:lastRenderedPageBreak/>
+        <w:t>типа кретања за оваквог робота су: праволинијск</w:t>
+      </w:r>
+      <w:r>
+        <w:rPr>
+          <w:lang w:val="sr-Cyrl-RS"/>
+        </w:rPr>
+        <w:t>а</w:t>
+      </w:r>
+      <w:r>
+        <w:rPr>
+          <w:lang w:val="sr-Cyrl-RS"/>
+        </w:rPr>
+        <w:t xml:space="preserve"> </w:t>
+      </w:r>
+      <w:r>
+        <w:rPr>
+          <w:lang w:val="sr-Cyrl-RS"/>
+        </w:rPr>
+        <w:t>транслација</w:t>
+      </w:r>
+      <w:r>
+        <w:rPr>
+          <w:lang w:val="sr-Cyrl-RS"/>
+        </w:rPr>
+        <w:t>, ротација око центра робота, криволинијско кретање.</w:t>
+      </w:r>
+    </w:p>
+    <w:p>
+      <w:pPr>
+        <w:pStyle w:val="0-"/>
+        <w:rPr>
+          <w:lang w:val="sr-Cyrl-RS"/>
+        </w:rPr>
+      </w:pPr>
+      <w:r>
+        <w:rPr>
+          <w:lang w:val="sr-Cyrl-RS"/>
+        </w:rPr>
+        <w:t>Одометријски систем се састоји од инкременталних енкодера који су на пасивним точковима. Пасивни точкови су увек у контакту са подлогом. Овај систем је одвојен од погонског како би се избегао утицај проклизавања погонских точкова на стварање грешке у одометрији.</w:t>
+      </w:r>
+    </w:p>
+    <w:p>
+      <w:pPr>
+        <w:pStyle w:val="0-"/>
+        <w:rPr>
+          <w:lang w:val="sr-Cyrl-RS"/>
+        </w:rPr>
+      </w:pPr>
+      <w:r>
+        <w:rPr>
+          <w:lang w:val="sr-Cyrl-RS"/>
+        </w:rPr>
+        <w:t>Камера је круто везана за робота. Постављена је директно изнад локалног координатног система робота и оријентисана у правцу кретања робота. С обзиром да се робот креће у равни, оваква поставка омогућава да се прескочи корак рачунања трансформације камера-робот.</w:t>
+      </w:r>
+    </w:p>
+    <w:p>
+      <w:pPr>
+        <w:pStyle w:val="0-"/>
+        <w:rPr>
+          <w:lang w:val="sr-Cyrl-RS"/>
+        </w:rPr>
+      </w:pPr>
+      <w:r>
+        <w:rPr>
+          <w:lang w:val="sr-Cyrl-RS"/>
+        </w:rPr>
+        <w:t xml:space="preserve">На роботу је већ имплементиран </w:t>
+      </w:r>
+      <w:r>
+        <w:rPr>
+          <w:lang w:val="sr-Cyrl-RS"/>
+        </w:rPr>
+        <w:t>ROS2</w:t>
+      </w:r>
+      <w:r>
+        <w:rPr>
+          <w:lang w:val="sr-Cyrl-RS"/>
+        </w:rPr>
+        <w:t xml:space="preserve">, па је за снимање података коришћен </w:t>
+      </w:r>
+      <w:r>
+        <w:rPr>
+          <w:lang w:val="sr-Cyrl-RS"/>
+        </w:rPr>
+        <w:t>rosbag</w:t>
+      </w:r>
+      <w:r>
+        <w:rPr>
+          <w:lang w:val="sr-Cyrl-RS"/>
+        </w:rPr>
+        <w:t>. Топици који су снимани су:</w:t>
+      </w:r>
+    </w:p>
+    <w:p>
+      <w:pPr>
+        <w:pStyle w:val="0-"/>
+        <w:numPr>
+          <w:ilvl w:val="0"/>
+          <w:numId w:val="9"/>
+        </w:numPr>
+        <w:rPr>
+          <w:lang w:val="sr-Cyrl-RS"/>
+        </w:rPr>
+      </w:pPr>
+      <w:r>
+        <w:rPr>
+          <w:lang w:val="sr-Cyrl-RS"/>
+        </w:rPr>
+        <w:t>Одометрија са пасивних точкова, која је коришћена за процену референтних путања,</w:t>
+      </w:r>
+    </w:p>
+    <w:p>
+      <w:pPr>
+        <w:pStyle w:val="0-"/>
+        <w:numPr>
+          <w:ilvl w:val="0"/>
+          <w:numId w:val="9"/>
+        </w:numPr>
+        <w:rPr>
+          <w:lang w:val="sr-Cyrl-RS"/>
+        </w:rPr>
+      </w:pPr>
+      <w:r>
+        <w:rPr>
+          <w:lang w:val="sr-Cyrl-RS"/>
+        </w:rPr>
+        <w:t>Секвенца слика са камере,</w:t>
+      </w:r>
+    </w:p>
+    <w:p>
+      <w:pPr>
+        <w:pStyle w:val="0-"/>
+        <w:numPr>
+          <w:ilvl w:val="0"/>
+          <w:numId w:val="9"/>
+        </w:numPr>
+        <w:rPr>
+          <w:lang w:val="sr-Cyrl-RS"/>
+        </w:rPr>
+      </w:pPr>
+      <w:r>
+        <w:rPr>
+          <w:lang w:val="sr-Cyrl-RS"/>
+        </w:rPr>
+        <w:t>Топик са параметрима камере.</w:t>
+      </w:r>
+    </w:p>
+    <w:p>
+      <w:pPr>
+        <w:pStyle w:val="0-"/>
+        <w:rPr>
+          <w:lang w:val="en-US"/>
+        </w:rPr>
+      </w:pPr>
+      <w:r>
+        <w:rPr>
+          <w:lang w:val="sr-Cyrl-RS"/>
+        </w:rPr>
+        <w:t>На слици 1 је приказан робот са означеним погонским и одометријским системима, камером и локалним координатним системом.</w:t>
+      </w:r>
+    </w:p>
+    <w:p>
+      <w:pPr>
+        <w:pStyle w:val="0-"/>
+        <w:rPr>
+          <w:lang w:val="en-US"/>
+        </w:rPr>
+      </w:pPr>
+    </w:p>
+    <w:p>
+      <w:pPr>
+        <w:pStyle w:val="0-"/>
+        <w:rPr>
+          <w:lang w:val="en-US"/>
+        </w:rPr>
+      </w:pPr>
+      <w:r>
+        <w:rPr>
+          <w:lang w:val="en-US"/>
+        </w:rPr>
+        <w:t>TODO: slika 1</w:t>
+      </w:r>
+    </w:p>
+    <w:p>
+      <w:pPr>
+        <w:pStyle w:val="2-"/>
+      </w:pPr>
+      <w:r>
+        <w:rPr>
+          <w:lang w:val="sr-Cyrl-RS"/>
+        </w:rPr>
+        <w:t>Камера</w:t>
+      </w:r>
+    </w:p>
+    <w:p>
+      <w:pPr>
+        <w:pStyle w:val="0-"/>
+        <w:rPr>
+          <w:lang w:val="en-US"/>
+        </w:rPr>
+      </w:pPr>
+      <w:r>
+        <w:rPr>
+          <w:lang w:val="sr-Cyrl-RS"/>
+        </w:rPr>
+        <w:t xml:space="preserve">Коришћена је </w:t>
+      </w:r>
+      <w:r>
+        <w:rPr>
+          <w:lang w:val="sr-Cyrl-RS"/>
+        </w:rPr>
+        <w:t>OV9281 global-shutter</w:t>
+      </w:r>
+      <w:r>
+        <w:rPr>
+          <w:lang w:val="sr-Cyrl-RS"/>
+        </w:rPr>
+        <w:t xml:space="preserve"> </w:t>
+      </w:r>
+      <w:r>
+        <w:rPr>
+          <w:lang w:val="sr-Cyrl-RS"/>
+        </w:rPr>
+        <w:t>камера</w:t>
+      </w:r>
+      <w:r>
+        <w:rPr>
+          <w:lang w:val="sr-Cyrl-RS"/>
+        </w:rPr>
+        <w:t>. Овај тип камере хвата све пикселе слике у истом тренутку, током истог времена експозиције.</w:t>
+      </w:r>
+      <w:r>
+        <w:rPr>
+          <w:lang w:val="en-US"/>
+        </w:rPr>
+        <w:t xml:space="preserve"> R</w:t>
+      </w:r>
+      <w:r>
+        <w:rPr>
+          <w:lang w:val="sr-Cyrl-RS"/>
+        </w:rPr>
+        <w:t>olling-shutter</w:t>
+      </w:r>
+      <w:r>
+        <w:rPr>
+          <w:lang w:val="sr-Cyrl-RS"/>
+        </w:rPr>
+        <w:t xml:space="preserve"> камере секвенцијално снимају редове у слици, а експозиција почиње у различитим тренуцима, што може довести до дисторзије слике док се камера помера</w:t>
+      </w:r>
+      <w:r>
+        <w:t xml:space="preserve"> </w:t>
+      </w:r>
+      <w:r>
+        <w:rPr>
+          <w:lang w:val="sr-Cyrl-RS"/>
+        </w:rPr>
+        <w:t>[7]. OV928</w:t>
+      </w:r>
+      <w:r>
+        <w:rPr>
+          <w:lang w:val="sr-Cyrl-RS"/>
+        </w:rPr>
+        <w:t xml:space="preserve">1 камера снима црно-белу слику, резолуције </w:t>
+      </w:r>
+      <w:r>
+        <w:rPr>
+          <w:lang w:val="sr-Cyrl-RS"/>
+        </w:rPr>
+        <w:t>1280</w:t>
+      </w:r>
+      <w:r>
+        <w:rPr>
+          <w:rFonts w:cstheme="minorHAnsi"/>
+          <w:lang w:val="en-US"/>
+        </w:rPr>
+        <w:t>∙</w:t>
+      </w:r>
+      <w:r>
+        <w:rPr>
+          <w:lang w:val="sr-Cyrl-RS"/>
+        </w:rPr>
+        <w:t>720</w:t>
+      </w:r>
+      <w:r>
+        <w:rPr>
+          <w:lang w:val="sr-Cyrl-RS"/>
+        </w:rPr>
+        <w:t xml:space="preserve"> пиксела и брзином снимања од 120 слика по секунди. Калибрацијом камере су одређени унутрашњи параметри камере и коефицијенти дисторзије, који су дати у (2) и (3), респективно.</w:t>
+      </w:r>
+    </w:p>
+    <w:p>
+      <w:pPr>
+        <w:pStyle w:val="0-"/>
+        <w:rPr>
+          <w:lang w:val="en-US"/>
+        </w:rPr>
+      </w:pPr>
     </w:p>
     <w:tbl>
       <w:tblPr>
         <w:tblStyle w:val="TableGrid"/>
         <w:tblW w:w="0" w:type="auto"/>
-        <w:jc w:val="center"/>
+        <w:tblBorders>
+          <w:top w:val="none" w:sz="0" w:space="0" w:color="auto"/>
+          <w:left w:val="none" w:sz="0" w:space="0" w:color="auto"/>
+          <w:bottom w:val="none" w:sz="0" w:space="0" w:color="auto"/>
+          <w:right w:val="none" w:sz="0" w:space="0" w:color="auto"/>
+          <w:insideH w:val="none" w:sz="0" w:space="0" w:color="auto"/>
+          <w:insideV w:val="none" w:sz="0" w:space="0" w:color="auto"/>
+        </w:tblBorders>
         <w:tblLook w:val="04A0" w:firstRow="1" w:lastRow="0" w:firstColumn="1" w:lastColumn="0" w:noHBand="0" w:noVBand="1"/>
       </w:tblPr>
       <w:tblGrid>
-        <w:gridCol w:w="901"/>
-        <w:gridCol w:w="1880"/>
-        <w:gridCol w:w="1886"/>
+        <w:gridCol w:w="4025"/>
+        <w:gridCol w:w="652"/>
       </w:tblGrid>
       <w:tr>
         <w:trPr>
-          <w:jc w:val="center"/>
+          <w:trHeight w:val="651"/>
         </w:trPr>
         <w:tc>
           <w:tcPr>
-            <w:tcW w:w="933" w:type="dxa"/>
+            <w:tcW w:w="4011" w:type="dxa"/>
             <w:vAlign w:val="center"/>
           </w:tcPr>
           <w:p>
             <w:pPr>
-              <w:jc w:val="center"/>
+              <w:pStyle w:val="3-"/>
               <w:rPr>
-                <w:rFonts w:ascii="Times New Roman" w:eastAsia="Times New Roman" w:hAnsi="Times New Roman" w:cs="Times New Roman"/>
-                <w:iCs/>
-                <w:szCs w:val="20"/>
-                <w:lang w:val="sr-Latn-CS"/>
+                <w:rFonts w:ascii="Times New Roman" w:hAnsi="Times New Roman"/>
               </w:rPr>
             </w:pPr>
+            <m:oMathPara>
+              <m:oMathParaPr>
+                <m:jc m:val="center"/>
+              </m:oMathParaPr>
+              <m:oMath>
+                <m:d>
+                  <m:dPr>
+                    <m:begChr m:val="["/>
+                    <m:endChr m:val="]"/>
+                    <m:ctrlPr>
+                      <w:rPr>
+                        <w:rFonts w:cstheme="minorBidi"/>
+                        <w:iCs w:val="0"/>
+                        <w:szCs w:val="22"/>
+                      </w:rPr>
+                    </m:ctrlPr>
+                  </m:dPr>
+                  <m:e>
+                    <m:m>
+                      <m:mPr>
+                        <m:mcs>
+                          <m:mc>
+                            <m:mcPr>
+                              <m:count m:val="3"/>
+                              <m:mcJc m:val="center"/>
+                            </m:mcPr>
+                          </m:mc>
+                        </m:mcs>
+                        <m:ctrlPr>
+                          <w:rPr>
+                            <w:rFonts w:cstheme="minorBidi"/>
+                            <w:iCs w:val="0"/>
+                            <w:szCs w:val="22"/>
+                          </w:rPr>
+                        </m:ctrlPr>
+                      </m:mPr>
+                      <m:mr>
+                        <m:e>
+                          <m:r>
+                            <m:rPr>
+                              <m:sty m:val="p"/>
+                            </m:rPr>
+                            <m:t>1032.9</m:t>
+                          </m:r>
+                          <m:r>
+                            <m:rPr>
+                              <m:sty m:val="p"/>
+                            </m:rPr>
+                            <m:t>0</m:t>
+                          </m:r>
+                          <m:r>
+                            <w:rPr>
+                              <w:lang w:val="sr-Cyrl-RS"/>
+                            </w:rPr>
+                            <m:t>964</m:t>
+                          </m:r>
+                        </m:e>
+                        <m:e>
+                          <m:r>
+                            <m:rPr>
+                              <m:sty m:val="p"/>
+                            </m:rPr>
+                            <m:t>0</m:t>
+                          </m:r>
+                          <m:ctrlPr>
+                            <w:rPr>
+                              <w:rFonts w:eastAsia="Cambria Math" w:cs="Cambria Math"/>
+                              <w:i w:val="0"/>
+                              <w:szCs w:val="22"/>
+                            </w:rPr>
+                          </m:ctrlPr>
+                        </m:e>
+                        <m:e>
+                          <m:r>
+                            <m:rPr>
+                              <m:sty m:val="p"/>
+                            </m:rPr>
+                            <w:rPr>
+                              <w:rFonts w:eastAsia="Cambria Math" w:cs="Cambria Math"/>
+                            </w:rPr>
+                            <m:t>0</m:t>
+                          </m:r>
+                        </m:e>
+                      </m:mr>
+                      <m:mr>
+                        <m:e>
+                          <m:r>
+                            <m:rPr>
+                              <m:sty m:val="p"/>
+                            </m:rPr>
+                            <m:t>0</m:t>
+                          </m:r>
+                        </m:e>
+                        <m:e>
+                          <m:r>
+                            <m:rPr>
+                              <m:sty m:val="p"/>
+                            </m:rPr>
+                            <m:t>1032.44</m:t>
+                          </m:r>
+                          <m:r>
+                            <m:rPr>
+                              <m:sty m:val="p"/>
+                            </m:rPr>
+                            <m:t>1</m:t>
+                          </m:r>
+                          <m:r>
+                            <w:rPr>
+                              <w:lang w:val="sr-Cyrl-RS"/>
+                            </w:rPr>
+                            <m:t>52</m:t>
+                          </m:r>
+                          <m:ctrlPr>
+                            <w:rPr>
+                              <w:rFonts w:eastAsia="Cambria Math" w:cs="Cambria Math"/>
+                              <w:i w:val="0"/>
+                              <w:szCs w:val="22"/>
+                            </w:rPr>
+                          </m:ctrlPr>
+                        </m:e>
+                        <m:e>
+                          <m:r>
+                            <m:rPr>
+                              <m:sty m:val="p"/>
+                            </m:rPr>
+                            <w:rPr>
+                              <w:rFonts w:eastAsia="Cambria Math" w:cs="Cambria Math"/>
+                            </w:rPr>
+                            <m:t>0</m:t>
+                          </m:r>
+                          <m:ctrlPr>
+                            <w:rPr>
+                              <w:rFonts w:eastAsia="Cambria Math" w:cs="Cambria Math"/>
+                              <w:i w:val="0"/>
+                              <w:szCs w:val="22"/>
+                            </w:rPr>
+                          </m:ctrlPr>
+                        </m:e>
+                      </m:mr>
+                      <m:mr>
+                        <m:e>
+                          <m:r>
+                            <m:rPr>
+                              <m:sty m:val="p"/>
+                            </m:rPr>
+                            <m:t>681.51</m:t>
+                          </m:r>
+                          <m:r>
+                            <m:rPr>
+                              <m:sty m:val="p"/>
+                            </m:rPr>
+                            <m:t>3</m:t>
+                          </m:r>
+                          <m:r>
+                            <w:rPr>
+                              <w:lang w:val="sr-Cyrl-RS"/>
+                            </w:rPr>
+                            <m:t>61</m:t>
+                          </m:r>
+                          <m:ctrlPr>
+                            <w:rPr>
+                              <w:rFonts w:eastAsia="Cambria Math" w:cs="Cambria Math"/>
+                              <w:i w:val="0"/>
+                              <w:szCs w:val="22"/>
+                            </w:rPr>
+                          </m:ctrlPr>
+                        </m:e>
+                        <m:e>
+                          <m:r>
+                            <m:rPr>
+                              <m:sty m:val="p"/>
+                            </m:rPr>
+                            <m:t>317.8</m:t>
+                          </m:r>
+                          <m:r>
+                            <m:rPr>
+                              <m:sty m:val="p"/>
+                            </m:rPr>
+                            <m:t>5</m:t>
+                          </m:r>
+                          <m:r>
+                            <w:rPr>
+                              <w:lang w:val="sr-Cyrl-RS"/>
+                            </w:rPr>
+                            <m:t>746</m:t>
+                          </m:r>
+                          <m:ctrlPr>
+                            <w:rPr>
+                              <w:rFonts w:eastAsia="Cambria Math" w:cs="Cambria Math"/>
+                              <w:i w:val="0"/>
+                              <w:szCs w:val="22"/>
+                            </w:rPr>
+                          </m:ctrlPr>
+                        </m:e>
+                        <m:e>
+                          <m:r>
+                            <m:rPr>
+                              <m:sty m:val="p"/>
+                            </m:rPr>
+                            <w:rPr>
+                              <w:rFonts w:eastAsia="Cambria Math" w:cs="Cambria Math"/>
+                            </w:rPr>
+                            <m:t>1</m:t>
+                          </m:r>
+                        </m:e>
+                      </m:mr>
+                    </m:m>
+                  </m:e>
+                </m:d>
+              </m:oMath>
+            </m:oMathPara>
           </w:p>
         </w:tc>
         <w:tc>
           <w:tcPr>
-            <w:tcW w:w="1914" w:type="dxa"/>
+            <w:tcW w:w="664" w:type="dxa"/>
             <w:vAlign w:val="center"/>
           </w:tcPr>
           <w:p>
             <w:pPr>
-              <w:jc w:val="center"/>
-              <w:rPr>
-                <w:rFonts w:ascii="Times New Roman" w:eastAsia="Times New Roman" w:hAnsi="Times New Roman" w:cs="Times New Roman"/>
-                <w:iCs/>
-                <w:szCs w:val="20"/>
-              </w:rPr>
-            </w:pPr>
-            <w:r>
-              <w:rPr>
-                <w:rFonts w:ascii="Times New Roman" w:eastAsia="Times New Roman" w:hAnsi="Times New Roman" w:cs="Times New Roman"/>
-                <w:iCs/>
-                <w:szCs w:val="20"/>
-              </w:rPr>
-              <w:t>Линеарни</w:t>
-            </w:r>
-          </w:p>
-        </w:tc>
-        <w:tc>
-          <w:tcPr>
-            <w:tcW w:w="1914" w:type="dxa"/>
-            <w:vAlign w:val="center"/>
-          </w:tcPr>
-          <w:p>
-            <w:pPr>
-              <w:jc w:val="center"/>
-              <w:rPr>
-                <w:rFonts w:ascii="Times New Roman" w:eastAsia="Times New Roman" w:hAnsi="Times New Roman" w:cs="Times New Roman"/>
-                <w:iCs/>
-                <w:szCs w:val="20"/>
-              </w:rPr>
-            </w:pPr>
-            <w:r>
-              <w:rPr>
-                <w:rFonts w:ascii="Times New Roman" w:eastAsia="Times New Roman" w:hAnsi="Times New Roman" w:cs="Times New Roman"/>
-                <w:iCs/>
-                <w:szCs w:val="20"/>
-              </w:rPr>
-              <w:t>Нелинеарни</w:t>
-            </w:r>
-          </w:p>
-        </w:tc>
-      </w:tr>
-      <w:tr>
-        <w:trPr>
-          <w:cantSplit/>
-          <w:trHeight w:val="1134"/>
-          <w:jc w:val="center"/>
-        </w:trPr>
-        <w:tc>
-          <w:tcPr>
-            <w:tcW w:w="933" w:type="dxa"/>
-            <w:textDirection w:val="btLr"/>
-            <w:vAlign w:val="center"/>
-          </w:tcPr>
-          <w:p>
-            <w:pPr>
-              <w:jc w:val="center"/>
-              <w:rPr>
-                <w:rFonts w:ascii="Times New Roman" w:eastAsia="Times New Roman" w:hAnsi="Times New Roman" w:cs="Times New Roman"/>
-                <w:iCs/>
-                <w:szCs w:val="20"/>
-              </w:rPr>
-            </w:pPr>
-            <w:r>
-              <w:rPr>
-                <w:rFonts w:ascii="Times New Roman" w:eastAsia="Times New Roman" w:hAnsi="Times New Roman" w:cs="Times New Roman"/>
-                <w:iCs/>
-                <w:szCs w:val="20"/>
-              </w:rPr>
-              <w:t>Без меморије</w:t>
-            </w:r>
-          </w:p>
-        </w:tc>
-        <w:tc>
-          <w:tcPr>
-            <w:tcW w:w="1914" w:type="dxa"/>
-            <w:vAlign w:val="center"/>
-          </w:tcPr>
-          <w:p>
-            <w:pPr>
-              <w:jc w:val="center"/>
-              <w:rPr>
-                <w:rFonts w:ascii="Times New Roman" w:eastAsia="Times New Roman" w:hAnsi="Times New Roman" w:cs="Times New Roman"/>
-                <w:iCs/>
-                <w:szCs w:val="20"/>
-              </w:rPr>
-            </w:pPr>
-            <w:r>
-              <w:rPr>
-                <w:rFonts w:ascii="Times New Roman" w:eastAsia="Times New Roman" w:hAnsi="Times New Roman" w:cs="Times New Roman"/>
-                <w:iCs/>
-                <w:szCs w:val="20"/>
-              </w:rPr>
-              <w:t>Појачавачи</w:t>
-            </w:r>
-          </w:p>
-        </w:tc>
-        <w:tc>
-          <w:tcPr>
-            <w:tcW w:w="1914" w:type="dxa"/>
-            <w:vAlign w:val="center"/>
-          </w:tcPr>
-          <w:p>
-            <w:pPr>
-              <w:jc w:val="center"/>
-              <w:rPr>
-                <w:rFonts w:ascii="Times New Roman" w:eastAsia="Times New Roman" w:hAnsi="Times New Roman" w:cs="Times New Roman"/>
-                <w:iCs/>
-                <w:szCs w:val="20"/>
-              </w:rPr>
-            </w:pPr>
-            <w:r>
-              <w:rPr>
-                <w:rFonts w:ascii="Times New Roman" w:eastAsia="Times New Roman" w:hAnsi="Times New Roman" w:cs="Times New Roman"/>
-                <w:iCs/>
-                <w:szCs w:val="20"/>
-              </w:rPr>
-              <w:t>Нелинарни системи</w:t>
-            </w:r>
-          </w:p>
-        </w:tc>
-      </w:tr>
-      <w:tr>
-        <w:trPr>
-          <w:cantSplit/>
-          <w:trHeight w:val="1494"/>
-          <w:jc w:val="center"/>
-        </w:trPr>
-        <w:tc>
-          <w:tcPr>
-            <w:tcW w:w="933" w:type="dxa"/>
-            <w:textDirection w:val="btLr"/>
-            <w:vAlign w:val="center"/>
-          </w:tcPr>
-          <w:p>
-            <w:pPr>
-              <w:jc w:val="center"/>
-              <w:rPr>
-                <w:rFonts w:ascii="Times New Roman" w:eastAsia="Times New Roman" w:hAnsi="Times New Roman" w:cs="Times New Roman"/>
-                <w:iCs/>
-                <w:szCs w:val="20"/>
-              </w:rPr>
-            </w:pPr>
-            <w:r>
-              <w:rPr>
-                <w:rFonts w:ascii="Times New Roman" w:eastAsia="Times New Roman" w:hAnsi="Times New Roman" w:cs="Times New Roman"/>
-                <w:iCs/>
-                <w:szCs w:val="20"/>
-              </w:rPr>
-              <w:t>Са меморијом</w:t>
-            </w:r>
-          </w:p>
-        </w:tc>
-        <w:tc>
-          <w:tcPr>
-            <w:tcW w:w="1914" w:type="dxa"/>
-            <w:vAlign w:val="center"/>
-          </w:tcPr>
-          <w:p>
-            <w:pPr>
-              <w:jc w:val="center"/>
-              <w:rPr>
-                <w:rFonts w:ascii="Times New Roman" w:eastAsia="Times New Roman" w:hAnsi="Times New Roman" w:cs="Times New Roman"/>
-                <w:iCs/>
-                <w:szCs w:val="20"/>
-              </w:rPr>
-            </w:pPr>
-            <w:r>
-              <w:rPr>
-                <w:rFonts w:ascii="Times New Roman" w:eastAsia="Times New Roman" w:hAnsi="Times New Roman" w:cs="Times New Roman"/>
-                <w:iCs/>
-                <w:szCs w:val="20"/>
-              </w:rPr>
-              <w:t>Филтри</w:t>
-            </w:r>
-            <w:r>
-              <w:rPr>
-                <w:rFonts w:ascii="Times New Roman" w:eastAsia="Times New Roman" w:hAnsi="Times New Roman" w:cs="Times New Roman"/>
-                <w:iCs/>
-                <w:szCs w:val="20"/>
-              </w:rPr>
-              <w:t xml:space="preserve"> [2]</w:t>
-            </w:r>
-          </w:p>
-        </w:tc>
-        <w:tc>
-          <w:tcPr>
-            <w:tcW w:w="1914" w:type="dxa"/>
-            <w:vAlign w:val="center"/>
-          </w:tcPr>
-          <w:p>
-            <w:pPr>
-              <w:jc w:val="center"/>
+              <w:ind w:firstLine="0"/>
+              <w:jc w:val="right"/>
               <w:rPr>
                 <w:rFonts w:ascii="Times New Roman" w:eastAsia="Times New Roman" w:hAnsi="Times New Roman" w:cs="Times New Roman"/>
                 <w:iCs/>
@@ -2235,7 +2935,211 @@
                 <w:iCs/>
                 <w:szCs w:val="20"/>
               </w:rPr>
-              <w:t>не разматрамо их</w:t>
+              <w:t>(</w:t>
+            </w:r>
+            <w:r>
+              <w:rPr>
+                <w:rFonts w:ascii="Times New Roman" w:eastAsia="Times New Roman" w:hAnsi="Times New Roman" w:cs="Times New Roman"/>
+                <w:iCs/>
+                <w:szCs w:val="20"/>
+              </w:rPr>
+              <w:t>2</w:t>
+            </w:r>
+            <w:r>
+              <w:rPr>
+                <w:rFonts w:ascii="Times New Roman" w:eastAsia="Times New Roman" w:hAnsi="Times New Roman" w:cs="Times New Roman"/>
+                <w:iCs/>
+                <w:szCs w:val="20"/>
+              </w:rPr>
+              <w:t>)</w:t>
+            </w:r>
+          </w:p>
+        </w:tc>
+      </w:tr>
+      <w:tr>
+        <w:trPr>
+          <w:trHeight w:val="809"/>
+        </w:trPr>
+        <w:tc>
+          <w:tcPr>
+            <w:tcW w:w="4011" w:type="dxa"/>
+            <w:vAlign w:val="center"/>
+          </w:tcPr>
+          <w:p>
+            <w:pPr>
+              <w:pStyle w:val="3-"/>
+              <w:ind w:firstLine="0"/>
+              <w:rPr>
+                <w:rFonts w:ascii="Times New Roman" w:hAnsi="Times New Roman"/>
+                <w:i w:val="0"/>
+                <w:iCs w:val="0"/>
+                <w:szCs w:val="22"/>
+              </w:rPr>
+            </w:pPr>
+          </w:p>
+          <w:p>
+            <w:pPr>
+              <w:pStyle w:val="0-"/>
+              <w:rPr>
+                <w:lang w:val="en-US"/>
+              </w:rPr>
+            </w:pPr>
+            <m:oMathPara>
+              <m:oMath>
+                <m:d>
+                  <m:dPr>
+                    <m:begChr m:val="["/>
+                    <m:endChr m:val="]"/>
+                    <m:ctrlPr>
+                      <w:rPr>
+                        <w:rFonts w:ascii="Cambria Math" w:hAnsi="Cambria Math"/>
+                        <w:i/>
+                        <w:lang w:val="en-US"/>
+                      </w:rPr>
+                    </m:ctrlPr>
+                  </m:dPr>
+                  <m:e>
+                    <m:m>
+                      <m:mPr>
+                        <m:baseJc m:val="bottom"/>
+                        <m:mcs>
+                          <m:mc>
+                            <m:mcPr>
+                              <m:count m:val="5"/>
+                              <m:mcJc m:val="center"/>
+                            </m:mcPr>
+                          </m:mc>
+                        </m:mcs>
+                        <m:ctrlPr>
+                          <w:rPr>
+                            <w:rFonts w:ascii="Cambria Math" w:hAnsi="Cambria Math"/>
+                            <w:i/>
+                            <w:lang w:val="en-US"/>
+                          </w:rPr>
+                        </m:ctrlPr>
+                      </m:mPr>
+                      <m:mr>
+                        <m:e>
+                          <m:r>
+                            <w:rPr>
+                              <w:rFonts w:ascii="Cambria Math" w:hAnsi="Cambria Math"/>
+                              <w:lang w:val="en-US"/>
+                            </w:rPr>
+                            <m:t>-0.002</m:t>
+                          </m:r>
+                        </m:e>
+                        <m:e>
+                          <m:r>
+                            <w:rPr>
+                              <w:rFonts w:ascii="Cambria Math" w:hAnsi="Cambria Math"/>
+                              <w:lang w:val="en-US"/>
+                            </w:rPr>
+                            <m:t>0.073</m:t>
+                          </m:r>
+                          <m:ctrlPr>
+                            <w:rPr>
+                              <w:rFonts w:ascii="Cambria Math" w:eastAsia="Cambria Math" w:hAnsi="Cambria Math" w:cs="Cambria Math"/>
+                              <w:i/>
+                              <w:lang w:val="en-US"/>
+                            </w:rPr>
+                          </m:ctrlPr>
+                        </m:e>
+                        <m:e>
+                          <m:r>
+                            <w:rPr>
+                              <w:rFonts w:ascii="Cambria Math" w:eastAsia="Cambria Math" w:hAnsi="Cambria Math" w:cs="Cambria Math"/>
+                              <w:lang w:val="en-US"/>
+                            </w:rPr>
+                            <m:t>-0.005</m:t>
+                          </m:r>
+                          <m:ctrlPr>
+                            <w:rPr>
+                              <w:rFonts w:ascii="Cambria Math" w:eastAsia="Cambria Math" w:hAnsi="Cambria Math" w:cs="Cambria Math"/>
+                              <w:i/>
+                              <w:lang w:val="en-US"/>
+                            </w:rPr>
+                          </m:ctrlPr>
+                        </m:e>
+                        <m:e>
+                          <m:r>
+                            <w:rPr>
+                              <w:rFonts w:ascii="Cambria Math" w:eastAsia="Cambria Math" w:hAnsi="Cambria Math" w:cs="Cambria Math"/>
+                              <w:lang w:val="en-US"/>
+                            </w:rPr>
+                            <m:t>0.002</m:t>
+                          </m:r>
+                          <m:ctrlPr>
+                            <w:rPr>
+                              <w:rFonts w:ascii="Cambria Math" w:eastAsia="Cambria Math" w:hAnsi="Cambria Math" w:cs="Cambria Math"/>
+                              <w:i/>
+                              <w:lang w:val="en-US"/>
+                            </w:rPr>
+                          </m:ctrlPr>
+                        </m:e>
+                        <m:e>
+                          <m:r>
+                            <w:rPr>
+                              <w:rFonts w:ascii="Cambria Math" w:eastAsia="Cambria Math" w:hAnsi="Cambria Math" w:cs="Cambria Math"/>
+                              <w:lang w:val="en-US"/>
+                            </w:rPr>
+                            <m:t>-0.129</m:t>
+                          </m:r>
+                        </m:e>
+                      </m:mr>
+                    </m:m>
+                  </m:e>
+                </m:d>
+              </m:oMath>
+            </m:oMathPara>
+          </w:p>
+          <w:p>
+            <w:pPr>
+              <w:pStyle w:val="3-"/>
+              <w:rPr>
+                <w:rFonts w:ascii="Times New Roman" w:hAnsi="Times New Roman"/>
+              </w:rPr>
+            </w:pPr>
+          </w:p>
+        </w:tc>
+        <w:tc>
+          <w:tcPr>
+            <w:tcW w:w="664" w:type="dxa"/>
+            <w:vAlign w:val="center"/>
+          </w:tcPr>
+          <w:p>
+            <w:pPr>
+              <w:ind w:firstLine="0"/>
+              <w:jc w:val="right"/>
+              <w:rPr>
+                <w:rFonts w:ascii="Times New Roman" w:eastAsia="Times New Roman" w:hAnsi="Times New Roman" w:cs="Times New Roman"/>
+                <w:iCs/>
+                <w:szCs w:val="20"/>
+                <w:lang w:val="sr-Cyrl-RS"/>
+              </w:rPr>
+            </w:pPr>
+            <w:r>
+              <w:rPr>
+                <w:rFonts w:ascii="Times New Roman" w:eastAsia="Times New Roman" w:hAnsi="Times New Roman" w:cs="Times New Roman"/>
+                <w:iCs/>
+                <w:szCs w:val="20"/>
+              </w:rPr>
+              <w:t>(</w:t>
+            </w:r>
+            <w:r>
+              <w:rPr>
+                <w:rFonts w:ascii="Times New Roman" w:eastAsia="Times New Roman" w:hAnsi="Times New Roman" w:cs="Times New Roman"/>
+                <w:iCs/>
+                <w:szCs w:val="20"/>
+              </w:rPr>
+              <w:t>3</w:t>
+            </w:r>
+            <w:r>
+              <w:rPr>
+                <w:rFonts w:ascii="Times New Roman" w:eastAsia="Times New Roman" w:hAnsi="Times New Roman" w:cs="Times New Roman"/>
+                <w:iCs/>
+                <w:szCs w:val="20"/>
+              </w:rPr>
+              <w:t>)</w:t>
             </w:r>
           </w:p>
         </w:tc>
@@ -2243,121 +3147,375 @@
     </w:tbl>
     <w:p>
       <w:pPr>
-        <w:keepNext/>
-        <w:ind w:firstLine="0"/>
-        <w:jc w:val="center"/>
-      </w:pPr>
-      <w:r>
-        <w:rPr>
-          <w:rFonts w:ascii="Times New Roman" w:eastAsia="Times New Roman" w:hAnsi="Times New Roman" w:cs="Times New Roman"/>
-          <w:i/>
-          <w:iCs/>
-          <w:noProof/>
-          <w:szCs w:val="20"/>
+        <w:pStyle w:val="0-"/>
+        <w:rPr>
+          <w:lang w:val="sr-Cyrl-RS"/>
+        </w:rPr>
+      </w:pPr>
+      <w:r>
+        <w:rPr>
+          <w:lang w:val="sr-Cyrl-RS"/>
+        </w:rPr>
+        <w:t xml:space="preserve">Веома важан параметар камере за ВО је време експозиције. Он представља време током којег се прикупља светлост за једну слику. Дуже време омогућава да се више светлости прикупи и да слика буде светлија. </w:t>
+      </w:r>
+      <w:r>
+        <w:rPr>
+          <w:lang w:val="sr-Cyrl-RS"/>
+        </w:rPr>
+        <w:t>Међутим</w:t>
+      </w:r>
+      <w:r>
+        <w:rPr>
+          <w:lang w:val="sr-Cyrl-RS"/>
+        </w:rPr>
+        <w:t>, дуже време представља проблем док се камера креће. Са повећањем времена експозиције, израженије је замућивање</w:t>
+      </w:r>
+      <w:r>
+        <w:rPr>
+          <w:lang w:val="sr-Cyrl-RS"/>
+        </w:rPr>
+        <w:t xml:space="preserve"> (motion blur)</w:t>
+      </w:r>
+      <w:r>
+        <w:rPr>
+          <w:lang w:val="sr-Cyrl-RS"/>
+        </w:rPr>
+        <w:t xml:space="preserve">. За ВО је потребна оштра слика са довољно светла. У прикупљеном сету података је коришћено кратко време експозиције, од 1,5 </w:t>
+      </w:r>
+      <w:r>
+        <w:rPr>
           <w:lang w:val="en-US"/>
         </w:rPr>
-        <w:drawing>
-          <wp:inline distT="0" distB="0" distL="0" distR="0" wp14:anchorId="5EFB1C5F" wp14:editId="627C49B1">
-            <wp:extent cx="2218414" cy="1310087"/>
-            <wp:effectExtent l="19050" t="19050" r="10795" b="23495"/>
-            <wp:docPr id="4" name="Picture 4"/>
-            <wp:cNvGraphicFramePr>
-              <a:graphicFrameLocks xmlns:a="http://schemas.openxmlformats.org/drawingml/2006/main" noChangeAspect="1"/>
-            </wp:cNvGraphicFramePr>
-            <a:graphic xmlns:a="http://schemas.openxmlformats.org/drawingml/2006/main">
-              <a:graphicData uri="http://schemas.openxmlformats.org/drawingml/2006/picture">
-                <pic:pic xmlns:pic="http://schemas.openxmlformats.org/drawingml/2006/picture">
-                  <pic:nvPicPr>
-                    <pic:cNvPr id="0" name="Picture 12"/>
-                    <pic:cNvPicPr>
-                      <a:picLocks noChangeAspect="1" noChangeArrowheads="1"/>
-                    </pic:cNvPicPr>
-                  </pic:nvPicPr>
-                  <pic:blipFill>
-                    <a:blip r:embed="rId14" cstate="print">
-                      <a:extLst>
-                        <a:ext uri="{28A0092B-C50C-407E-A947-70E740481C1C}">
-                          <a14:useLocalDpi xmlns:a14="http://schemas.microsoft.com/office/drawing/2010/main" val="0"/>
-                        </a:ext>
-                      </a:extLst>
-                    </a:blip>
-                    <a:srcRect/>
-                    <a:stretch>
-                      <a:fillRect/>
-                    </a:stretch>
-                  </pic:blipFill>
-                  <pic:spPr bwMode="auto">
-                    <a:xfrm>
-                      <a:off x="0" y="0"/>
-                      <a:ext cx="2213647" cy="1307272"/>
-                    </a:xfrm>
-                    <a:prstGeom prst="rect">
-                      <a:avLst/>
-                    </a:prstGeom>
-                    <a:noFill/>
-                    <a:ln w="6350" cmpd="sng">
-                      <a:solidFill>
-                        <a:srgbClr val="000000"/>
-                      </a:solidFill>
-                      <a:miter lim="800000"/>
-                      <a:headEnd/>
-                      <a:tailEnd/>
-                    </a:ln>
-                    <a:effectLst/>
-                  </pic:spPr>
-                </pic:pic>
-              </a:graphicData>
-            </a:graphic>
-          </wp:inline>
-        </w:drawing>
-      </w:r>
-    </w:p>
-    <w:p>
-      <w:pPr>
-        <w:pStyle w:val="Caption"/>
-        <w:rPr>
-          <w:rFonts w:ascii="Times New Roman" w:eastAsia="Times New Roman" w:hAnsi="Times New Roman" w:cs="Times New Roman"/>
-          <w:iCs/>
-          <w:szCs w:val="20"/>
-          <w:lang w:val="sr-Cyrl-RS"/>
-        </w:rPr>
-      </w:pPr>
-      <w:r>
-        <w:t xml:space="preserve">Слика </w:t>
-      </w:r>
-      <w:r>
-        <w:fldChar w:fldCharType="begin"/>
-      </w:r>
-      <w:r>
-        <w:instrText xml:space="preserve"> SEQ Слика \* ARABIC </w:instrText>
-      </w:r>
-      <w:r>
-        <w:fldChar w:fldCharType="separate"/>
-      </w:r>
-      <w:r>
-        <w:rPr>
-          <w:noProof/>
+        <w:t>ms</w:t>
+      </w:r>
+      <w:r>
+        <w:rPr>
+          <w:lang w:val="sr-Cyrl-RS"/>
+        </w:rPr>
+        <w:t>, док су контраст и гама подешени на вредности 32 и 200, како би се компензовала недовољно осветљена слика.</w:t>
+      </w:r>
+    </w:p>
+    <w:p>
+      <w:pPr>
+        <w:pStyle w:val="0-"/>
+        <w:rPr>
+          <w:lang w:val="sr-Cyrl-RS"/>
+        </w:rPr>
+      </w:pPr>
+    </w:p>
+    <w:p>
+      <w:pPr>
+        <w:pStyle w:val="2-"/>
+      </w:pPr>
+      <w:r>
+        <w:rPr>
+          <w:lang w:val="sr-Cyrl-RS"/>
+        </w:rPr>
+        <w:t>Секвенце</w:t>
+      </w:r>
+    </w:p>
+    <w:p>
+      <w:pPr>
+        <w:pStyle w:val="0-"/>
+        <w:rPr>
+          <w:lang w:val="sr-Cyrl-RS"/>
+        </w:rPr>
+      </w:pPr>
+      <w:r>
+        <w:rPr>
+          <w:lang w:val="sr-Cyrl-RS"/>
+        </w:rPr>
+        <w:t>Робот се креће по столу за такмичење</w:t>
+      </w:r>
+      <w:r>
+        <w:rPr>
+          <w:lang w:val="sr-Cyrl-RS"/>
+        </w:rPr>
+        <w:t xml:space="preserve"> Eurobot 2026</w:t>
+      </w:r>
+      <w:r>
+        <w:rPr>
+          <w:lang w:val="sr-Cyrl-RS"/>
+        </w:rPr>
+        <w:t>. Димензије стола су тачно дефинисане и коришћене су за компензацију грешке одометрије са пасивних точкова. Тако коригована одометрија са точкова је коришћена као референтна путања.</w:t>
+      </w:r>
+    </w:p>
+    <w:p>
+      <w:pPr>
+        <w:pStyle w:val="0-"/>
+        <w:rPr>
+          <w:lang w:val="sr-Cyrl-RS"/>
+        </w:rPr>
+      </w:pPr>
+      <w:r>
+        <w:rPr>
+          <w:lang w:val="sr-Cyrl-RS"/>
+        </w:rPr>
+        <w:t xml:space="preserve">Снимљене су две различите секвенце кретања. Обе секвенце су снимљене са два сета максималних брзина (максимална линеарна и угаона брзина). Максималне брзине при споријим секвенцама су 0,5 </w:t>
+      </w:r>
+      <m:oMath>
+        <m:f>
+          <m:fPr>
+            <m:type m:val="skw"/>
+            <m:ctrlPr>
+              <w:rPr>
+                <w:rFonts w:ascii="Cambria Math" w:hAnsi="Cambria Math"/>
+                <w:i/>
+                <w:lang w:val="sr-Cyrl-RS"/>
+              </w:rPr>
+            </m:ctrlPr>
+          </m:fPr>
+          <m:num>
+            <m:r>
+              <w:rPr>
+                <w:rFonts w:ascii="Cambria Math" w:hAnsi="Cambria Math"/>
+                <w:lang w:val="en-US"/>
+              </w:rPr>
+              <m:t>m</m:t>
+            </m:r>
+          </m:num>
+          <m:den>
+            <m:r>
+              <w:rPr>
+                <w:rFonts w:ascii="Cambria Math" w:hAnsi="Cambria Math"/>
+                <w:lang w:val="sr-Cyrl-RS"/>
+              </w:rPr>
+              <m:t>s</m:t>
+            </m:r>
+          </m:den>
+        </m:f>
+      </m:oMath>
+      <w:r>
+        <w:rPr>
+          <w:lang w:val="en-US"/>
+        </w:rPr>
+        <w:t xml:space="preserve"> </w:t>
+      </w:r>
+      <w:r>
+        <w:rPr>
+          <w:lang w:val="sr-Cyrl-RS"/>
+        </w:rPr>
+        <w:t xml:space="preserve">и </w:t>
+      </w:r>
+      <w:r>
+        <w:rPr>
+          <w:lang w:val="sr-Cyrl-RS"/>
+        </w:rPr>
+        <w:t xml:space="preserve"> </w:t>
+      </w:r>
+      <m:oMath>
+        <m:f>
+          <m:fPr>
+            <m:type m:val="skw"/>
+            <m:ctrlPr>
+              <w:rPr>
+                <w:rFonts w:ascii="Cambria Math" w:hAnsi="Cambria Math"/>
+                <w:i/>
+                <w:lang w:val="sr-Cyrl-RS"/>
+              </w:rPr>
+            </m:ctrlPr>
+          </m:fPr>
+          <m:num>
+            <m:r>
+              <w:rPr>
+                <w:rFonts w:ascii="Cambria Math" w:hAnsi="Cambria Math"/>
+                <w:lang w:val="en-US"/>
+              </w:rPr>
+              <m:t>π</m:t>
+            </m:r>
+          </m:num>
+          <m:den>
+            <m:r>
+              <w:rPr>
+                <w:rFonts w:ascii="Cambria Math" w:hAnsi="Cambria Math"/>
+                <w:lang w:val="sr-Cyrl-RS"/>
+              </w:rPr>
+              <m:t>2</m:t>
+            </m:r>
+          </m:den>
+        </m:f>
+        <m:r>
+          <m:rPr>
+            <m:sty m:val="p"/>
+          </m:rPr>
+          <w:rPr>
+            <w:rFonts w:ascii="Cambria Math" w:hAnsi="Cambria Math"/>
+            <w:lang w:val="sr-Cyrl-RS"/>
+          </w:rPr>
+          <m:t xml:space="preserve"> </m:t>
+        </m:r>
+        <m:f>
+          <m:fPr>
+            <m:type m:val="skw"/>
+            <m:ctrlPr>
+              <w:rPr>
+                <w:rFonts w:ascii="Cambria Math" w:hAnsi="Cambria Math"/>
+                <w:i/>
+                <w:lang w:val="sr-Cyrl-RS"/>
+              </w:rPr>
+            </m:ctrlPr>
+          </m:fPr>
+          <m:num>
+            <m:r>
+              <w:rPr>
+                <w:rFonts w:ascii="Cambria Math" w:hAnsi="Cambria Math"/>
+                <w:lang w:val="en-US"/>
+              </w:rPr>
+              <m:t>rad</m:t>
+            </m:r>
+          </m:num>
+          <m:den>
+            <m:r>
+              <w:rPr>
+                <w:rFonts w:ascii="Cambria Math" w:hAnsi="Cambria Math"/>
+                <w:lang w:val="sr-Cyrl-RS"/>
+              </w:rPr>
+              <m:t>s</m:t>
+            </m:r>
+          </m:den>
+        </m:f>
+      </m:oMath>
+      <w:r>
+        <w:rPr>
+          <w:lang w:val="sr-Cyrl-RS"/>
+        </w:rPr>
+        <w:t>, док су при бржим 1</w:t>
+      </w:r>
+      <w:r>
+        <w:rPr>
+          <w:lang w:val="sr-Cyrl-RS"/>
+        </w:rPr>
+        <w:t xml:space="preserve"> </w:t>
+      </w:r>
+      <m:oMath>
+        <m:f>
+          <m:fPr>
+            <m:type m:val="skw"/>
+            <m:ctrlPr>
+              <w:rPr>
+                <w:rFonts w:ascii="Cambria Math" w:hAnsi="Cambria Math"/>
+                <w:i/>
+                <w:lang w:val="sr-Cyrl-RS"/>
+              </w:rPr>
+            </m:ctrlPr>
+          </m:fPr>
+          <m:num>
+            <m:r>
+              <w:rPr>
+                <w:rFonts w:ascii="Cambria Math" w:hAnsi="Cambria Math"/>
+                <w:lang w:val="en-US"/>
+              </w:rPr>
+              <m:t>m</m:t>
+            </m:r>
+          </m:num>
+          <m:den>
+            <m:r>
+              <w:rPr>
+                <w:rFonts w:ascii="Cambria Math" w:hAnsi="Cambria Math"/>
+                <w:lang w:val="sr-Cyrl-RS"/>
+              </w:rPr>
+              <m:t>s</m:t>
+            </m:r>
+          </m:den>
+        </m:f>
+      </m:oMath>
+      <w:r>
+        <w:rPr>
+          <w:lang w:val="en-US"/>
+        </w:rPr>
+        <w:t xml:space="preserve"> </w:t>
+      </w:r>
+      <w:r>
+        <w:rPr>
+          <w:lang w:val="sr-Cyrl-RS"/>
+        </w:rPr>
+        <w:t xml:space="preserve">и  </w:t>
+      </w:r>
+      <m:oMath>
+        <m:r>
+          <w:rPr>
+            <w:rFonts w:ascii="Cambria Math" w:hAnsi="Cambria Math"/>
+            <w:lang w:val="en-US"/>
+          </w:rPr>
+          <m:t>π</m:t>
+        </m:r>
+        <m:r>
+          <m:rPr>
+            <m:sty m:val="p"/>
+          </m:rPr>
+          <w:rPr>
+            <w:rFonts w:ascii="Cambria Math" w:hAnsi="Cambria Math"/>
+            <w:lang w:val="sr-Cyrl-RS"/>
+          </w:rPr>
+          <m:t xml:space="preserve"> </m:t>
+        </m:r>
+        <m:f>
+          <m:fPr>
+            <m:type m:val="skw"/>
+            <m:ctrlPr>
+              <w:rPr>
+                <w:rFonts w:ascii="Cambria Math" w:hAnsi="Cambria Math"/>
+                <w:i/>
+                <w:lang w:val="sr-Cyrl-RS"/>
+              </w:rPr>
+            </m:ctrlPr>
+          </m:fPr>
+          <m:num>
+            <m:r>
+              <w:rPr>
+                <w:rFonts w:ascii="Cambria Math" w:hAnsi="Cambria Math"/>
+                <w:lang w:val="en-US"/>
+              </w:rPr>
+              <m:t>rad</m:t>
+            </m:r>
+          </m:num>
+          <m:den>
+            <m:r>
+              <w:rPr>
+                <w:rFonts w:ascii="Cambria Math" w:hAnsi="Cambria Math"/>
+                <w:lang w:val="sr-Cyrl-RS"/>
+              </w:rPr>
+              <m:t>s</m:t>
+            </m:r>
+          </m:den>
+        </m:f>
+      </m:oMath>
+      <w:r>
+        <w:rPr>
+          <w:lang w:val="sr-Cyrl-RS"/>
+        </w:rPr>
+        <w:t>. Прва секвенца се састоји искључиво од праволинијских транслација и ротације око центра робота. Друга секвенца се састоји и од криволинијских кретања. Оваква подела секвенци је изабрана како би се испитао утицај брзине кретања, као и различитих типова кретања робота на успешност ВО. На слици 2 су приказане референтне путање у секвенцама.</w:t>
+      </w:r>
+    </w:p>
+    <w:p>
+      <w:pPr>
+        <w:pStyle w:val="0-"/>
+        <w:rPr>
+          <w:lang w:val="sr-Cyrl-RS"/>
+        </w:rPr>
+      </w:pPr>
+      <w:r>
+        <w:rPr>
+          <w:lang w:val="en-US"/>
+        </w:rPr>
+        <w:t xml:space="preserve">TODO: slika </w:t>
+      </w:r>
+      <w:r>
+        <w:rPr>
+          <w:lang w:val="sr-Cyrl-RS"/>
         </w:rPr>
         <w:t>2</w:t>
       </w:r>
-      <w:r>
-        <w:rPr>
-          <w:noProof/>
-        </w:rPr>
-        <w:fldChar w:fldCharType="end"/>
-      </w:r>
-      <w:r>
-        <w:rPr>
-          <w:lang w:val="sr-Cyrl-RS"/>
-        </w:rPr>
-        <w:t>. Исти пример слике са мањим димензијама</w:t>
-      </w:r>
-      <w:r>
-        <w:rPr>
-          <w:rFonts w:eastAsia="Times New Roman"/>
-          <w:lang w:val="sr-Latn-CS"/>
-        </w:rPr>
-        <w:t xml:space="preserve"> [3]</w:t>
+    </w:p>
+    <w:p>
+      <w:pPr>
+        <w:pStyle w:val="1-"/>
+      </w:pPr>
+      <w:r>
+        <w:rPr>
+          <w:lang w:val="sr-Cyrl-RS"/>
+        </w:rPr>
+        <w:t>Резултати</w:t>
       </w:r>
     </w:p>
     <w:p>
@@ -2368,253 +3526,316 @@
         </w:rPr>
       </w:pPr>
       <w:r>
-        <w:t xml:space="preserve">На крају рада даје се кратка биографија аутора (фонт величине 9) и </w:t>
-      </w:r>
-      <w:r>
-        <w:rPr>
-          <w:lang w:val="sr-Cyrl-RS"/>
-        </w:rPr>
-        <w:t xml:space="preserve">пожељно </w:t>
-      </w:r>
-      <w:r>
-        <w:t>прилаже слика.</w:t>
+        <w:rPr>
+          <w:lang w:val="sr-Cyrl-RS"/>
+        </w:rPr>
+        <w:t xml:space="preserve">Успешност алгоритама ВО је процењена поређењем процењених и референтних </w:t>
+      </w:r>
+      <w:r>
+        <w:rPr>
+          <w:lang w:val="sr-Cyrl-RS"/>
+        </w:rPr>
+        <w:t>путања. Коришћени критеријуми:</w:t>
       </w:r>
     </w:p>
     <w:p>
       <w:pPr>
         <w:pStyle w:val="0-"/>
+        <w:numPr>
+          <w:ilvl w:val="0"/>
+          <w:numId w:val="10"/>
+        </w:numPr>
+        <w:rPr>
+          <w:lang w:val="sr-Cyrl-RS"/>
+        </w:rPr>
+      </w:pPr>
+      <w:r>
+        <w:rPr>
+          <w:lang w:val="sr-Cyrl-RS"/>
+        </w:rPr>
+        <w:t>Просечна транслациона грешка,</w:t>
+      </w:r>
+    </w:p>
+    <w:p>
+      <w:pPr>
+        <w:pStyle w:val="0-"/>
+        <w:numPr>
+          <w:ilvl w:val="0"/>
+          <w:numId w:val="10"/>
+        </w:numPr>
+        <w:rPr>
+          <w:lang w:val="sr-Cyrl-RS"/>
+        </w:rPr>
+      </w:pPr>
+      <w:r>
+        <w:rPr>
+          <w:lang w:val="sr-Cyrl-RS"/>
+        </w:rPr>
+        <w:t>Просечна ротациона грешка,</w:t>
+      </w:r>
+    </w:p>
+    <w:p>
+      <w:pPr>
+        <w:pStyle w:val="0-"/>
+        <w:numPr>
+          <w:ilvl w:val="0"/>
+          <w:numId w:val="10"/>
+        </w:numPr>
+        <w:rPr>
+          <w:lang w:val="sr-Cyrl-RS"/>
+        </w:rPr>
+      </w:pPr>
+      <w:r>
+        <w:rPr>
+          <w:lang w:val="sr-Cyrl-RS"/>
+        </w:rPr>
+        <w:t xml:space="preserve">Апсолутна грешка трајекторије </w:t>
+      </w:r>
+      <w:r>
+        <w:rPr>
+          <w:lang w:val="sr-Cyrl-RS"/>
+        </w:rPr>
+        <w:t>(ATE)</w:t>
+      </w:r>
+      <w:r>
+        <w:rPr>
+          <w:lang w:val="sr-Cyrl-RS"/>
+        </w:rPr>
+        <w:t>,</w:t>
+      </w:r>
+    </w:p>
+    <w:p>
+      <w:pPr>
+        <w:pStyle w:val="0-"/>
+        <w:numPr>
+          <w:ilvl w:val="0"/>
+          <w:numId w:val="10"/>
+        </w:numPr>
+        <w:rPr>
+          <w:lang w:val="sr-Cyrl-RS"/>
+        </w:rPr>
+      </w:pPr>
+      <w:r>
+        <w:rPr>
+          <w:lang w:val="sr-Cyrl-RS"/>
+        </w:rPr>
+        <w:t xml:space="preserve">Релативна грешка позе </w:t>
+      </w:r>
+      <w:r>
+        <w:rPr>
+          <w:lang w:val="sr-Cyrl-RS"/>
+        </w:rPr>
+        <w:t>(RPE)</w:t>
+      </w:r>
+      <w:r>
+        <w:rPr>
+          <w:lang w:val="sr-Cyrl-RS"/>
+        </w:rPr>
+        <w:t>, транслациона и ротациона</w:t>
+      </w:r>
+    </w:p>
+    <w:p>
+      <w:pPr>
+        <w:pStyle w:val="0-"/>
+        <w:rPr>
+          <w:lang w:val="sr-Cyrl-RS"/>
+        </w:rPr>
+      </w:pPr>
+      <w:r>
+        <w:rPr>
+          <w:lang w:val="sr-Cyrl-RS"/>
+        </w:rPr>
+        <w:t xml:space="preserve">Резултати су приказани у табели 1. На слици 3 су приказане процењене и референтне путање за све секвенце кретања. Код </w:t>
+      </w:r>
+      <w:r>
+        <w:rPr>
+          <w:lang w:val="sr-Cyrl-RS"/>
+        </w:rPr>
+        <w:t>SVO</w:t>
+      </w:r>
+      <w:r>
+        <w:rPr>
+          <w:lang w:val="sr-Cyrl-RS"/>
+        </w:rPr>
+        <w:t xml:space="preserve">, при секвенци 2 са већим максималним брзинама је дошло до једног губитка праћења при ротацији око центра робота. Код </w:t>
+      </w:r>
+      <w:r>
+        <w:rPr>
+          <w:lang w:val="sr-Cyrl-RS"/>
+        </w:rPr>
+        <w:t>ORB-SLAM3</w:t>
+      </w:r>
+      <w:r>
+        <w:rPr>
+          <w:lang w:val="sr-Cyrl-RS"/>
+        </w:rPr>
+        <w:t xml:space="preserve"> је долазило до губитка праћења на крају сваке ротације око центра робота, због чега су за поједине секвенце приказани само најдужи делови путање између два губитка праћења.</w:t>
+      </w:r>
+    </w:p>
+    <w:p>
+      <w:pPr>
+        <w:pStyle w:val="0-"/>
+        <w:rPr>
+          <w:lang w:val="sr-Cyrl-RS"/>
+        </w:rPr>
+      </w:pPr>
+      <w:r>
         <w:rPr>
           <w:lang w:val="en-US"/>
         </w:rPr>
-      </w:pPr>
-      <w:r>
-        <w:rPr>
-          <w:lang w:val="sr-Cyrl-RS"/>
-        </w:rPr>
-        <w:t>И</w:t>
-      </w:r>
-      <w:r>
-        <w:rPr>
-          <w:lang w:val="sr-Cyrl-RS"/>
-        </w:rPr>
-        <w:t>збегавати колико је могуће линкове на веб странице као референце.</w:t>
-      </w:r>
-      <w:r>
-        <w:rPr>
-          <w:lang w:val="sr-Cyrl-RS"/>
-        </w:rPr>
+        <w:t xml:space="preserve">TODO: </w:t>
+      </w:r>
+      <w:r>
+        <w:rPr>
+          <w:lang w:val="en-US"/>
+        </w:rPr>
+        <w:t>tabela 1</w:t>
+      </w:r>
+    </w:p>
+    <w:p>
+      <w:pPr>
+        <w:pStyle w:val="0-"/>
+        <w:rPr>
+          <w:lang w:val="en-US"/>
+        </w:rPr>
+      </w:pPr>
+      <w:r>
+        <w:rPr>
+          <w:lang w:val="en-US"/>
+        </w:rPr>
+        <w:t xml:space="preserve">TODO: slika </w:t>
+      </w:r>
+      <w:r>
+        <w:rPr>
+          <w:lang w:val="sr-Cyrl-RS"/>
+        </w:rPr>
+        <w:t>3</w:t>
+      </w:r>
+    </w:p>
+    <w:p>
+      <w:pPr>
+        <w:pStyle w:val="0-"/>
+        <w:rPr>
+          <w:lang w:val="sr-Cyrl-RS"/>
+        </w:rPr>
+      </w:pPr>
+    </w:p>
+    <w:p>
+      <w:pPr>
+        <w:pStyle w:val="1-"/>
+      </w:pPr>
+      <w:r>
+        <w:t>ЛИТЕРАТУРА</w:t>
+      </w:r>
+    </w:p>
+    <w:p>
+      <w:pPr>
+        <w:pStyle w:val="a0"/>
+      </w:pPr>
+      <w:r>
+        <w:t>TODO: zameni linkove i tekst</w:t>
+      </w:r>
+    </w:p>
+    <w:p>
+      <w:pPr>
+        <w:pStyle w:val="a0"/>
+      </w:pPr>
+      <w:r>
+        <w:t>[1]</w:t>
+      </w:r>
+      <w:r>
         <w:t xml:space="preserve"> </w:t>
       </w:r>
-    </w:p>
-    <w:p>
-      <w:pPr>
-        <w:pStyle w:val="0-"/>
-        <w:rPr>
-          <w:lang w:val="sr-Cyrl-RS"/>
-        </w:rPr>
-      </w:pPr>
-      <w:r>
-        <w:rPr>
-          <w:lang w:val="sr-Cyrl-RS"/>
-        </w:rPr>
-        <w:t>Ли</w:t>
-      </w:r>
-      <w:r>
-        <w:rPr>
-          <w:lang w:val="sr-Cyrl-RS"/>
-        </w:rPr>
-        <w:t>те</w:t>
-      </w:r>
-      <w:r>
-        <w:rPr>
-          <w:lang w:val="sr-Cyrl-RS"/>
-        </w:rPr>
-        <w:t>ратура која садржи доминантно такве линкове, посебно на веб странице непровереног научног и/или стручног садржаја је неприхватљива.</w:t>
-      </w:r>
-    </w:p>
-    <w:p>
-      <w:pPr>
-        <w:pStyle w:val="0-"/>
-      </w:pPr>
-      <w:r>
-        <w:t xml:space="preserve">За </w:t>
-      </w:r>
-      <w:r>
-        <w:t>квалитет</w:t>
-      </w:r>
-      <w:r>
-        <w:t xml:space="preserve"> и веродостојност резултата одговорни су ментор и аутори. </w:t>
-      </w:r>
-    </w:p>
-    <w:p>
-      <w:pPr>
-        <w:pStyle w:val="0-"/>
-      </w:pPr>
+      <w:r>
+        <w:t>https://www.alaakhamis.org/teaching/SPC418/reading/Visual%20odometry.pdf</w:t>
+      </w:r>
+    </w:p>
+    <w:p>
+      <w:pPr>
+        <w:pStyle w:val="a0"/>
+      </w:pPr>
+      <w:r>
+        <w:t>[2]</w:t>
+      </w:r>
+      <w:r>
+        <w:t xml:space="preserve"> </w:t>
+      </w:r>
+      <w:r>
+        <w:t>https://journals.sagepub.com/doi/10.5772/62099</w:t>
+      </w:r>
+    </w:p>
+    <w:p>
+      <w:pPr>
+        <w:pStyle w:val="a0"/>
+      </w:pPr>
+      <w:r>
+        <w:t xml:space="preserve">[3] </w:t>
+      </w:r>
+      <w:hyperlink r:id="rId9" w:history="1">
+        <w:r>
+          <w:rPr>
+            <w:rStyle w:val="Hyperlink"/>
+          </w:rPr>
+          <w:t>https://academic.oup.com/tse/article/1/3/177/5747766?login=false</w:t>
+        </w:r>
+      </w:hyperlink>
+    </w:p>
+    <w:p>
+      <w:pPr>
+        <w:pStyle w:val="a0"/>
+      </w:pPr>
+      <w:r>
+        <w:t>[4] SVO</w:t>
+      </w:r>
+    </w:p>
+    <w:p>
+      <w:pPr>
+        <w:pStyle w:val="a0"/>
+      </w:pPr>
+      <w:r>
+        <w:t>[5] ORB-SLAM3</w:t>
+      </w:r>
+    </w:p>
+    <w:p>
+      <w:pPr>
+        <w:pStyle w:val="a0"/>
+      </w:pPr>
+      <w:r>
+        <w:t>[6]</w:t>
+      </w:r>
+      <w:r>
+        <w:t xml:space="preserve"> </w:t>
+      </w:r>
+      <w:r>
+        <w:t>TSformer-VO</w:t>
+      </w:r>
+    </w:p>
+    <w:p>
+      <w:pPr>
+        <w:pStyle w:val="a0"/>
+      </w:pPr>
+      <w:r>
+        <w:t xml:space="preserve">[7] </w:t>
+      </w:r>
+      <w:r>
+        <w:t>https://openaccess.thecvf.com/content_ECCV_2018/p</w:t>
+      </w:r>
       <w:r>
         <w:lastRenderedPageBreak/>
-        <w:t xml:space="preserve">Референцирање литературе ради се према IEEE Citation Style [3,4]. Радови треба да буду побројани на крају рада, треба да буду означени (нумерисани бројевима) у углатој загради, по редоследу референцирања, као у овом упутству, односно као у [3]. На месту референцирања, бројеви у загради треба да буду уписани унутар реченице [3] или на крају реченице [2,3,4] или као [2-4]. Ако се број ставља на крају реченице, мора да буде уписан унутар реченице [4]. Дакле, никако. [4] </w:t>
-      </w:r>
-    </w:p>
-    <w:p>
-      <w:pPr>
-        <w:pStyle w:val="0-"/>
-      </w:pPr>
-      <w:r>
-        <w:t xml:space="preserve">Такође, заграда са бројем мора да буде одвојена од текста [2] а никако[2]. </w:t>
-      </w:r>
-    </w:p>
-    <w:p>
-      <w:pPr>
-        <w:pStyle w:val="0-"/>
-      </w:pPr>
-      <w:r>
-        <w:t>Исто правило о цитирању важи и за све слике које су преузете из литературе, као нпр. у називу слика 1. и 2.</w:t>
-      </w:r>
-    </w:p>
-    <w:p>
-      <w:pPr>
-        <w:pStyle w:val="0-"/>
-      </w:pPr>
-      <w:r>
-        <w:t>Сва литература наведена на крају текста мора да буде цити</w:t>
-      </w:r>
-      <w:r>
-        <w:softHyphen/>
-        <w:t>рана. Не треба копирати цео списак литературе из мастер рада, ако се само неки од тих наслова цитирају у овом раду.</w:t>
-      </w:r>
-    </w:p>
-    <w:p>
-      <w:pPr>
-        <w:pStyle w:val="1-"/>
-        <w:rPr>
-          <w:lang w:val="sr-Cyrl-RS"/>
-        </w:rPr>
-      </w:pPr>
-      <w:r>
-        <w:t>ЗАКЉУЧАК</w:t>
-      </w:r>
-    </w:p>
-    <w:p>
-      <w:pPr>
-        <w:pStyle w:val="0-"/>
-      </w:pPr>
-      <w:r>
-        <w:t>Драги Аутори (</w:t>
-      </w:r>
-      <w:r>
-        <w:t>М</w:t>
-      </w:r>
-      <w:r>
-        <w:t xml:space="preserve">астеранти) и Ментори, у заједничком је интересу да поштујемо наведена упутства како би читав поступак прихватања рада у Зборнику, одбрана мастер рада, објављивање рада и дипломирање било </w:t>
-      </w:r>
-      <w:r>
-        <w:t xml:space="preserve">урађено </w:t>
-      </w:r>
-      <w:r>
-        <w:t xml:space="preserve">правовремено и делотворно. </w:t>
-      </w:r>
-    </w:p>
-    <w:p>
-      <w:pPr>
-        <w:pStyle w:val="0-"/>
-        <w:rPr>
-          <w:lang w:val="sr-Cyrl-RS"/>
-        </w:rPr>
-      </w:pPr>
-      <w:r>
-        <w:t xml:space="preserve">Радујемо се успешној сарадњи и </w:t>
-      </w:r>
-      <w:r>
-        <w:t xml:space="preserve">новим мастер </w:t>
-      </w:r>
-      <w:r>
-        <w:t>дипломама.</w:t>
-      </w:r>
-    </w:p>
-    <w:p>
-      <w:pPr>
-        <w:pStyle w:val="1-"/>
-      </w:pPr>
-      <w:r>
-        <w:t>ЛИТЕРАТУРА</w:t>
+        <w:t>apers/David_Schubert_Direct_Sparse_Odometry_ECCV_2018_paper.pdf</w:t>
       </w:r>
     </w:p>
     <w:p>
       <w:pPr>
         <w:pStyle w:val="a0"/>
       </w:pPr>
-      <w:r>
-        <w:t>[1]</w:t>
-      </w:r>
-      <w:r>
-        <w:t xml:space="preserve"> </w:t>
-      </w:r>
-      <w:r>
-        <w:t>V.I.</w:t>
-      </w:r>
-      <w:r>
-        <w:t xml:space="preserve"> </w:t>
-      </w:r>
-      <w:r>
-        <w:t xml:space="preserve">Utkin, “Variable structure control systems with sliding modes”, </w:t>
-      </w:r>
-      <w:r>
-        <w:rPr>
-          <w:i/>
-        </w:rPr>
-        <w:t>IEEE Trans. Automat. Control</w:t>
-      </w:r>
-      <w:r>
-        <w:t>, Vol. AC-22, pp. 210-222, April 1977.</w:t>
-      </w:r>
     </w:p>
     <w:p>
       <w:pPr>
         <w:pStyle w:val="a0"/>
       </w:pPr>
       <w:r>
-        <w:t>[2]</w:t>
-      </w:r>
-      <w:r>
-        <w:t xml:space="preserve"> </w:t>
-      </w:r>
-      <w:r>
-        <w:t>A.E.</w:t>
-      </w:r>
-      <w:r>
-        <w:t xml:space="preserve"> </w:t>
-      </w:r>
-      <w:r>
-        <w:t>Bryson, Y.C.</w:t>
-      </w:r>
-      <w:r>
-        <w:t xml:space="preserve"> </w:t>
-      </w:r>
-      <w:r>
-        <w:t xml:space="preserve">Ho, </w:t>
-      </w:r>
-      <w:r>
-        <w:rPr>
-          <w:i/>
-        </w:rPr>
-        <w:t>“Applied Optimal Control”</w:t>
-      </w:r>
-      <w:r>
-        <w:t>, New York, Wiley, 1975.</w:t>
-      </w:r>
-    </w:p>
-    <w:p>
-      <w:pPr>
-        <w:pStyle w:val="a0"/>
-      </w:pPr>
-      <w:r>
-        <w:t xml:space="preserve">[3] </w:t>
-      </w:r>
-      <w:r>
-        <w:t>http://pitt.libguides.com/citationhelp/ieee</w:t>
-      </w:r>
-      <w:r>
-        <w:t xml:space="preserve"> (pristupljeno u martu 2018.)</w:t>
+        <w:t>TODO:</w:t>
       </w:r>
     </w:p>
     <w:p>
@@ -2911,7 +4132,7 @@
             <w:r>
               <w:t xml:space="preserve"> </w:t>
             </w:r>
-            <w:hyperlink r:id="rId15" w:history="1">
+            <w:hyperlink r:id="rId10" w:history="1">
               <w:r>
                 <w:rPr>
                   <w:rStyle w:val="Hyperlink"/>
@@ -2972,57 +4193,8 @@
 </w:document>
 </file>
 
-<file path=word/comments.xml><?xml version="1.0" encoding="utf-8"?>
-<w:comments xmlns:wpc="http://schemas.microsoft.com/office/word/2010/wordprocessingCanvas" xmlns:cx="http://schemas.microsoft.com/office/drawing/2014/chartex" xmlns:cx1="http://schemas.microsoft.com/office/drawing/2015/9/8/chartex" xmlns:cx2="http://schemas.microsoft.com/office/drawing/2015/10/21/chartex" xmlns:cx3="http://schemas.microsoft.com/office/drawing/2016/5/9/chartex" xmlns:cx4="http://schemas.microsoft.com/office/drawing/2016/5/10/chartex" xmlns:cx5="http://schemas.microsoft.com/office/drawing/2016/5/11/chartex" xmlns:cx6="http://schemas.microsoft.com/office/drawing/2016/5/12/chartex" xmlns:cx7="http://schemas.microsoft.com/office/drawing/2016/5/13/chartex" xmlns:cx8="http://schemas.microsoft.com/office/drawing/2016/5/14/chartex" xmlns:mc="http://schemas.openxmlformats.org/markup-compatibility/2006" xmlns:aink="http://schemas.microsoft.com/office/drawing/2016/ink" xmlns:am3d="http://schemas.microsoft.com/office/drawing/2017/model3d" xmlns:o="urn:schemas-microsoft-com:office:office" xmlns:oel="http://schemas.microsoft.com/office/2019/extlst" xmlns:r="http://schemas.openxmlformats.org/officeDocument/2006/relationships" xmlns:m="http://schemas.openxmlformats.org/officeDocument/2006/math" xmlns:v="urn:schemas-microsoft-com:vml" xmlns:wp14="http://schemas.microsoft.com/office/word/2010/wordprocessingDrawing" xmlns:wp="http://schemas.openxmlformats.org/drawingml/2006/wordprocessingDrawing" xmlns:w10="urn:schemas-microsoft-com:office:word" xmlns:w="http://schemas.openxmlformats.org/wordprocessingml/2006/main" xmlns:w14="http://schemas.microsoft.com/office/word/2010/wordml" xmlns:w15="http://schemas.microsoft.com/office/word/2012/wordml" xmlns:w16cex="http://schemas.microsoft.com/office/word/2018/wordml/cex" xmlns:w16cid="http://schemas.microsoft.com/office/word/2016/wordml/cid" xmlns:w16="http://schemas.microsoft.com/office/word/2018/wordml" xmlns:w16du="http://schemas.microsoft.com/office/word/2023/wordml/word16du" xmlns:w16sdtdh="http://schemas.microsoft.com/office/word/2020/wordml/sdtdatahash" xmlns:w16se="http://schemas.microsoft.com/office/word/2015/wordml/symex" xmlns:wpg="http://schemas.microsoft.com/office/word/2010/wordprocessingGroup" xmlns:wpi="http://schemas.microsoft.com/office/word/2010/wordprocessingInk" xmlns:wne="http://schemas.microsoft.com/office/word/2006/wordml" xmlns:wps="http://schemas.microsoft.com/office/word/2010/wordprocessingShape" mc:Ignorable="w14 w15 w16se w16cid w16 w16cex w16sdtdh w16du wp14">
-  <w:comment w:id="0" w:author="Marko Vekic" w:date="2025-10-02T18:29:00Z" w:initials="MV">
-    <w:p>
-      <w:pPr>
-        <w:pStyle w:val="CommentText"/>
-        <w:jc w:val="left"/>
-      </w:pPr>
-      <w:r>
-        <w:rPr>
-          <w:rStyle w:val="CommentReference"/>
-        </w:rPr>
-        <w:annotationRef/>
-      </w:r>
-      <w:r>
-        <w:rPr>
-          <w:lang w:val="ru-RU"/>
-        </w:rPr>
-        <w:t>У</w:t>
-      </w:r>
-      <w:r>
-        <w:rPr>
-          <w:lang w:val="sr-Cyrl-RS"/>
-        </w:rPr>
-        <w:t xml:space="preserve"> датом примеру није тако</w:t>
-      </w:r>
-    </w:p>
-  </w:comment>
-</w:comments>
-</file>
-
-<file path=word/commentsExtended.xml><?xml version="1.0" encoding="utf-8"?>
-<w15:commentsEx xmlns:wpc="http://schemas.microsoft.com/office/word/2010/wordprocessingCanvas" xmlns:cx="http://schemas.microsoft.com/office/drawing/2014/chartex" xmlns:cx1="http://schemas.microsoft.com/office/drawing/2015/9/8/chartex" xmlns:cx2="http://schemas.microsoft.com/office/drawing/2015/10/21/chartex" xmlns:cx3="http://schemas.microsoft.com/office/drawing/2016/5/9/chartex" xmlns:cx4="http://schemas.microsoft.com/office/drawing/2016/5/10/chartex" xmlns:cx5="http://schemas.microsoft.com/office/drawing/2016/5/11/chartex" xmlns:cx6="http://schemas.microsoft.com/office/drawing/2016/5/12/chartex" xmlns:cx7="http://schemas.microsoft.com/office/drawing/2016/5/13/chartex" xmlns:cx8="http://schemas.microsoft.com/office/drawing/2016/5/14/chartex" xmlns:mc="http://schemas.openxmlformats.org/markup-compatibility/2006" xmlns:aink="http://schemas.microsoft.com/office/drawing/2016/ink" xmlns:am3d="http://schemas.microsoft.com/office/drawing/2017/model3d" xmlns:o="urn:schemas-microsoft-com:office:office" xmlns:oel="http://schemas.microsoft.com/office/2019/extlst" xmlns:r="http://schemas.openxmlformats.org/officeDocument/2006/relationships" xmlns:m="http://schemas.openxmlformats.org/officeDocument/2006/math" xmlns:v="urn:schemas-microsoft-com:vml" xmlns:wp14="http://schemas.microsoft.com/office/word/2010/wordprocessingDrawing" xmlns:wp="http://schemas.openxmlformats.org/drawingml/2006/wordprocessingDrawing" xmlns:w10="urn:schemas-microsoft-com:office:word" xmlns:w="http://schemas.openxmlformats.org/wordprocessingml/2006/main" xmlns:w14="http://schemas.microsoft.com/office/word/2010/wordml" xmlns:w15="http://schemas.microsoft.com/office/word/2012/wordml" xmlns:w16cex="http://schemas.microsoft.com/office/word/2018/wordml/cex" xmlns:w16cid="http://schemas.microsoft.com/office/word/2016/wordml/cid" xmlns:w16="http://schemas.microsoft.com/office/word/2018/wordml" xmlns:w16du="http://schemas.microsoft.com/office/word/2023/wordml/word16du" xmlns:w16sdtdh="http://schemas.microsoft.com/office/word/2020/wordml/sdtdatahash" xmlns:w16se="http://schemas.microsoft.com/office/word/2015/wordml/symex" xmlns:wpg="http://schemas.microsoft.com/office/word/2010/wordprocessingGroup" xmlns:wpi="http://schemas.microsoft.com/office/word/2010/wordprocessingInk" xmlns:wne="http://schemas.microsoft.com/office/word/2006/wordml" xmlns:wps="http://schemas.microsoft.com/office/word/2010/wordprocessingShape" mc:Ignorable="w14 w15 w16se w16cid w16 w16cex w16sdtdh w16du wp14">
-  <w15:commentEx w15:paraId="607BA0D2" w15:done="1"/>
-</w15:commentsEx>
-</file>
-
-<file path=word/commentsExtensible.xml><?xml version="1.0" encoding="utf-8"?>
-<w16cex:commentsExtensible xmlns:wpc="http://schemas.microsoft.com/office/word/2010/wordprocessingCanvas" xmlns:cx="http://schemas.microsoft.com/office/drawing/2014/chartex" xmlns:cx1="http://schemas.microsoft.com/office/drawing/2015/9/8/chartex" xmlns:cx2="http://schemas.microsoft.com/office/drawing/2015/10/21/chartex" xmlns:cx3="http://schemas.microsoft.com/office/drawing/2016/5/9/chartex" xmlns:cx4="http://schemas.microsoft.com/office/drawing/2016/5/10/chartex" xmlns:cx5="http://schemas.microsoft.com/office/drawing/2016/5/11/chartex" xmlns:cx6="http://schemas.microsoft.com/office/drawing/2016/5/12/chartex" xmlns:cx7="http://schemas.microsoft.com/office/drawing/2016/5/13/chartex" xmlns:cx8="http://schemas.microsoft.com/office/drawing/2016/5/14/chartex" xmlns:cr="http://schemas.microsoft.com/office/comments/2020/reactions" xmlns:mc="http://schemas.openxmlformats.org/markup-compatibility/2006" xmlns:aink="http://schemas.microsoft.com/office/drawing/2016/ink" xmlns:am3d="http://schemas.microsoft.com/office/drawing/2017/model3d" xmlns:o="urn:schemas-microsoft-com:office:office" xmlns:oel="http://schemas.microsoft.com/office/2019/extlst" xmlns:r="http://schemas.openxmlformats.org/officeDocument/2006/relationships" xmlns:m="http://schemas.openxmlformats.org/officeDocument/2006/math" xmlns:v="urn:schemas-microsoft-com:vml" xmlns:wp14="http://schemas.microsoft.com/office/word/2010/wordprocessingDrawing" xmlns:wp="http://schemas.openxmlformats.org/drawingml/2006/wordprocessingDrawing" xmlns:w10="urn:schemas-microsoft-com:office:word" xmlns:w="http://schemas.openxmlformats.org/wordprocessingml/2006/main" xmlns:w14="http://schemas.microsoft.com/office/word/2010/wordml" xmlns:w15="http://schemas.microsoft.com/office/word/2012/wordml" xmlns:w16cex="http://schemas.microsoft.com/office/word/2018/wordml/cex" xmlns:w16cid="http://schemas.microsoft.com/office/word/2016/wordml/cid" xmlns:w16="http://schemas.microsoft.com/office/word/2018/wordml" xmlns:w16du="http://schemas.microsoft.com/office/word/2023/wordml/word16du" xmlns:w16sdtdh="http://schemas.microsoft.com/office/word/2020/wordml/sdtdatahash" xmlns:w16se="http://schemas.microsoft.com/office/word/2015/wordml/symex" xmlns:wpg="http://schemas.microsoft.com/office/word/2010/wordprocessingGroup" xmlns:wpi="http://schemas.microsoft.com/office/word/2010/wordprocessingInk" xmlns:wne="http://schemas.microsoft.com/office/word/2006/wordml" xmlns:wps="http://schemas.microsoft.com/office/word/2010/wordprocessingShape" mc:Ignorable="w14 w15 w16se w16cid w16 w16cex w16sdtdh cr w16du wp14">
-  <w16cex:commentExtensible w16cex:durableId="740AD695" w16cex:dateUtc="2025-10-02T16:29:00Z"/>
-</w16cex:commentsExtensible>
-</file>
-
-<file path=word/commentsIds.xml><?xml version="1.0" encoding="utf-8"?>
-<w16cid:commentsIds xmlns:wpc="http://schemas.microsoft.com/office/word/2010/wordprocessingCanvas" xmlns:cx="http://schemas.microsoft.com/office/drawing/2014/chartex" xmlns:cx1="http://schemas.microsoft.com/office/drawing/2015/9/8/chartex" xmlns:cx2="http://schemas.microsoft.com/office/drawing/2015/10/21/chartex" xmlns:cx3="http://schemas.microsoft.com/office/drawing/2016/5/9/chartex" xmlns:cx4="http://schemas.microsoft.com/office/drawing/2016/5/10/chartex" xmlns:cx5="http://schemas.microsoft.com/office/drawing/2016/5/11/chartex" xmlns:cx6="http://schemas.microsoft.com/office/drawing/2016/5/12/chartex" xmlns:cx7="http://schemas.microsoft.com/office/drawing/2016/5/13/chartex" xmlns:cx8="http://schemas.microsoft.com/office/drawing/2016/5/14/chartex" xmlns:mc="http://schemas.openxmlformats.org/markup-compatibility/2006" xmlns:aink="http://schemas.microsoft.com/office/drawing/2016/ink" xmlns:am3d="http://schemas.microsoft.com/office/drawing/2017/model3d" xmlns:o="urn:schemas-microsoft-com:office:office" xmlns:oel="http://schemas.microsoft.com/office/2019/extlst" xmlns:r="http://schemas.openxmlformats.org/officeDocument/2006/relationships" xmlns:m="http://schemas.openxmlformats.org/officeDocument/2006/math" xmlns:v="urn:schemas-microsoft-com:vml" xmlns:wp14="http://schemas.microsoft.com/office/word/2010/wordprocessingDrawing" xmlns:wp="http://schemas.openxmlformats.org/drawingml/2006/wordprocessingDrawing" xmlns:w10="urn:schemas-microsoft-com:office:word" xmlns:w="http://schemas.openxmlformats.org/wordprocessingml/2006/main" xmlns:w14="http://schemas.microsoft.com/office/word/2010/wordml" xmlns:w15="http://schemas.microsoft.com/office/word/2012/wordml" xmlns:w16cex="http://schemas.microsoft.com/office/word/2018/wordml/cex" xmlns:w16cid="http://schemas.microsoft.com/office/word/2016/wordml/cid" xmlns:w16="http://schemas.microsoft.com/office/word/2018/wordml" xmlns:w16du="http://schemas.microsoft.com/office/word/2023/wordml/word16du" xmlns:w16sdtdh="http://schemas.microsoft.com/office/word/2020/wordml/sdtdatahash" xmlns:w16se="http://schemas.microsoft.com/office/word/2015/wordml/symex" xmlns:wpg="http://schemas.microsoft.com/office/word/2010/wordprocessingGroup" xmlns:wpi="http://schemas.microsoft.com/office/word/2010/wordprocessingInk" xmlns:wne="http://schemas.microsoft.com/office/word/2006/wordml" xmlns:wps="http://schemas.microsoft.com/office/word/2010/wordprocessingShape" mc:Ignorable="w14 w15 w16se w16cid w16 w16cex w16sdtdh w16du wp14">
-  <w16cid:commentId w16cid:paraId="607BA0D2" w16cid:durableId="740AD695"/>
-</w16cid:commentsIds>
-</file>
-
 <file path=word/endnotes.xml><?xml version="1.0" encoding="utf-8"?>
-<w:endnotes xmlns:wpc="http://schemas.microsoft.com/office/word/2010/wordprocessingCanvas" xmlns:cx="http://schemas.microsoft.com/office/drawing/2014/chartex" xmlns:cx1="http://schemas.microsoft.com/office/drawing/2015/9/8/chartex" xmlns:cx2="http://schemas.microsoft.com/office/drawing/2015/10/21/chartex" xmlns:cx3="http://schemas.microsoft.com/office/drawing/2016/5/9/chartex" xmlns:cx4="http://schemas.microsoft.com/office/drawing/2016/5/10/chartex" xmlns:cx5="http://schemas.microsoft.com/office/drawing/2016/5/11/chartex" xmlns:cx6="http://schemas.microsoft.com/office/drawing/2016/5/12/chartex" xmlns:cx7="http://schemas.microsoft.com/office/drawing/2016/5/13/chartex" xmlns:cx8="http://schemas.microsoft.com/office/drawing/2016/5/14/chartex" xmlns:mc="http://schemas.openxmlformats.org/markup-compatibility/2006" xmlns:aink="http://schemas.microsoft.com/office/drawing/2016/ink" xmlns:am3d="http://schemas.microsoft.com/office/drawing/2017/model3d" xmlns:o="urn:schemas-microsoft-com:office:office" xmlns:oel="http://schemas.microsoft.com/office/2019/extlst" xmlns:r="http://schemas.openxmlformats.org/officeDocument/2006/relationships" xmlns:m="http://schemas.openxmlformats.org/officeDocument/2006/math" xmlns:v="urn:schemas-microsoft-com:vml" xmlns:wp14="http://schemas.microsoft.com/office/word/2010/wordprocessingDrawing" xmlns:wp="http://schemas.openxmlformats.org/drawingml/2006/wordprocessingDrawing" xmlns:w10="urn:schemas-microsoft-com:office:word" xmlns:w="http://schemas.openxmlformats.org/wordprocessingml/2006/main" xmlns:w14="http://schemas.microsoft.com/office/word/2010/wordml" xmlns:w15="http://schemas.microsoft.com/office/word/2012/wordml" xmlns:w16cex="http://schemas.microsoft.com/office/word/2018/wordml/cex" xmlns:w16cid="http://schemas.microsoft.com/office/word/2016/wordml/cid" xmlns:w16="http://schemas.microsoft.com/office/word/2018/wordml" xmlns:w16du="http://schemas.microsoft.com/office/word/2023/wordml/word16du" xmlns:w16sdtdh="http://schemas.microsoft.com/office/word/2020/wordml/sdtdatahash" xmlns:w16se="http://schemas.microsoft.com/office/word/2015/wordml/symex" xmlns:wpg="http://schemas.microsoft.com/office/word/2010/wordprocessingGroup" xmlns:wpi="http://schemas.microsoft.com/office/word/2010/wordprocessingInk" xmlns:wne="http://schemas.microsoft.com/office/word/2006/wordml" xmlns:wps="http://schemas.microsoft.com/office/word/2010/wordprocessingShape" mc:Ignorable="w14 w15 w16se w16cid w16 w16cex w16sdtdh w16du wp14">
+<w:endnotes xmlns:wpc="http://schemas.microsoft.com/office/word/2010/wordprocessingCanvas" xmlns:cx="http://schemas.microsoft.com/office/drawing/2014/chartex" xmlns:cx1="http://schemas.microsoft.com/office/drawing/2015/9/8/chartex" xmlns:cx2="http://schemas.microsoft.com/office/drawing/2015/10/21/chartex" xmlns:cx3="http://schemas.microsoft.com/office/drawing/2016/5/9/chartex" xmlns:cx4="http://schemas.microsoft.com/office/drawing/2016/5/10/chartex" xmlns:cx5="http://schemas.microsoft.com/office/drawing/2016/5/11/chartex" xmlns:cx6="http://schemas.microsoft.com/office/drawing/2016/5/12/chartex" xmlns:cx7="http://schemas.microsoft.com/office/drawing/2016/5/13/chartex" xmlns:cx8="http://schemas.microsoft.com/office/drawing/2016/5/14/chartex" xmlns:mc="http://schemas.openxmlformats.org/markup-compatibility/2006" xmlns:aink="http://schemas.microsoft.com/office/drawing/2016/ink" xmlns:am3d="http://schemas.microsoft.com/office/drawing/2017/model3d" xmlns:o="urn:schemas-microsoft-com:office:office" xmlns:oel="http://schemas.microsoft.com/office/2019/extlst" xmlns:r="http://schemas.openxmlformats.org/officeDocument/2006/relationships" xmlns:m="http://schemas.openxmlformats.org/officeDocument/2006/math" xmlns:v="urn:schemas-microsoft-com:vml" xmlns:wp14="http://schemas.microsoft.com/office/word/2010/wordprocessingDrawing" xmlns:wp="http://schemas.openxmlformats.org/drawingml/2006/wordprocessingDrawing" xmlns:w10="urn:schemas-microsoft-com:office:word" xmlns:w="http://schemas.openxmlformats.org/wordprocessingml/2006/main" xmlns:w14="http://schemas.microsoft.com/office/word/2010/wordml" xmlns:w15="http://schemas.microsoft.com/office/word/2012/wordml" xmlns:w16cex="http://schemas.microsoft.com/office/word/2018/wordml/cex" xmlns:w16cid="http://schemas.microsoft.com/office/word/2016/wordml/cid" xmlns:w16="http://schemas.microsoft.com/office/word/2018/wordml" xmlns:w16du="http://schemas.microsoft.com/office/word/2023/wordml/word16du" xmlns:w16sdtdh="http://schemas.microsoft.com/office/word/2020/wordml/sdtdatahash" xmlns:w16sdtfl="http://schemas.microsoft.com/office/word/2024/wordml/sdtformatlock" xmlns:w16se="http://schemas.microsoft.com/office/word/2015/wordml/symex" xmlns:wpg="http://schemas.microsoft.com/office/word/2010/wordprocessingGroup" xmlns:wpi="http://schemas.microsoft.com/office/word/2010/wordprocessingInk" xmlns:wne="http://schemas.microsoft.com/office/word/2006/wordml" xmlns:wps="http://schemas.microsoft.com/office/word/2010/wordprocessingShape" mc:Ignorable="w14 w15 w16se w16cid w16 w16cex w16sdtdh w16sdtfl w16du wp14">
   <w:endnote w:type="separator" w:id="-1">
     <w:p>
       <w:pPr>
@@ -3047,7 +4219,7 @@
 </file>
 
 <file path=word/footnotes.xml><?xml version="1.0" encoding="utf-8"?>
-<w:footnotes xmlns:wpc="http://schemas.microsoft.com/office/word/2010/wordprocessingCanvas" xmlns:cx="http://schemas.microsoft.com/office/drawing/2014/chartex" xmlns:cx1="http://schemas.microsoft.com/office/drawing/2015/9/8/chartex" xmlns:cx2="http://schemas.microsoft.com/office/drawing/2015/10/21/chartex" xmlns:cx3="http://schemas.microsoft.com/office/drawing/2016/5/9/chartex" xmlns:cx4="http://schemas.microsoft.com/office/drawing/2016/5/10/chartex" xmlns:cx5="http://schemas.microsoft.com/office/drawing/2016/5/11/chartex" xmlns:cx6="http://schemas.microsoft.com/office/drawing/2016/5/12/chartex" xmlns:cx7="http://schemas.microsoft.com/office/drawing/2016/5/13/chartex" xmlns:cx8="http://schemas.microsoft.com/office/drawing/2016/5/14/chartex" xmlns:mc="http://schemas.openxmlformats.org/markup-compatibility/2006" xmlns:aink="http://schemas.microsoft.com/office/drawing/2016/ink" xmlns:am3d="http://schemas.microsoft.com/office/drawing/2017/model3d" xmlns:o="urn:schemas-microsoft-com:office:office" xmlns:oel="http://schemas.microsoft.com/office/2019/extlst" xmlns:r="http://schemas.openxmlformats.org/officeDocument/2006/relationships" xmlns:m="http://schemas.openxmlformats.org/officeDocument/2006/math" xmlns:v="urn:schemas-microsoft-com:vml" xmlns:wp14="http://schemas.microsoft.com/office/word/2010/wordprocessingDrawing" xmlns:wp="http://schemas.openxmlformats.org/drawingml/2006/wordprocessingDrawing" xmlns:w10="urn:schemas-microsoft-com:office:word" xmlns:w="http://schemas.openxmlformats.org/wordprocessingml/2006/main" xmlns:w14="http://schemas.microsoft.com/office/word/2010/wordml" xmlns:w15="http://schemas.microsoft.com/office/word/2012/wordml" xmlns:w16cex="http://schemas.microsoft.com/office/word/2018/wordml/cex" xmlns:w16cid="http://schemas.microsoft.com/office/word/2016/wordml/cid" xmlns:w16="http://schemas.microsoft.com/office/word/2018/wordml" xmlns:w16du="http://schemas.microsoft.com/office/word/2023/wordml/word16du" xmlns:w16sdtdh="http://schemas.microsoft.com/office/word/2020/wordml/sdtdatahash" xmlns:w16se="http://schemas.microsoft.com/office/word/2015/wordml/symex" xmlns:wpg="http://schemas.microsoft.com/office/word/2010/wordprocessingGroup" xmlns:wpi="http://schemas.microsoft.com/office/word/2010/wordprocessingInk" xmlns:wne="http://schemas.microsoft.com/office/word/2006/wordml" xmlns:wps="http://schemas.microsoft.com/office/word/2010/wordprocessingShape" mc:Ignorable="w14 w15 w16se w16cid w16 w16cex w16sdtdh w16du wp14">
+<w:footnotes xmlns:wpc="http://schemas.microsoft.com/office/word/2010/wordprocessingCanvas" xmlns:cx="http://schemas.microsoft.com/office/drawing/2014/chartex" xmlns:cx1="http://schemas.microsoft.com/office/drawing/2015/9/8/chartex" xmlns:cx2="http://schemas.microsoft.com/office/drawing/2015/10/21/chartex" xmlns:cx3="http://schemas.microsoft.com/office/drawing/2016/5/9/chartex" xmlns:cx4="http://schemas.microsoft.com/office/drawing/2016/5/10/chartex" xmlns:cx5="http://schemas.microsoft.com/office/drawing/2016/5/11/chartex" xmlns:cx6="http://schemas.microsoft.com/office/drawing/2016/5/12/chartex" xmlns:cx7="http://schemas.microsoft.com/office/drawing/2016/5/13/chartex" xmlns:cx8="http://schemas.microsoft.com/office/drawing/2016/5/14/chartex" xmlns:mc="http://schemas.openxmlformats.org/markup-compatibility/2006" xmlns:aink="http://schemas.microsoft.com/office/drawing/2016/ink" xmlns:am3d="http://schemas.microsoft.com/office/drawing/2017/model3d" xmlns:o="urn:schemas-microsoft-com:office:office" xmlns:oel="http://schemas.microsoft.com/office/2019/extlst" xmlns:r="http://schemas.openxmlformats.org/officeDocument/2006/relationships" xmlns:m="http://schemas.openxmlformats.org/officeDocument/2006/math" xmlns:v="urn:schemas-microsoft-com:vml" xmlns:wp14="http://schemas.microsoft.com/office/word/2010/wordprocessingDrawing" xmlns:wp="http://schemas.openxmlformats.org/drawingml/2006/wordprocessingDrawing" xmlns:w10="urn:schemas-microsoft-com:office:word" xmlns:w="http://schemas.openxmlformats.org/wordprocessingml/2006/main" xmlns:w14="http://schemas.microsoft.com/office/word/2010/wordml" xmlns:w15="http://schemas.microsoft.com/office/word/2012/wordml" xmlns:w16cex="http://schemas.microsoft.com/office/word/2018/wordml/cex" xmlns:w16cid="http://schemas.microsoft.com/office/word/2016/wordml/cid" xmlns:w16="http://schemas.microsoft.com/office/word/2018/wordml" xmlns:w16du="http://schemas.microsoft.com/office/word/2023/wordml/word16du" xmlns:w16sdtdh="http://schemas.microsoft.com/office/word/2020/wordml/sdtdatahash" xmlns:w16sdtfl="http://schemas.microsoft.com/office/word/2024/wordml/sdtformatlock" xmlns:w16se="http://schemas.microsoft.com/office/word/2015/wordml/symex" xmlns:wpg="http://schemas.microsoft.com/office/word/2010/wordprocessingGroup" xmlns:wpi="http://schemas.microsoft.com/office/word/2010/wordprocessingInk" xmlns:wne="http://schemas.microsoft.com/office/word/2006/wordml" xmlns:wps="http://schemas.microsoft.com/office/word/2010/wordprocessingShape" mc:Ignorable="w14 w15 w16se w16cid w16 w16cex w16sdtdh w16sdtfl w16du wp14">
   <w:footnote w:type="separator" w:id="-1">
     <w:p>
       <w:pPr>
@@ -3072,7 +4244,7 @@
 </file>
 
 <file path=word/numbering.xml><?xml version="1.0" encoding="utf-8"?>
-<w:numbering xmlns:wpc="http://schemas.microsoft.com/office/word/2010/wordprocessingCanvas" xmlns:cx="http://schemas.microsoft.com/office/drawing/2014/chartex" xmlns:cx1="http://schemas.microsoft.com/office/drawing/2015/9/8/chartex" xmlns:cx2="http://schemas.microsoft.com/office/drawing/2015/10/21/chartex" xmlns:cx3="http://schemas.microsoft.com/office/drawing/2016/5/9/chartex" xmlns:cx4="http://schemas.microsoft.com/office/drawing/2016/5/10/chartex" xmlns:cx5="http://schemas.microsoft.com/office/drawing/2016/5/11/chartex" xmlns:cx6="http://schemas.microsoft.com/office/drawing/2016/5/12/chartex" xmlns:cx7="http://schemas.microsoft.com/office/drawing/2016/5/13/chartex" xmlns:cx8="http://schemas.microsoft.com/office/drawing/2016/5/14/chartex" xmlns:mc="http://schemas.openxmlformats.org/markup-compatibility/2006" xmlns:aink="http://schemas.microsoft.com/office/drawing/2016/ink" xmlns:am3d="http://schemas.microsoft.com/office/drawing/2017/model3d" xmlns:o="urn:schemas-microsoft-com:office:office" xmlns:oel="http://schemas.microsoft.com/office/2019/extlst" xmlns:r="http://schemas.openxmlformats.org/officeDocument/2006/relationships" xmlns:m="http://schemas.openxmlformats.org/officeDocument/2006/math" xmlns:v="urn:schemas-microsoft-com:vml" xmlns:wp14="http://schemas.microsoft.com/office/word/2010/wordprocessingDrawing" xmlns:wp="http://schemas.openxmlformats.org/drawingml/2006/wordprocessingDrawing" xmlns:w10="urn:schemas-microsoft-com:office:word" xmlns:w="http://schemas.openxmlformats.org/wordprocessingml/2006/main" xmlns:w14="http://schemas.microsoft.com/office/word/2010/wordml" xmlns:w15="http://schemas.microsoft.com/office/word/2012/wordml" xmlns:w16cex="http://schemas.microsoft.com/office/word/2018/wordml/cex" xmlns:w16cid="http://schemas.microsoft.com/office/word/2016/wordml/cid" xmlns:w16="http://schemas.microsoft.com/office/word/2018/wordml" xmlns:w16du="http://schemas.microsoft.com/office/word/2023/wordml/word16du" xmlns:w16sdtdh="http://schemas.microsoft.com/office/word/2020/wordml/sdtdatahash" xmlns:w16se="http://schemas.microsoft.com/office/word/2015/wordml/symex" xmlns:wpg="http://schemas.microsoft.com/office/word/2010/wordprocessingGroup" xmlns:wpi="http://schemas.microsoft.com/office/word/2010/wordprocessingInk" xmlns:wne="http://schemas.microsoft.com/office/word/2006/wordml" xmlns:wps="http://schemas.microsoft.com/office/word/2010/wordprocessingShape" mc:Ignorable="w14 w15 w16se w16cid w16 w16cex w16sdtdh w16du wp14">
+<w:numbering xmlns:wpc="http://schemas.microsoft.com/office/word/2010/wordprocessingCanvas" xmlns:cx="http://schemas.microsoft.com/office/drawing/2014/chartex" xmlns:cx1="http://schemas.microsoft.com/office/drawing/2015/9/8/chartex" xmlns:cx2="http://schemas.microsoft.com/office/drawing/2015/10/21/chartex" xmlns:cx3="http://schemas.microsoft.com/office/drawing/2016/5/9/chartex" xmlns:cx4="http://schemas.microsoft.com/office/drawing/2016/5/10/chartex" xmlns:cx5="http://schemas.microsoft.com/office/drawing/2016/5/11/chartex" xmlns:cx6="http://schemas.microsoft.com/office/drawing/2016/5/12/chartex" xmlns:cx7="http://schemas.microsoft.com/office/drawing/2016/5/13/chartex" xmlns:cx8="http://schemas.microsoft.com/office/drawing/2016/5/14/chartex" xmlns:mc="http://schemas.openxmlformats.org/markup-compatibility/2006" xmlns:aink="http://schemas.microsoft.com/office/drawing/2016/ink" xmlns:am3d="http://schemas.microsoft.com/office/drawing/2017/model3d" xmlns:o="urn:schemas-microsoft-com:office:office" xmlns:oel="http://schemas.microsoft.com/office/2019/extlst" xmlns:r="http://schemas.openxmlformats.org/officeDocument/2006/relationships" xmlns:m="http://schemas.openxmlformats.org/officeDocument/2006/math" xmlns:v="urn:schemas-microsoft-com:vml" xmlns:wp14="http://schemas.microsoft.com/office/word/2010/wordprocessingDrawing" xmlns:wp="http://schemas.openxmlformats.org/drawingml/2006/wordprocessingDrawing" xmlns:w10="urn:schemas-microsoft-com:office:word" xmlns:w="http://schemas.openxmlformats.org/wordprocessingml/2006/main" xmlns:w14="http://schemas.microsoft.com/office/word/2010/wordml" xmlns:w15="http://schemas.microsoft.com/office/word/2012/wordml" xmlns:w16cex="http://schemas.microsoft.com/office/word/2018/wordml/cex" xmlns:w16cid="http://schemas.microsoft.com/office/word/2016/wordml/cid" xmlns:w16="http://schemas.microsoft.com/office/word/2018/wordml" xmlns:w16du="http://schemas.microsoft.com/office/word/2023/wordml/word16du" xmlns:w16sdtdh="http://schemas.microsoft.com/office/word/2020/wordml/sdtdatahash" xmlns:w16sdtfl="http://schemas.microsoft.com/office/word/2024/wordml/sdtformatlock" xmlns:w16se="http://schemas.microsoft.com/office/word/2015/wordml/symex" xmlns:wpg="http://schemas.microsoft.com/office/word/2010/wordprocessingGroup" xmlns:wpi="http://schemas.microsoft.com/office/word/2010/wordprocessingInk" xmlns:wne="http://schemas.microsoft.com/office/word/2006/wordml" xmlns:wps="http://schemas.microsoft.com/office/word/2010/wordprocessingShape" mc:Ignorable="w14 w15 w16se w16cid w16 w16cex w16sdtdh w16sdtfl w16du wp14">
   <w:abstractNum w:abstractNumId="0" w15:restartNumberingAfterBreak="0">
     <w:nsid w:val="088B7F75"/>
     <w:multiLevelType w:val="multilevel"/>
@@ -3289,6 +4461,205 @@
     </w:lvl>
   </w:abstractNum>
   <w:abstractNum w:abstractNumId="4" w15:restartNumberingAfterBreak="0">
+    <w:nsid w:val="42F034B6"/>
+    <w:multiLevelType w:val="hybridMultilevel"/>
+    <w:tmpl w:val="DC8CAAF4"/>
+    <w:lvl w:ilvl="0" w:tplc="281A0001">
+      <w:start w:val="1"/>
+      <w:numFmt w:val="bullet"/>
+      <w:lvlText w:val=""/>
+      <w:lvlJc w:val="left"/>
+      <w:pPr>
+        <w:ind w:left="720" w:hanging="360"/>
+      </w:pPr>
+      <w:rPr>
+        <w:rFonts w:ascii="Symbol" w:hAnsi="Symbol" w:hint="default"/>
+      </w:rPr>
+    </w:lvl>
+    <w:lvl w:ilvl="1" w:tplc="281A0003" w:tentative="1">
+      <w:start w:val="1"/>
+      <w:numFmt w:val="bullet"/>
+      <w:lvlText w:val="o"/>
+      <w:lvlJc w:val="left"/>
+      <w:pPr>
+        <w:ind w:left="1440" w:hanging="360"/>
+      </w:pPr>
+      <w:rPr>
+        <w:rFonts w:ascii="Courier New" w:hAnsi="Courier New" w:cs="Courier New" w:hint="default"/>
+      </w:rPr>
+    </w:lvl>
+    <w:lvl w:ilvl="2" w:tplc="281A0005" w:tentative="1">
+      <w:start w:val="1"/>
+      <w:numFmt w:val="bullet"/>
+      <w:lvlText w:val=""/>
+      <w:lvlJc w:val="left"/>
+      <w:pPr>
+        <w:ind w:left="2160" w:hanging="360"/>
+      </w:pPr>
+      <w:rPr>
+        <w:rFonts w:ascii="Wingdings" w:hAnsi="Wingdings" w:hint="default"/>
+      </w:rPr>
+    </w:lvl>
+    <w:lvl w:ilvl="3" w:tplc="281A0001" w:tentative="1">
+      <w:start w:val="1"/>
+      <w:numFmt w:val="bullet"/>
+      <w:lvlText w:val=""/>
+      <w:lvlJc w:val="left"/>
+      <w:pPr>
+        <w:ind w:left="2880" w:hanging="360"/>
+      </w:pPr>
+      <w:rPr>
+        <w:rFonts w:ascii="Symbol" w:hAnsi="Symbol" w:hint="default"/>
+      </w:rPr>
+    </w:lvl>
+    <w:lvl w:ilvl="4" w:tplc="281A0003" w:tentative="1">
+      <w:start w:val="1"/>
+      <w:numFmt w:val="bullet"/>
+      <w:lvlText w:val="o"/>
+      <w:lvlJc w:val="left"/>
+      <w:pPr>
+        <w:ind w:left="3600" w:hanging="360"/>
+      </w:pPr>
+      <w:rPr>
+        <w:rFonts w:ascii="Courier New" w:hAnsi="Courier New" w:cs="Courier New" w:hint="default"/>
+      </w:rPr>
+    </w:lvl>
+    <w:lvl w:ilvl="5" w:tplc="281A0005" w:tentative="1">
+      <w:start w:val="1"/>
+      <w:numFmt w:val="bullet"/>
+      <w:lvlText w:val=""/>
+      <w:lvlJc w:val="left"/>
+      <w:pPr>
+        <w:ind w:left="4320" w:hanging="360"/>
+      </w:pPr>
+      <w:rPr>
+        <w:rFonts w:ascii="Wingdings" w:hAnsi="Wingdings" w:hint="default"/>
+      </w:rPr>
+    </w:lvl>
+    <w:lvl w:ilvl="6" w:tplc="281A0001" w:tentative="1">
+      <w:start w:val="1"/>
+      <w:numFmt w:val="bullet"/>
+      <w:lvlText w:val=""/>
+      <w:lvlJc w:val="left"/>
+      <w:pPr>
+        <w:ind w:left="5040" w:hanging="360"/>
+      </w:pPr>
+      <w:rPr>
+        <w:rFonts w:ascii="Symbol" w:hAnsi="Symbol" w:hint="default"/>
+      </w:rPr>
+    </w:lvl>
+    <w:lvl w:ilvl="7" w:tplc="281A0003" w:tentative="1">
+      <w:start w:val="1"/>
+      <w:numFmt w:val="bullet"/>
+      <w:lvlText w:val="o"/>
+      <w:lvlJc w:val="left"/>
+      <w:pPr>
+        <w:ind w:left="5760" w:hanging="360"/>
+      </w:pPr>
+      <w:rPr>
+        <w:rFonts w:ascii="Courier New" w:hAnsi="Courier New" w:cs="Courier New" w:hint="default"/>
+      </w:rPr>
+    </w:lvl>
+    <w:lvl w:ilvl="8" w:tplc="281A0005" w:tentative="1">
+      <w:start w:val="1"/>
+      <w:numFmt w:val="bullet"/>
+      <w:lvlText w:val=""/>
+      <w:lvlJc w:val="left"/>
+      <w:pPr>
+        <w:ind w:left="6480" w:hanging="360"/>
+      </w:pPr>
+      <w:rPr>
+        <w:rFonts w:ascii="Wingdings" w:hAnsi="Wingdings" w:hint="default"/>
+      </w:rPr>
+    </w:lvl>
+  </w:abstractNum>
+  <w:abstractNum w:abstractNumId="5" w15:restartNumberingAfterBreak="0">
+    <w:nsid w:val="501B59E9"/>
+    <w:multiLevelType w:val="hybridMultilevel"/>
+    <w:tmpl w:val="EB9C4EEE"/>
+    <w:lvl w:ilvl="0" w:tplc="281A000F">
+      <w:start w:val="1"/>
+      <w:numFmt w:val="decimal"/>
+      <w:lvlText w:val="%1."/>
+      <w:lvlJc w:val="left"/>
+      <w:pPr>
+        <w:ind w:left="720" w:hanging="360"/>
+      </w:pPr>
+    </w:lvl>
+    <w:lvl w:ilvl="1" w:tplc="281A0019" w:tentative="1">
+      <w:start w:val="1"/>
+      <w:numFmt w:val="lowerLetter"/>
+      <w:lvlText w:val="%2."/>
+      <w:lvlJc w:val="left"/>
+      <w:pPr>
+        <w:ind w:left="1440" w:hanging="360"/>
+      </w:pPr>
+    </w:lvl>
+    <w:lvl w:ilvl="2" w:tplc="281A001B" w:tentative="1">
+      <w:start w:val="1"/>
+      <w:numFmt w:val="lowerRoman"/>
+      <w:lvlText w:val="%3."/>
+      <w:lvlJc w:val="right"/>
+      <w:pPr>
+        <w:ind w:left="2160" w:hanging="180"/>
+      </w:pPr>
+    </w:lvl>
+    <w:lvl w:ilvl="3" w:tplc="281A000F" w:tentative="1">
+      <w:start w:val="1"/>
+      <w:numFmt w:val="decimal"/>
+      <w:lvlText w:val="%4."/>
+      <w:lvlJc w:val="left"/>
+      <w:pPr>
+        <w:ind w:left="2880" w:hanging="360"/>
+      </w:pPr>
+    </w:lvl>
+    <w:lvl w:ilvl="4" w:tplc="281A0019" w:tentative="1">
+      <w:start w:val="1"/>
+      <w:numFmt w:val="lowerLetter"/>
+      <w:lvlText w:val="%5."/>
+      <w:lvlJc w:val="left"/>
+      <w:pPr>
+        <w:ind w:left="3600" w:hanging="360"/>
+      </w:pPr>
+    </w:lvl>
+    <w:lvl w:ilvl="5" w:tplc="281A001B" w:tentative="1">
+      <w:start w:val="1"/>
+      <w:numFmt w:val="lowerRoman"/>
+      <w:lvlText w:val="%6."/>
+      <w:lvlJc w:val="right"/>
+      <w:pPr>
+        <w:ind w:left="4320" w:hanging="180"/>
+      </w:pPr>
+    </w:lvl>
+    <w:lvl w:ilvl="6" w:tplc="281A000F" w:tentative="1">
+      <w:start w:val="1"/>
+      <w:numFmt w:val="decimal"/>
+      <w:lvlText w:val="%7."/>
+      <w:lvlJc w:val="left"/>
+      <w:pPr>
+        <w:ind w:left="5040" w:hanging="360"/>
+      </w:pPr>
+    </w:lvl>
+    <w:lvl w:ilvl="7" w:tplc="281A0019" w:tentative="1">
+      <w:start w:val="1"/>
+      <w:numFmt w:val="lowerLetter"/>
+      <w:lvlText w:val="%8."/>
+      <w:lvlJc w:val="left"/>
+      <w:pPr>
+        <w:ind w:left="5760" w:hanging="360"/>
+      </w:pPr>
+    </w:lvl>
+    <w:lvl w:ilvl="8" w:tplc="281A001B" w:tentative="1">
+      <w:start w:val="1"/>
+      <w:numFmt w:val="lowerRoman"/>
+      <w:lvlText w:val="%9."/>
+      <w:lvlJc w:val="right"/>
+      <w:pPr>
+        <w:ind w:left="6480" w:hanging="180"/>
+      </w:pPr>
+    </w:lvl>
+  </w:abstractNum>
+  <w:abstractNum w:abstractNumId="6" w15:restartNumberingAfterBreak="0">
     <w:nsid w:val="51CF427E"/>
     <w:multiLevelType w:val="multilevel"/>
     <w:tmpl w:val="1DDA8952"/>
@@ -3404,7 +4775,7 @@
       </w:rPr>
     </w:lvl>
   </w:abstractNum>
-  <w:abstractNum w:abstractNumId="5" w15:restartNumberingAfterBreak="0">
+  <w:abstractNum w:abstractNumId="7" w15:restartNumberingAfterBreak="0">
     <w:nsid w:val="5F5E719F"/>
     <w:multiLevelType w:val="multilevel"/>
     <w:tmpl w:val="DBC0D05A"/>
@@ -3490,7 +4861,7 @@
       </w:pPr>
     </w:lvl>
   </w:abstractNum>
-  <w:abstractNum w:abstractNumId="6" w15:restartNumberingAfterBreak="0">
+  <w:abstractNum w:abstractNumId="8" w15:restartNumberingAfterBreak="0">
     <w:nsid w:val="7BEC72D4"/>
     <w:multiLevelType w:val="hybridMultilevel"/>
     <w:tmpl w:val="DBC0D05A"/>
@@ -3567,6 +4938,92 @@
       </w:pPr>
     </w:lvl>
     <w:lvl w:ilvl="8" w:tplc="0409001B" w:tentative="1">
+      <w:start w:val="1"/>
+      <w:numFmt w:val="lowerRoman"/>
+      <w:lvlText w:val="%9."/>
+      <w:lvlJc w:val="right"/>
+      <w:pPr>
+        <w:ind w:left="6480" w:hanging="180"/>
+      </w:pPr>
+    </w:lvl>
+  </w:abstractNum>
+  <w:abstractNum w:abstractNumId="9" w15:restartNumberingAfterBreak="0">
+    <w:nsid w:val="7ED161A0"/>
+    <w:multiLevelType w:val="hybridMultilevel"/>
+    <w:tmpl w:val="1FD23476"/>
+    <w:lvl w:ilvl="0" w:tplc="281A000F">
+      <w:start w:val="1"/>
+      <w:numFmt w:val="decimal"/>
+      <w:lvlText w:val="%1."/>
+      <w:lvlJc w:val="left"/>
+      <w:pPr>
+        <w:ind w:left="720" w:hanging="360"/>
+      </w:pPr>
+    </w:lvl>
+    <w:lvl w:ilvl="1" w:tplc="281A0019" w:tentative="1">
+      <w:start w:val="1"/>
+      <w:numFmt w:val="lowerLetter"/>
+      <w:lvlText w:val="%2."/>
+      <w:lvlJc w:val="left"/>
+      <w:pPr>
+        <w:ind w:left="1440" w:hanging="360"/>
+      </w:pPr>
+    </w:lvl>
+    <w:lvl w:ilvl="2" w:tplc="281A001B" w:tentative="1">
+      <w:start w:val="1"/>
+      <w:numFmt w:val="lowerRoman"/>
+      <w:lvlText w:val="%3."/>
+      <w:lvlJc w:val="right"/>
+      <w:pPr>
+        <w:ind w:left="2160" w:hanging="180"/>
+      </w:pPr>
+    </w:lvl>
+    <w:lvl w:ilvl="3" w:tplc="281A000F" w:tentative="1">
+      <w:start w:val="1"/>
+      <w:numFmt w:val="decimal"/>
+      <w:lvlText w:val="%4."/>
+      <w:lvlJc w:val="left"/>
+      <w:pPr>
+        <w:ind w:left="2880" w:hanging="360"/>
+      </w:pPr>
+    </w:lvl>
+    <w:lvl w:ilvl="4" w:tplc="281A0019" w:tentative="1">
+      <w:start w:val="1"/>
+      <w:numFmt w:val="lowerLetter"/>
+      <w:lvlText w:val="%5."/>
+      <w:lvlJc w:val="left"/>
+      <w:pPr>
+        <w:ind w:left="3600" w:hanging="360"/>
+      </w:pPr>
+    </w:lvl>
+    <w:lvl w:ilvl="5" w:tplc="281A001B" w:tentative="1">
+      <w:start w:val="1"/>
+      <w:numFmt w:val="lowerRoman"/>
+      <w:lvlText w:val="%6."/>
+      <w:lvlJc w:val="right"/>
+      <w:pPr>
+        <w:ind w:left="4320" w:hanging="180"/>
+      </w:pPr>
+    </w:lvl>
+    <w:lvl w:ilvl="6" w:tplc="281A000F" w:tentative="1">
+      <w:start w:val="1"/>
+      <w:numFmt w:val="decimal"/>
+      <w:lvlText w:val="%7."/>
+      <w:lvlJc w:val="left"/>
+      <w:pPr>
+        <w:ind w:left="5040" w:hanging="360"/>
+      </w:pPr>
+    </w:lvl>
+    <w:lvl w:ilvl="7" w:tplc="281A0019" w:tentative="1">
+      <w:start w:val="1"/>
+      <w:numFmt w:val="lowerLetter"/>
+      <w:lvlText w:val="%8."/>
+      <w:lvlJc w:val="left"/>
+      <w:pPr>
+        <w:ind w:left="5760" w:hanging="360"/>
+      </w:pPr>
+    </w:lvl>
+    <w:lvl w:ilvl="8" w:tplc="281A001B" w:tentative="1">
       <w:start w:val="1"/>
       <w:numFmt w:val="lowerRoman"/>
       <w:lvlText w:val="%9."/>
@@ -3580,13 +5037,13 @@
     <w:abstractNumId w:val="2"/>
   </w:num>
   <w:num w:numId="2" w16cid:durableId="405499514">
-    <w:abstractNumId w:val="6"/>
+    <w:abstractNumId w:val="8"/>
   </w:num>
   <w:num w:numId="3" w16cid:durableId="769551155">
-    <w:abstractNumId w:val="5"/>
+    <w:abstractNumId w:val="7"/>
   </w:num>
   <w:num w:numId="4" w16cid:durableId="801925351">
-    <w:abstractNumId w:val="4"/>
+    <w:abstractNumId w:val="6"/>
   </w:num>
   <w:num w:numId="5" w16cid:durableId="1038775068">
     <w:abstractNumId w:val="0"/>
@@ -3597,19 +5054,20 @@
   <w:num w:numId="7" w16cid:durableId="1602764928">
     <w:abstractNumId w:val="3"/>
   </w:num>
+  <w:num w:numId="8" w16cid:durableId="2025013703">
+    <w:abstractNumId w:val="4"/>
+  </w:num>
+  <w:num w:numId="9" w16cid:durableId="1962150130">
+    <w:abstractNumId w:val="5"/>
+  </w:num>
+  <w:num w:numId="10" w16cid:durableId="1299721635">
+    <w:abstractNumId w:val="9"/>
+  </w:num>
 </w:numbering>
 </file>
 
-<file path=word/people.xml><?xml version="1.0" encoding="utf-8"?>
-<w15:people xmlns:wpc="http://schemas.microsoft.com/office/word/2010/wordprocessingCanvas" xmlns:cx="http://schemas.microsoft.com/office/drawing/2014/chartex" xmlns:cx1="http://schemas.microsoft.com/office/drawing/2015/9/8/chartex" xmlns:cx2="http://schemas.microsoft.com/office/drawing/2015/10/21/chartex" xmlns:cx3="http://schemas.microsoft.com/office/drawing/2016/5/9/chartex" xmlns:cx4="http://schemas.microsoft.com/office/drawing/2016/5/10/chartex" xmlns:cx5="http://schemas.microsoft.com/office/drawing/2016/5/11/chartex" xmlns:cx6="http://schemas.microsoft.com/office/drawing/2016/5/12/chartex" xmlns:cx7="http://schemas.microsoft.com/office/drawing/2016/5/13/chartex" xmlns:cx8="http://schemas.microsoft.com/office/drawing/2016/5/14/chartex" xmlns:mc="http://schemas.openxmlformats.org/markup-compatibility/2006" xmlns:aink="http://schemas.microsoft.com/office/drawing/2016/ink" xmlns:am3d="http://schemas.microsoft.com/office/drawing/2017/model3d" xmlns:o="urn:schemas-microsoft-com:office:office" xmlns:oel="http://schemas.microsoft.com/office/2019/extlst" xmlns:r="http://schemas.openxmlformats.org/officeDocument/2006/relationships" xmlns:m="http://schemas.openxmlformats.org/officeDocument/2006/math" xmlns:v="urn:schemas-microsoft-com:vml" xmlns:wp14="http://schemas.microsoft.com/office/word/2010/wordprocessingDrawing" xmlns:wp="http://schemas.openxmlformats.org/drawingml/2006/wordprocessingDrawing" xmlns:w10="urn:schemas-microsoft-com:office:word" xmlns:w="http://schemas.openxmlformats.org/wordprocessingml/2006/main" xmlns:w14="http://schemas.microsoft.com/office/word/2010/wordml" xmlns:w15="http://schemas.microsoft.com/office/word/2012/wordml" xmlns:w16cex="http://schemas.microsoft.com/office/word/2018/wordml/cex" xmlns:w16cid="http://schemas.microsoft.com/office/word/2016/wordml/cid" xmlns:w16="http://schemas.microsoft.com/office/word/2018/wordml" xmlns:w16du="http://schemas.microsoft.com/office/word/2023/wordml/word16du" xmlns:w16sdtdh="http://schemas.microsoft.com/office/word/2020/wordml/sdtdatahash" xmlns:w16se="http://schemas.microsoft.com/office/word/2015/wordml/symex" xmlns:wpg="http://schemas.microsoft.com/office/word/2010/wordprocessingGroup" xmlns:wpi="http://schemas.microsoft.com/office/word/2010/wordprocessingInk" xmlns:wne="http://schemas.microsoft.com/office/word/2006/wordml" xmlns:wps="http://schemas.microsoft.com/office/word/2010/wordprocessingShape" mc:Ignorable="w14 w15 w16se w16cid w16 w16cex w16sdtdh w16du wp14">
-  <w15:person w15:author="Marko Vekic">
-    <w15:presenceInfo w15:providerId="None" w15:userId="Marko Vekic"/>
-  </w15:person>
-</w15:people>
-</file>
-
 <file path=word/styles.xml><?xml version="1.0" encoding="utf-8"?>
-<w:styles xmlns:mc="http://schemas.openxmlformats.org/markup-compatibility/2006" xmlns:r="http://schemas.openxmlformats.org/officeDocument/2006/relationships" xmlns:w="http://schemas.openxmlformats.org/wordprocessingml/2006/main" xmlns:w14="http://schemas.microsoft.com/office/word/2010/wordml" xmlns:w15="http://schemas.microsoft.com/office/word/2012/wordml" xmlns:w16cex="http://schemas.microsoft.com/office/word/2018/wordml/cex" xmlns:w16cid="http://schemas.microsoft.com/office/word/2016/wordml/cid" xmlns:w16="http://schemas.microsoft.com/office/word/2018/wordml" xmlns:w16du="http://schemas.microsoft.com/office/word/2023/wordml/word16du" xmlns:w16sdtdh="http://schemas.microsoft.com/office/word/2020/wordml/sdtdatahash" xmlns:w16se="http://schemas.microsoft.com/office/word/2015/wordml/symex" mc:Ignorable="w14 w15 w16se w16cid w16 w16cex w16sdtdh w16du">
+<w:styles xmlns:mc="http://schemas.openxmlformats.org/markup-compatibility/2006" xmlns:r="http://schemas.openxmlformats.org/officeDocument/2006/relationships" xmlns:w="http://schemas.openxmlformats.org/wordprocessingml/2006/main" xmlns:w14="http://schemas.microsoft.com/office/word/2010/wordml" xmlns:w15="http://schemas.microsoft.com/office/word/2012/wordml" xmlns:w16cex="http://schemas.microsoft.com/office/word/2018/wordml/cex" xmlns:w16cid="http://schemas.microsoft.com/office/word/2016/wordml/cid" xmlns:w16="http://schemas.microsoft.com/office/word/2018/wordml" xmlns:w16du="http://schemas.microsoft.com/office/word/2023/wordml/word16du" xmlns:w16sdtdh="http://schemas.microsoft.com/office/word/2020/wordml/sdtdatahash" xmlns:w16sdtfl="http://schemas.microsoft.com/office/word/2024/wordml/sdtformatlock" xmlns:w16se="http://schemas.microsoft.com/office/word/2015/wordml/symex" mc:Ignorable="w14 w15 w16se w16cid w16 w16cex w16sdtdh w16sdtfl w16du">
   <w:docDefaults>
     <w:rPrDefault>
       <w:rPr>
@@ -4002,7 +5460,7 @@
   <w:style w:type="paragraph" w:default="1" w:styleId="Normal">
     <w:name w:val="Normal"/>
     <w:aliases w:val="Tekst"/>
-    <w:rsid w:val="00297302"/>
+    <w:rsid w:val="001830CB"/>
     <w:pPr>
       <w:spacing w:before="120"/>
       <w:ind w:firstLine="360"/>
@@ -5270,6 +6728,16 @@
     <w:rsid w:val="004D52F7"/>
     <w:rPr>
       <w:sz w:val="20"/>
+    </w:rPr>
+  </w:style>
+  <w:style w:type="character" w:styleId="PlaceholderText">
+    <w:name w:val="Placeholder Text"/>
+    <w:basedOn w:val="DefaultParagraphFont"/>
+    <w:uiPriority w:val="99"/>
+    <w:semiHidden/>
+    <w:rsid w:val="00B95867"/>
+    <w:rPr>
+      <w:color w:val="666666"/>
     </w:rPr>
   </w:style>
 </w:styles>

</xml_diff>